<commit_message>
docs: add diagrams, demo placeholders, and comparative analysis (TCC etapa atual)
- Section 4.6 (new): "Componentes Principais e Responsabilidades" with
  Figures 8–13 embedded (DSL, Blender, OpenFOAM, Persistence, FastAPI,
  Dashboard); natural figure references integrated into prose
- Ch. 6 (Demonstração) fully rewritten: 3 flows (web W1–W15, terminal
  T1–T10, reprodutibilidade R1–R4) with styled placeholder blocks for
  screenshot capture; sections 6.3 pipeline summary and 6.4 seed/hash
- Section 7.10 (new): critical comparison between first evaluation (commit
  62cb4fc, 6 test files, Blender-only) and current version (27 test files,
  dual-motor, CLI wizard, thin-slice, 4 new dashboard pages)
- gerar_word_tcc.py: image insertion (render_image), bordered gray
  placeholder boxes (placeholder_para), [FIGURA:] and [Wn]/[Tn]/[Rn]
  parser/renderer support; DOCX grows to 368 KB with 6 PNGs embedded

https://claude.ai/code/session_01SEH2kENXG5HX2gGuB7hsSN
</commit_message>
<xml_diff>
--- a/docs/TCC_BEDFLOW_ATLAS_COMPLETO.docx
+++ b/docs/TCC_BEDFLOW_ATLAS_COMPLETO.docx
@@ -6341,7 +6341,7 @@
           <w:color w:val="00467F"/>
           <w:sz w:val="24"/>
         </w:rPr>
-        <w:t>4.6 Requisitos Funcionais e Não Funcionais</w:t>
+        <w:t>4.6 Componentes Principais e Responsabilidades</w:t>
       </w:r>
     </w:p>
     <w:p>
@@ -6357,6 +6357,498 @@
           <w:i w:val="0"/>
           <w:sz w:val="24"/>
         </w:rPr>
+        <w:t>Cada etapa do pipeline é encapsulada em um componente isolado e conteinerizado, com contratos claros de entrada e saída. A identidade única de cada execução é assegurada por um hash determinístico, gerado a partir do params.json canônico. As subseções a seguir descrevem cada componente principal e apresentam o diagrama correspondente ao seu fluxo de dados.</w:t>
+      </w:r>
+    </w:p>
+    <w:p>
+      <w:pPr>
+        <w:spacing w:before="0" w:after="120"/>
+        <w:ind w:firstLine="709"/>
+        <w:jc w:val="both"/>
+      </w:pPr>
+      <w:r>
+        <w:rPr>
+          <w:rFonts w:ascii="Calibri" w:hAnsi="Calibri"/>
+          <w:b w:val="0"/>
+          <w:i w:val="0"/>
+          <w:sz w:val="24"/>
+        </w:rPr>
+        <w:t>Compilador DSL: Recebe o arquivo .bed, valida sintaxe e semântica, normaliza para unidades do Sistema Internacional, emite o params.json canônico e calcula o hash SHA-256. O resultado alimenta as próximas etapas de forma independente da API; o fluxo completo deste módulo está representado na Figura 8.</w:t>
+      </w:r>
+    </w:p>
+    <w:p>
+      <w:pPr>
+        <w:spacing w:before="160" w:after="80"/>
+        <w:ind w:firstLine="0"/>
+        <w:jc w:val="center"/>
+      </w:pPr>
+      <w:r>
+        <w:drawing>
+          <wp:inline xmlns:a="http://schemas.openxmlformats.org/drawingml/2006/main" xmlns:pic="http://schemas.openxmlformats.org/drawingml/2006/picture">
+            <wp:extent cx="5040000" cy="2242779"/>
+            <wp:docPr id="1" name="Picture 1"/>
+            <wp:cNvGraphicFramePr>
+              <a:graphicFrameLocks noChangeAspect="1"/>
+            </wp:cNvGraphicFramePr>
+            <a:graphic>
+              <a:graphicData uri="http://schemas.openxmlformats.org/drawingml/2006/picture">
+                <pic:pic>
+                  <pic:nvPicPr>
+                    <pic:cNvPr id="0" name="pb_fig08_dsl_compilador.png"/>
+                    <pic:cNvPicPr/>
+                  </pic:nvPicPr>
+                  <pic:blipFill>
+                    <a:blip r:embed="rId10"/>
+                    <a:stretch>
+                      <a:fillRect/>
+                    </a:stretch>
+                  </pic:blipFill>
+                  <pic:spPr>
+                    <a:xfrm>
+                      <a:off x="0" y="0"/>
+                      <a:ext cx="5040000" cy="2242779"/>
+                    </a:xfrm>
+                    <a:prstGeom prst="rect"/>
+                  </pic:spPr>
+                </pic:pic>
+              </a:graphicData>
+            </a:graphic>
+          </wp:inline>
+        </w:drawing>
+      </w:r>
+    </w:p>
+    <w:p>
+      <w:pPr>
+        <w:spacing w:before="80" w:after="240"/>
+        <w:ind w:firstLine="0"/>
+        <w:jc w:val="center"/>
+      </w:pPr>
+      <w:r>
+        <w:rPr>
+          <w:rFonts w:ascii="Calibri" w:hAnsi="Calibri"/>
+          <w:b w:val="0"/>
+          <w:i/>
+          <w:color w:val="555555"/>
+          <w:sz w:val="20"/>
+        </w:rPr>
+        <w:t>Figura 8 — Módulo DSL (Compilador) Fonte: produção autoral (2025) Diagrama do módulo compilador: transformação do arquivo .bed em artefatos normalizados (params.json e hash), de forma independente da API, para alimentar as etapas seguintes do pipeline.</w:t>
+      </w:r>
+    </w:p>
+    <w:p>
+      <w:pPr>
+        <w:spacing w:before="0" w:after="120"/>
+        <w:ind w:firstLine="709"/>
+        <w:jc w:val="both"/>
+      </w:pPr>
+      <w:r>
+        <w:rPr>
+          <w:rFonts w:ascii="Calibri" w:hAnsi="Calibri"/>
+          <w:b w:val="0"/>
+          <w:i w:val="0"/>
+          <w:sz w:val="24"/>
+        </w:rPr>
+        <w:t>Módulo de Modelagem Geométrica no Blender: Constrói o cilindro e as tampas do leito, realiza o empacotamento das esferas com semente fixa, checa manifold e watertight e estima a porosidade efetiva. Exporta geom/leito.stl, geom/particulas.stl e porosity.json, operando em modo headless via API Python. A organização interna deste módulo é apresentada na Figura 9.</w:t>
+      </w:r>
+    </w:p>
+    <w:p>
+      <w:pPr>
+        <w:spacing w:before="160" w:after="80"/>
+        <w:ind w:firstLine="0"/>
+        <w:jc w:val="center"/>
+      </w:pPr>
+      <w:r>
+        <w:drawing>
+          <wp:inline xmlns:a="http://schemas.openxmlformats.org/drawingml/2006/main" xmlns:pic="http://schemas.openxmlformats.org/drawingml/2006/picture">
+            <wp:extent cx="5040000" cy="1950734"/>
+            <wp:docPr id="2" name="Picture 2"/>
+            <wp:cNvGraphicFramePr>
+              <a:graphicFrameLocks noChangeAspect="1"/>
+            </wp:cNvGraphicFramePr>
+            <a:graphic>
+              <a:graphicData uri="http://schemas.openxmlformats.org/drawingml/2006/picture">
+                <pic:pic>
+                  <pic:nvPicPr>
+                    <pic:cNvPr id="0" name="pb_fig09a_modelagem_blender.png"/>
+                    <pic:cNvPicPr/>
+                  </pic:nvPicPr>
+                  <pic:blipFill>
+                    <a:blip r:embed="rId11"/>
+                    <a:stretch>
+                      <a:fillRect/>
+                    </a:stretch>
+                  </pic:blipFill>
+                  <pic:spPr>
+                    <a:xfrm>
+                      <a:off x="0" y="0"/>
+                      <a:ext cx="5040000" cy="1950734"/>
+                    </a:xfrm>
+                    <a:prstGeom prst="rect"/>
+                  </pic:spPr>
+                </pic:pic>
+              </a:graphicData>
+            </a:graphic>
+          </wp:inline>
+        </w:drawing>
+      </w:r>
+    </w:p>
+    <w:p>
+      <w:pPr>
+        <w:spacing w:before="80" w:after="240"/>
+        <w:ind w:firstLine="0"/>
+        <w:jc w:val="center"/>
+      </w:pPr>
+      <w:r>
+        <w:rPr>
+          <w:rFonts w:ascii="Calibri" w:hAnsi="Calibri"/>
+          <w:b w:val="0"/>
+          <w:i/>
+          <w:color w:val="555555"/>
+          <w:sz w:val="20"/>
+        </w:rPr>
+        <w:t>Figura 9 — Módulo de Modelagem Geométrica (Blender 4.x) Fonte: produção autoral (2025) Diagrama do módulo de modelagem: no Blender 4.x, constrói o leito, empacota as partículas e valida a geometria 3D, gerando os artefatos de saída para as etapas seguintes.</w:t>
+      </w:r>
+    </w:p>
+    <w:p>
+      <w:pPr>
+        <w:spacing w:before="0" w:after="120"/>
+        <w:ind w:firstLine="709"/>
+        <w:jc w:val="both"/>
+      </w:pPr>
+      <w:r>
+        <w:rPr>
+          <w:rFonts w:ascii="Calibri" w:hAnsi="Calibri"/>
+          <w:b w:val="0"/>
+          <w:i w:val="0"/>
+          <w:sz w:val="24"/>
+        </w:rPr>
+        <w:t>Módulo de Simulação CFD no OpenFOAM: Prepara o caso, gera a malha com blockMesh e snappyHexMesh, executa o solver estacionário simpleFoam e coleta métricas como queda de pressão, número de Reynolds, número de células e tempos por etapa. A Figura 10 detalha a estrutura deste módulo.</w:t>
+      </w:r>
+    </w:p>
+    <w:p>
+      <w:pPr>
+        <w:spacing w:before="160" w:after="80"/>
+        <w:ind w:firstLine="0"/>
+        <w:jc w:val="center"/>
+      </w:pPr>
+      <w:r>
+        <w:drawing>
+          <wp:inline xmlns:a="http://schemas.openxmlformats.org/drawingml/2006/main" xmlns:pic="http://schemas.openxmlformats.org/drawingml/2006/picture">
+            <wp:extent cx="5040000" cy="1894843"/>
+            <wp:docPr id="3" name="Picture 3"/>
+            <wp:cNvGraphicFramePr>
+              <a:graphicFrameLocks noChangeAspect="1"/>
+            </wp:cNvGraphicFramePr>
+            <a:graphic>
+              <a:graphicData uri="http://schemas.openxmlformats.org/drawingml/2006/picture">
+                <pic:pic>
+                  <pic:nvPicPr>
+                    <pic:cNvPr id="0" name="pb_fig10_cfd_openfoam.png"/>
+                    <pic:cNvPicPr/>
+                  </pic:nvPicPr>
+                  <pic:blipFill>
+                    <a:blip r:embed="rId12"/>
+                    <a:stretch>
+                      <a:fillRect/>
+                    </a:stretch>
+                  </pic:blipFill>
+                  <pic:spPr>
+                    <a:xfrm>
+                      <a:off x="0" y="0"/>
+                      <a:ext cx="5040000" cy="1894843"/>
+                    </a:xfrm>
+                    <a:prstGeom prst="rect"/>
+                  </pic:spPr>
+                </pic:pic>
+              </a:graphicData>
+            </a:graphic>
+          </wp:inline>
+        </w:drawing>
+      </w:r>
+    </w:p>
+    <w:p>
+      <w:pPr>
+        <w:spacing w:before="80" w:after="240"/>
+        <w:ind w:firstLine="0"/>
+        <w:jc w:val="center"/>
+      </w:pPr>
+      <w:r>
+        <w:rPr>
+          <w:rFonts w:ascii="Calibri" w:hAnsi="Calibri"/>
+          <w:b w:val="0"/>
+          <w:i/>
+          <w:color w:val="555555"/>
+          <w:sz w:val="20"/>
+        </w:rPr>
+        <w:t>Figura 10 — Módulo de Simulação CFD (OpenFOAM) Fonte: produção autoral (2025) Diagrama do módulo de simulação: no OpenFOAM LTS, prepara o caso, executa a CFD no leito modelado e persiste resultados e métricas para análise.</w:t>
+      </w:r>
+    </w:p>
+    <w:p>
+      <w:pPr>
+        <w:spacing w:before="0" w:after="120"/>
+        <w:ind w:firstLine="709"/>
+        <w:jc w:val="both"/>
+      </w:pPr>
+      <w:r>
+        <w:rPr>
+          <w:rFonts w:ascii="Calibri" w:hAnsi="Calibri"/>
+          <w:b w:val="0"/>
+          <w:i w:val="0"/>
+          <w:sz w:val="24"/>
+        </w:rPr>
+        <w:t>Módulo de Persistência com PostgreSQL e MinIO: Registra metadados das execuções no PostgreSQL — hash, tempos, porosidade, número de células, versões e status [27] —, armazena artefatos de grande volume no MinIO como STL, VTK, CSV e logs organizados por runs/&lt;hash&gt; [26], e expõe o acesso via SQLAlchemy [47]. A</w:t>
+      </w:r>
+    </w:p>
+    <w:p>
+      <w:pPr>
+        <w:spacing w:before="80" w:after="240"/>
+        <w:ind w:firstLine="0"/>
+        <w:jc w:val="center"/>
+      </w:pPr>
+      <w:r>
+        <w:rPr>
+          <w:rFonts w:ascii="Calibri" w:hAnsi="Calibri"/>
+          <w:b w:val="0"/>
+          <w:i/>
+          <w:color w:val="555555"/>
+          <w:sz w:val="20"/>
+        </w:rPr>
+        <w:t>Figura 11 ilustra o fluxo completo de persistência.</w:t>
+      </w:r>
+    </w:p>
+    <w:p>
+      <w:pPr>
+        <w:spacing w:before="160" w:after="80"/>
+        <w:ind w:firstLine="0"/>
+        <w:jc w:val="center"/>
+      </w:pPr>
+      <w:r>
+        <w:drawing>
+          <wp:inline xmlns:a="http://schemas.openxmlformats.org/drawingml/2006/main" xmlns:pic="http://schemas.openxmlformats.org/drawingml/2006/picture">
+            <wp:extent cx="5040000" cy="1950734"/>
+            <wp:docPr id="4" name="Picture 4"/>
+            <wp:cNvGraphicFramePr>
+              <a:graphicFrameLocks noChangeAspect="1"/>
+            </wp:cNvGraphicFramePr>
+            <a:graphic>
+              <a:graphicData uri="http://schemas.openxmlformats.org/drawingml/2006/picture">
+                <pic:pic>
+                  <pic:nvPicPr>
+                    <pic:cNvPr id="0" name="pb_fig11_persistencia.png"/>
+                    <pic:cNvPicPr/>
+                  </pic:nvPicPr>
+                  <pic:blipFill>
+                    <a:blip r:embed="rId13"/>
+                    <a:stretch>
+                      <a:fillRect/>
+                    </a:stretch>
+                  </pic:blipFill>
+                  <pic:spPr>
+                    <a:xfrm>
+                      <a:off x="0" y="0"/>
+                      <a:ext cx="5040000" cy="1950734"/>
+                    </a:xfrm>
+                    <a:prstGeom prst="rect"/>
+                  </pic:spPr>
+                </pic:pic>
+              </a:graphicData>
+            </a:graphic>
+          </wp:inline>
+        </w:drawing>
+      </w:r>
+    </w:p>
+    <w:p>
+      <w:pPr>
+        <w:spacing w:before="80" w:after="240"/>
+        <w:ind w:firstLine="0"/>
+        <w:jc w:val="center"/>
+      </w:pPr>
+      <w:r>
+        <w:rPr>
+          <w:rFonts w:ascii="Calibri" w:hAnsi="Calibri"/>
+          <w:b w:val="0"/>
+          <w:i/>
+          <w:color w:val="555555"/>
+          <w:sz w:val="20"/>
+        </w:rPr>
+        <w:t>Figura 11 — Módulo de Persistência (PostgreSQL 16 + MinIO) Fonte: produção autoral (2025) Diagrama do módulo de persistência: organiza e armazena os dados do pipeline, usando PostgreSQL 16 para metadados e MinIO (S3) para artefatos volumosos.</w:t>
+      </w:r>
+    </w:p>
+    <w:p>
+      <w:pPr>
+        <w:spacing w:before="0" w:after="120"/>
+        <w:ind w:firstLine="709"/>
+        <w:jc w:val="both"/>
+      </w:pPr>
+      <w:r>
+        <w:rPr>
+          <w:rFonts w:ascii="Calibri" w:hAnsi="Calibri"/>
+          <w:b w:val="0"/>
+          <w:i w:val="0"/>
+          <w:sz w:val="24"/>
+        </w:rPr>
+        <w:t>API com FastAPI: Expõe endpoints para registrar execuções, consultar metadados e artefatos e executar ações administrativas. Autenticação com JWT [48] e documentação automática por OpenAPI [55]. Atua como ponto único de integração entre o frontend e a camada de persistência, conforme a Figura 12.</w:t>
+      </w:r>
+    </w:p>
+    <w:p>
+      <w:pPr>
+        <w:spacing w:before="160" w:after="80"/>
+        <w:ind w:firstLine="0"/>
+        <w:jc w:val="center"/>
+      </w:pPr>
+      <w:r>
+        <w:drawing>
+          <wp:inline xmlns:a="http://schemas.openxmlformats.org/drawingml/2006/main" xmlns:pic="http://schemas.openxmlformats.org/drawingml/2006/picture">
+            <wp:extent cx="5040000" cy="1950734"/>
+            <wp:docPr id="5" name="Picture 5"/>
+            <wp:cNvGraphicFramePr>
+              <a:graphicFrameLocks noChangeAspect="1"/>
+            </wp:cNvGraphicFramePr>
+            <a:graphic>
+              <a:graphicData uri="http://schemas.openxmlformats.org/drawingml/2006/picture">
+                <pic:pic>
+                  <pic:nvPicPr>
+                    <pic:cNvPr id="0" name="pb_fig12_api_fastapi.png"/>
+                    <pic:cNvPicPr/>
+                  </pic:nvPicPr>
+                  <pic:blipFill>
+                    <a:blip r:embed="rId14"/>
+                    <a:stretch>
+                      <a:fillRect/>
+                    </a:stretch>
+                  </pic:blipFill>
+                  <pic:spPr>
+                    <a:xfrm>
+                      <a:off x="0" y="0"/>
+                      <a:ext cx="5040000" cy="1950734"/>
+                    </a:xfrm>
+                    <a:prstGeom prst="rect"/>
+                  </pic:spPr>
+                </pic:pic>
+              </a:graphicData>
+            </a:graphic>
+          </wp:inline>
+        </w:drawing>
+      </w:r>
+    </w:p>
+    <w:p>
+      <w:pPr>
+        <w:spacing w:before="80" w:after="240"/>
+        <w:ind w:firstLine="0"/>
+        <w:jc w:val="center"/>
+      </w:pPr>
+      <w:r>
+        <w:rPr>
+          <w:rFonts w:ascii="Calibri" w:hAnsi="Calibri"/>
+          <w:b w:val="0"/>
+          <w:i/>
+          <w:color w:val="555555"/>
+          <w:sz w:val="20"/>
+        </w:rPr>
+        <w:t>Figura 12 — Cliente HTTP da API (FastAPI) Fonte: produção autoral (2025) Diagrama da API: FastAPI em Python atua como interface central, atendendo requisições HTTP REST, cuidando da autenticação e integrando com a camada de persistência.</w:t>
+      </w:r>
+    </w:p>
+    <w:p>
+      <w:pPr>
+        <w:spacing w:before="0" w:after="120"/>
+        <w:ind w:firstLine="709"/>
+        <w:jc w:val="both"/>
+      </w:pPr>
+      <w:r>
+        <w:rPr>
+          <w:rFonts w:ascii="Calibri" w:hAnsi="Calibri"/>
+          <w:b w:val="0"/>
+          <w:i w:val="0"/>
+          <w:sz w:val="24"/>
+        </w:rPr>
+        <w:t>Dashboard em React [21, 22]: Interface web para listar execuções, visualizar modelos 3D em STL com Three.js [23] e plotar curvas no Plotly [25]. Consome apenas a API, sem acesso direto aos diretórios de artefatos; a Figura 13 resume a arquitetura deste componente.</w:t>
+      </w:r>
+    </w:p>
+    <w:p>
+      <w:pPr>
+        <w:spacing w:before="160" w:after="80"/>
+        <w:ind w:firstLine="0"/>
+        <w:jc w:val="center"/>
+      </w:pPr>
+      <w:r>
+        <w:drawing>
+          <wp:inline xmlns:a="http://schemas.openxmlformats.org/drawingml/2006/main" xmlns:pic="http://schemas.openxmlformats.org/drawingml/2006/picture">
+            <wp:extent cx="5040000" cy="1950734"/>
+            <wp:docPr id="6" name="Picture 6"/>
+            <wp:cNvGraphicFramePr>
+              <a:graphicFrameLocks noChangeAspect="1"/>
+            </wp:cNvGraphicFramePr>
+            <a:graphic>
+              <a:graphicData uri="http://schemas.openxmlformats.org/drawingml/2006/picture">
+                <pic:pic>
+                  <pic:nvPicPr>
+                    <pic:cNvPr id="0" name="pb_fig13_dashboard_react.png"/>
+                    <pic:cNvPicPr/>
+                  </pic:nvPicPr>
+                  <pic:blipFill>
+                    <a:blip r:embed="rId15"/>
+                    <a:stretch>
+                      <a:fillRect/>
+                    </a:stretch>
+                  </pic:blipFill>
+                  <pic:spPr>
+                    <a:xfrm>
+                      <a:off x="0" y="0"/>
+                      <a:ext cx="5040000" cy="1950734"/>
+                    </a:xfrm>
+                    <a:prstGeom prst="rect"/>
+                  </pic:spPr>
+                </pic:pic>
+              </a:graphicData>
+            </a:graphic>
+          </wp:inline>
+        </w:drawing>
+      </w:r>
+    </w:p>
+    <w:p>
+      <w:pPr>
+        <w:spacing w:before="80" w:after="240"/>
+        <w:ind w:firstLine="0"/>
+        <w:jc w:val="center"/>
+      </w:pPr>
+      <w:r>
+        <w:rPr>
+          <w:rFonts w:ascii="Calibri" w:hAnsi="Calibri"/>
+          <w:b w:val="0"/>
+          <w:i/>
+          <w:color w:val="555555"/>
+          <w:sz w:val="20"/>
+        </w:rPr>
+        <w:t>Figura 13 — Dashboard (React) Fonte: produção autoral (2025) Diagrama do dashboard: interface web que consome a API para listar execuções e visualizar resultados, oferecendo acesso visual e interativo sem contato direto com os artefatos.</w:t>
+      </w:r>
+    </w:p>
+    <w:p>
+      <w:pPr>
+        <w:pStyle w:val="Heading3"/>
+        <w:ind w:firstLine="0"/>
+      </w:pPr>
+      <w:r>
+        <w:rPr>
+          <w:rFonts w:ascii="Calibri" w:hAnsi="Calibri"/>
+          <w:b/>
+          <w:color w:val="00467F"/>
+          <w:sz w:val="24"/>
+        </w:rPr>
+        <w:t>4.7 Requisitos Funcionais e Não Funcionais</w:t>
+      </w:r>
+    </w:p>
+    <w:p>
+      <w:pPr>
+        <w:spacing w:before="0" w:after="120"/>
+        <w:ind w:firstLine="709"/>
+        <w:jc w:val="both"/>
+      </w:pPr>
+      <w:r>
+        <w:rPr>
+          <w:rFonts w:ascii="Calibri" w:hAnsi="Calibri"/>
+          <w:b w:val="0"/>
+          <w:i w:val="0"/>
+          <w:sz w:val="24"/>
+        </w:rPr>
         <w:t>Requisitos Funcionais:</w:t>
       </w:r>
     </w:p>
@@ -6644,7 +7136,7 @@
           <w:color w:val="00467F"/>
           <w:sz w:val="24"/>
         </w:rPr>
-        <w:t>4.7 Critérios de Aceitação</w:t>
+        <w:t>4.8 Critérios de Aceitação</w:t>
       </w:r>
     </w:p>
     <w:p>
@@ -6880,7 +7372,7 @@
           <w:i w:val="0"/>
           <w:sz w:val="24"/>
         </w:rPr>
-        <w:t>Com a proposta de solução delineada — objetivos específicos, arquitetura em seis camadas, módulos e critérios verificáveis —, o próximo capítulo descreve como cada componente foi efetivamente construído: as escolhas de implementação, as estruturas de dados, os algoritmos centrais e as evidências verificáveis no repositório que demonstram a realização dos requisitos aqui definidos.</w:t>
+        <w:t>Com a proposta de solução delineada — objetivos específicos, arquitetura em seis camadas, módulos, critérios verificáveis e diagramas de cada componente —, o próximo capítulo descreve como cada componente foi efetivamente construído: as escolhas de implementação, as estruturas de dados, os algoritmos centrais e as evidências verificáveis no repositório que demonstram a realização dos requisitos aqui definidos.</w:t>
       </w:r>
     </w:p>
     <w:p>
@@ -8884,6 +9376,22 @@
     </w:p>
     <w:p>
       <w:pPr>
+        <w:spacing w:before="0" w:after="120"/>
+        <w:ind w:firstLine="709"/>
+        <w:jc w:val="both"/>
+      </w:pPr>
+      <w:r>
+        <w:rPr>
+          <w:rFonts w:ascii="Calibri" w:hAnsi="Calibri"/>
+          <w:b w:val="0"/>
+          <w:i w:val="0"/>
+          <w:sz w:val="24"/>
+        </w:rPr>
+        <w:t>Este capítulo apresenta os fluxos de execução do BEDFLOW-ATLAS de forma prática, com espaços reservados para as capturas de tela das principais etapas. Os fluxos estão organizados em três percursos complementares: via interface web, via terminal e o ciclo de reprodutibilidade. Cada placeholder indica o print correspondente, com descrição do contexto esperado.</w:t>
+      </w:r>
+    </w:p>
+    <w:p>
+      <w:pPr>
         <w:pStyle w:val="Heading3"/>
         <w:ind w:firstLine="0"/>
       </w:pPr>
@@ -8894,7 +9402,7 @@
           <w:color w:val="00467F"/>
           <w:sz w:val="24"/>
         </w:rPr>
-        <w:t>6.1 Roteiro de Uso</w:t>
+        <w:t>6.1 Fluxo via Interface Web</w:t>
       </w:r>
     </w:p>
     <w:p>
@@ -8910,7 +9418,48 @@
           <w:i w:val="0"/>
           <w:sz w:val="24"/>
         </w:rPr>
-        <w:t>Este capítulo apresenta o BEDFLOW-ATLAS em operação, percorrendo os principais fluxos de uso em cenários representativos da prática de pesquisa. O objetivo não é descrever a arquitetura do sistema — abordada no Capítulo 5 —, mas tornar concretas e verificáveis as capacidades implementadas, mostrando os artefatos produzidos, os parâmetros envolvidos e o comportamento observado em cada etapa do pipeline.</w:t>
+        <w:t>O dashboard é acessado pelo navegador após inicialização dos serviços com docker compose up na pasta docker/ (ou execução em modo desenvolvimento). A tela inicial apresenta um painel de resumo executivo com contadores de execuções recentes e jobs ativos.</w:t>
+      </w:r>
+    </w:p>
+    <w:p>
+      <w:pPr>
+        <w:spacing w:before="200" w:after="200"/>
+        <w:ind w:firstLine="0"/>
+        <w:jc w:val="center"/>
+        <w:shd w:val="clear" w:color="auto" w:fill="EFEFEF"/>
+        <w:pBdr>
+          <w:top w:val="single" w:sz="6" w:space="4" w:color="AAAAAA"/>
+          <w:left w:val="single" w:sz="6" w:space="4" w:color="AAAAAA"/>
+          <w:bottom w:val="single" w:sz="6" w:space="4" w:color="AAAAAA"/>
+          <w:right w:val="single" w:sz="6" w:space="4" w:color="AAAAAA"/>
+        </w:pBdr>
+      </w:pPr>
+      <w:r>
+        <w:rPr>
+          <w:rFonts w:ascii="Calibri" w:hAnsi="Calibri"/>
+          <w:b w:val="0"/>
+          <w:i/>
+          <w:color w:val="555555"/>
+          <w:sz w:val="22"/>
+        </w:rPr>
+        <w:t>[ W1 ]  Dashboard principal — resumo executivo com contadores e execuções recentes</w:t>
+      </w:r>
+    </w:p>
+    <w:p>
+      <w:pPr>
+        <w:spacing w:before="80" w:after="240"/>
+        <w:ind w:firstLine="0"/>
+        <w:jc w:val="center"/>
+      </w:pPr>
+      <w:r>
+        <w:rPr>
+          <w:rFonts w:ascii="Calibri" w:hAnsi="Calibri"/>
+          <w:b w:val="0"/>
+          <w:i/>
+          <w:color w:val="555555"/>
+          <w:sz w:val="20"/>
+        </w:rPr>
+        <w:t>Figura XX — Dashboard principal do BEDFLOW-ATLAS. Fonte: produção autoral (2026) Dashboard com contadores de execuções, jobs ativos e métricas gerais visíveis na tela inicial da plataforma.</w:t>
       </w:r>
     </w:p>
     <w:p>
@@ -8926,7 +9475,645 @@
           <w:i w:val="0"/>
           <w:sz w:val="24"/>
         </w:rPr>
-        <w:t>O BEDFLOW-ATLAS pode ser acessado por três superfícies equivalentes: a interface web (exploratória, formulário visual), o terminal CLI Wizard (automação, modos interativo e headless) e o visualizador desktop (inspeção do corte em ambiente científico). Todos compartilham o mesmo motor de geração e produzem os mesmos artefatos.</w:t>
+        <w:t>O Wizard de Criação guia em passos sequenciais — geometria, partículas, empacotamento, fluido, malha, solver e exportação — sem necessidade de editar o arquivo .bed manualmente. O primeiro passo configura as dimensões macro do leito.</w:t>
+      </w:r>
+    </w:p>
+    <w:p>
+      <w:pPr>
+        <w:spacing w:before="200" w:after="200"/>
+        <w:ind w:firstLine="0"/>
+        <w:jc w:val="center"/>
+        <w:shd w:val="clear" w:color="auto" w:fill="EFEFEF"/>
+        <w:pBdr>
+          <w:top w:val="single" w:sz="6" w:space="4" w:color="AAAAAA"/>
+          <w:left w:val="single" w:sz="6" w:space="4" w:color="AAAAAA"/>
+          <w:bottom w:val="single" w:sz="6" w:space="4" w:color="AAAAAA"/>
+          <w:right w:val="single" w:sz="6" w:space="4" w:color="AAAAAA"/>
+        </w:pBdr>
+      </w:pPr>
+      <w:r>
+        <w:rPr>
+          <w:rFonts w:ascii="Calibri" w:hAnsi="Calibri"/>
+          <w:b w:val="0"/>
+          <w:i/>
+          <w:color w:val="555555"/>
+          <w:sz w:val="22"/>
+        </w:rPr>
+        <w:t>[ W2 ]  Wizard Criar Leito — Passo 1: Geometria</w:t>
+      </w:r>
+    </w:p>
+    <w:p>
+      <w:pPr>
+        <w:spacing w:before="80" w:after="240"/>
+        <w:ind w:firstLine="0"/>
+        <w:jc w:val="center"/>
+      </w:pPr>
+      <w:r>
+        <w:rPr>
+          <w:rFonts w:ascii="Calibri" w:hAnsi="Calibri"/>
+          <w:b w:val="0"/>
+          <w:i/>
+          <w:color w:val="555555"/>
+          <w:sz w:val="20"/>
+        </w:rPr>
+        <w:t>Figura XX — Passo 1 do Wizard de Criação: geometria macro do leito. Fonte: produção autoral (2026) Formulário de geometria com campos para diâmetro, altura e espessura da parede do leito.</w:t>
+      </w:r>
+    </w:p>
+    <w:p>
+      <w:pPr>
+        <w:spacing w:before="200" w:after="200"/>
+        <w:ind w:firstLine="0"/>
+        <w:jc w:val="center"/>
+        <w:shd w:val="clear" w:color="auto" w:fill="EFEFEF"/>
+        <w:pBdr>
+          <w:top w:val="single" w:sz="6" w:space="4" w:color="AAAAAA"/>
+          <w:left w:val="single" w:sz="6" w:space="4" w:color="AAAAAA"/>
+          <w:bottom w:val="single" w:sz="6" w:space="4" w:color="AAAAAA"/>
+          <w:right w:val="single" w:sz="6" w:space="4" w:color="AAAAAA"/>
+        </w:pBdr>
+      </w:pPr>
+      <w:r>
+        <w:rPr>
+          <w:rFonts w:ascii="Calibri" w:hAnsi="Calibri"/>
+          <w:b w:val="0"/>
+          <w:i/>
+          <w:color w:val="555555"/>
+          <w:sz w:val="22"/>
+        </w:rPr>
+        <w:t>[ W3 ]  Wizard — Passo de partículas: tipo, diâmetro e quantidade</w:t>
+      </w:r>
+    </w:p>
+    <w:p>
+      <w:pPr>
+        <w:spacing w:before="80" w:after="240"/>
+        <w:ind w:firstLine="0"/>
+        <w:jc w:val="center"/>
+      </w:pPr>
+      <w:r>
+        <w:rPr>
+          <w:rFonts w:ascii="Calibri" w:hAnsi="Calibri"/>
+          <w:b w:val="0"/>
+          <w:i/>
+          <w:color w:val="555555"/>
+          <w:sz w:val="20"/>
+        </w:rPr>
+        <w:t>Figura XX — Configuração das partículas no Wizard de Criação. Fonte: produção autoral (2026) Formulário de partículas com seleção de tipo, diâmetro e quantidade.</w:t>
+      </w:r>
+    </w:p>
+    <w:p>
+      <w:pPr>
+        <w:spacing w:before="200" w:after="200"/>
+        <w:ind w:firstLine="0"/>
+        <w:jc w:val="center"/>
+        <w:shd w:val="clear" w:color="auto" w:fill="EFEFEF"/>
+        <w:pBdr>
+          <w:top w:val="single" w:sz="6" w:space="4" w:color="AAAAAA"/>
+          <w:left w:val="single" w:sz="6" w:space="4" w:color="AAAAAA"/>
+          <w:bottom w:val="single" w:sz="6" w:space="4" w:color="AAAAAA"/>
+          <w:right w:val="single" w:sz="6" w:space="4" w:color="AAAAAA"/>
+        </w:pBdr>
+      </w:pPr>
+      <w:r>
+        <w:rPr>
+          <w:rFonts w:ascii="Calibri" w:hAnsi="Calibri"/>
+          <w:b w:val="0"/>
+          <w:i/>
+          <w:color w:val="555555"/>
+          <w:sz w:val="22"/>
+        </w:rPr>
+        <w:t>[ W4 ]  Wizard — Passo de empacotamento: seed, método e coeficientes</w:t>
+      </w:r>
+    </w:p>
+    <w:p>
+      <w:pPr>
+        <w:spacing w:before="80" w:after="240"/>
+        <w:ind w:firstLine="0"/>
+        <w:jc w:val="center"/>
+      </w:pPr>
+      <w:r>
+        <w:rPr>
+          <w:rFonts w:ascii="Calibri" w:hAnsi="Calibri"/>
+          <w:b w:val="0"/>
+          <w:i/>
+          <w:color w:val="555555"/>
+          <w:sz w:val="20"/>
+        </w:rPr>
+        <w:t>Figura XX — Configuração do empacotamento com seed e parâmetros físicos. Fonte: produção autoral (2026) Formulário de empacotamento com campo de seed e seleção de método.</w:t>
+      </w:r>
+    </w:p>
+    <w:p>
+      <w:pPr>
+        <w:spacing w:before="0" w:after="120"/>
+        <w:ind w:firstLine="709"/>
+        <w:jc w:val="both"/>
+      </w:pPr>
+      <w:r>
+        <w:rPr>
+          <w:rFonts w:ascii="Calibri" w:hAnsi="Calibri"/>
+          <w:b w:val="0"/>
+          <w:i w:val="0"/>
+          <w:sz w:val="24"/>
+        </w:rPr>
+        <w:t>Após a configuração do empacotamento, o wizard oferece a visualização prévia do arquivo .bed completo em editor textarea antes do envio para compilação.</w:t>
+      </w:r>
+    </w:p>
+    <w:p>
+      <w:pPr>
+        <w:spacing w:before="200" w:after="200"/>
+        <w:ind w:firstLine="0"/>
+        <w:jc w:val="center"/>
+        <w:shd w:val="clear" w:color="auto" w:fill="EFEFEF"/>
+        <w:pBdr>
+          <w:top w:val="single" w:sz="6" w:space="4" w:color="AAAAAA"/>
+          <w:left w:val="single" w:sz="6" w:space="4" w:color="AAAAAA"/>
+          <w:bottom w:val="single" w:sz="6" w:space="4" w:color="AAAAAA"/>
+          <w:right w:val="single" w:sz="6" w:space="4" w:color="AAAAAA"/>
+        </w:pBdr>
+      </w:pPr>
+      <w:r>
+        <w:rPr>
+          <w:rFonts w:ascii="Calibri" w:hAnsi="Calibri"/>
+          <w:b w:val="0"/>
+          <w:i/>
+          <w:color w:val="555555"/>
+          <w:sz w:val="22"/>
+        </w:rPr>
+        <w:t>[ W5 ]  Página Templates .BED — editor do arquivo .bed em textarea</w:t>
+      </w:r>
+    </w:p>
+    <w:p>
+      <w:pPr>
+        <w:spacing w:before="80" w:after="240"/>
+        <w:ind w:firstLine="0"/>
+        <w:jc w:val="center"/>
+      </w:pPr>
+      <w:r>
+        <w:rPr>
+          <w:rFonts w:ascii="Calibri" w:hAnsi="Calibri"/>
+          <w:b w:val="0"/>
+          <w:i/>
+          <w:color w:val="555555"/>
+          <w:sz w:val="20"/>
+        </w:rPr>
+        <w:t>Figura XX — Editor de templates .BED com arquivo pronto para revisão. Fonte: produção autoral (2026) Editor textarea com arquivo .bed gerado e opção de edição antes do envio.</w:t>
+      </w:r>
+    </w:p>
+    <w:p>
+      <w:pPr>
+        <w:spacing w:before="0" w:after="120"/>
+        <w:ind w:firstLine="709"/>
+        <w:jc w:val="both"/>
+      </w:pPr>
+      <w:r>
+        <w:rPr>
+          <w:rFonts w:ascii="Calibri" w:hAnsi="Calibri"/>
+          <w:b w:val="0"/>
+          <w:i w:val="0"/>
+          <w:sz w:val="24"/>
+        </w:rPr>
+        <w:t>Após confirmar os parâmetros, o pipeline é disparado e monitorado em tempo real. O dashboard exibe a progressão de estados queued → running → completed com barra de progresso e logs por etapa.</w:t>
+      </w:r>
+    </w:p>
+    <w:p>
+      <w:pPr>
+        <w:spacing w:before="200" w:after="200"/>
+        <w:ind w:firstLine="0"/>
+        <w:jc w:val="center"/>
+        <w:shd w:val="clear" w:color="auto" w:fill="EFEFEF"/>
+        <w:pBdr>
+          <w:top w:val="single" w:sz="6" w:space="4" w:color="AAAAAA"/>
+          <w:left w:val="single" w:sz="6" w:space="4" w:color="AAAAAA"/>
+          <w:bottom w:val="single" w:sz="6" w:space="4" w:color="AAAAAA"/>
+          <w:right w:val="single" w:sz="6" w:space="4" w:color="AAAAAA"/>
+        </w:pBdr>
+      </w:pPr>
+      <w:r>
+        <w:rPr>
+          <w:rFonts w:ascii="Calibri" w:hAnsi="Calibri"/>
+          <w:b w:val="0"/>
+          <w:i/>
+          <w:color w:val="555555"/>
+          <w:sz w:val="22"/>
+        </w:rPr>
+        <w:t>[ W6 ]  Monitoramento de jobs — job RUNNING com indicador de progresso</w:t>
+      </w:r>
+    </w:p>
+    <w:p>
+      <w:pPr>
+        <w:spacing w:before="80" w:after="240"/>
+        <w:ind w:firstLine="0"/>
+        <w:jc w:val="center"/>
+      </w:pPr>
+      <w:r>
+        <w:rPr>
+          <w:rFonts w:ascii="Calibri" w:hAnsi="Calibri"/>
+          <w:b w:val="0"/>
+          <w:i/>
+          <w:color w:val="555555"/>
+          <w:sz w:val="20"/>
+        </w:rPr>
+        <w:t>Figura XX — Job de geração em execução com status RUNNING. Fonte: produção autoral (2026) Tela de monitoramento com barra de progresso, etapa atual e logs em tempo real.</w:t>
+      </w:r>
+    </w:p>
+    <w:p>
+      <w:pPr>
+        <w:spacing w:before="200" w:after="200"/>
+        <w:ind w:firstLine="0"/>
+        <w:jc w:val="center"/>
+        <w:shd w:val="clear" w:color="auto" w:fill="EFEFEF"/>
+        <w:pBdr>
+          <w:top w:val="single" w:sz="6" w:space="4" w:color="AAAAAA"/>
+          <w:left w:val="single" w:sz="6" w:space="4" w:color="AAAAAA"/>
+          <w:bottom w:val="single" w:sz="6" w:space="4" w:color="AAAAAA"/>
+          <w:right w:val="single" w:sz="6" w:space="4" w:color="AAAAAA"/>
+        </w:pBdr>
+      </w:pPr>
+      <w:r>
+        <w:rPr>
+          <w:rFonts w:ascii="Calibri" w:hAnsi="Calibri"/>
+          <w:b w:val="0"/>
+          <w:i/>
+          <w:color w:val="555555"/>
+          <w:sz w:val="22"/>
+        </w:rPr>
+        <w:t>[ W7 ]  Monitoramento de jobs — job DONE com hash e links de download</w:t>
+      </w:r>
+    </w:p>
+    <w:p>
+      <w:pPr>
+        <w:spacing w:before="80" w:after="240"/>
+        <w:ind w:firstLine="0"/>
+        <w:jc w:val="center"/>
+      </w:pPr>
+      <w:r>
+        <w:rPr>
+          <w:rFonts w:ascii="Calibri" w:hAnsi="Calibri"/>
+          <w:b w:val="0"/>
+          <w:i/>
+          <w:color w:val="555555"/>
+          <w:sz w:val="20"/>
+        </w:rPr>
+        <w:t>Figura XX — Job concluído com hash SHA-256 e links de artefatos. Fonte: produção autoral (2026) Tela com job finalizado, hash copiável e links de download para STL, JSON e logs.</w:t>
+      </w:r>
+    </w:p>
+    <w:p>
+      <w:pPr>
+        <w:spacing w:before="0" w:after="120"/>
+        <w:ind w:firstLine="709"/>
+        <w:jc w:val="both"/>
+      </w:pPr>
+      <w:r>
+        <w:rPr>
+          <w:rFonts w:ascii="Calibri" w:hAnsi="Calibri"/>
+          <w:b w:val="0"/>
+          <w:i w:val="0"/>
+          <w:sz w:val="24"/>
+        </w:rPr>
+        <w:t>Ao término do job, o modelo STL é carregado automaticamente no visualizador web via Three.js, que oferece controles de órbita e zoom sem necessidade de software adicional.</w:t>
+      </w:r>
+    </w:p>
+    <w:p>
+      <w:pPr>
+        <w:spacing w:before="200" w:after="200"/>
+        <w:ind w:firstLine="0"/>
+        <w:jc w:val="center"/>
+        <w:shd w:val="clear" w:color="auto" w:fill="EFEFEF"/>
+        <w:pBdr>
+          <w:top w:val="single" w:sz="6" w:space="4" w:color="AAAAAA"/>
+          <w:left w:val="single" w:sz="6" w:space="4" w:color="AAAAAA"/>
+          <w:bottom w:val="single" w:sz="6" w:space="4" w:color="AAAAAA"/>
+          <w:right w:val="single" w:sz="6" w:space="4" w:color="AAAAAA"/>
+        </w:pBdr>
+      </w:pPr>
+      <w:r>
+        <w:rPr>
+          <w:rFonts w:ascii="Calibri" w:hAnsi="Calibri"/>
+          <w:b w:val="0"/>
+          <w:i/>
+          <w:color w:val="555555"/>
+          <w:sz w:val="22"/>
+        </w:rPr>
+        <w:t>[ W8 ]  Visualizador web 3D — leito empacotado renderizado em Three.js</w:t>
+      </w:r>
+    </w:p>
+    <w:p>
+      <w:pPr>
+        <w:spacing w:before="80" w:after="240"/>
+        <w:ind w:firstLine="0"/>
+        <w:jc w:val="center"/>
+      </w:pPr>
+      <w:r>
+        <w:rPr>
+          <w:rFonts w:ascii="Calibri" w:hAnsi="Calibri"/>
+          <w:b w:val="0"/>
+          <w:i/>
+          <w:color w:val="555555"/>
+          <w:sz w:val="20"/>
+        </w:rPr>
+        <w:t>Figura XX — Leito empacotado no visualizador web com controles de órbita. Fonte: produção autoral (2026) Visualizador 3D com geometria do leito renderizada, controles de rotação e zoom.</w:t>
+      </w:r>
+    </w:p>
+    <w:p>
+      <w:pPr>
+        <w:spacing w:before="200" w:after="200"/>
+        <w:ind w:firstLine="0"/>
+        <w:jc w:val="center"/>
+        <w:shd w:val="clear" w:color="auto" w:fill="EFEFEF"/>
+        <w:pBdr>
+          <w:top w:val="single" w:sz="6" w:space="4" w:color="AAAAAA"/>
+          <w:left w:val="single" w:sz="6" w:space="4" w:color="AAAAAA"/>
+          <w:bottom w:val="single" w:sz="6" w:space="4" w:color="AAAAAA"/>
+          <w:right w:val="single" w:sz="6" w:space="4" w:color="AAAAAA"/>
+        </w:pBdr>
+      </w:pPr>
+      <w:r>
+        <w:rPr>
+          <w:rFonts w:ascii="Calibri" w:hAnsi="Calibri"/>
+          <w:b w:val="0"/>
+          <w:i/>
+          <w:color w:val="555555"/>
+          <w:sz w:val="22"/>
+        </w:rPr>
+        <w:t>[ W9 ]  Visualizador web 3D — seção transversal após corte (thin slice)</w:t>
+      </w:r>
+    </w:p>
+    <w:p>
+      <w:pPr>
+        <w:spacing w:before="80" w:after="240"/>
+        <w:ind w:firstLine="0"/>
+        <w:jc w:val="center"/>
+      </w:pPr>
+      <w:r>
+        <w:rPr>
+          <w:rFonts w:ascii="Calibri" w:hAnsi="Calibri"/>
+          <w:b w:val="0"/>
+          <w:i/>
+          <w:color w:val="555555"/>
+          <w:sz w:val="20"/>
+        </w:rPr>
+        <w:t>Figura XX — Seção transversal renderizada no visualizador web. Fonte: produção autoral (2026) Seção transversal do leito com discos aparentes no plano de corte.</w:t>
+      </w:r>
+    </w:p>
+    <w:p>
+      <w:pPr>
+        <w:spacing w:before="200" w:after="200"/>
+        <w:ind w:firstLine="0"/>
+        <w:jc w:val="center"/>
+        <w:shd w:val="clear" w:color="auto" w:fill="EFEFEF"/>
+        <w:pBdr>
+          <w:top w:val="single" w:sz="6" w:space="4" w:color="AAAAAA"/>
+          <w:left w:val="single" w:sz="6" w:space="4" w:color="AAAAAA"/>
+          <w:bottom w:val="single" w:sz="6" w:space="4" w:color="AAAAAA"/>
+          <w:right w:val="single" w:sz="6" w:space="4" w:color="AAAAAA"/>
+        </w:pBdr>
+      </w:pPr>
+      <w:r>
+        <w:rPr>
+          <w:rFonts w:ascii="Calibri" w:hAnsi="Calibri"/>
+          <w:b w:val="0"/>
+          <w:i/>
+          <w:color w:val="555555"/>
+          <w:sz w:val="22"/>
+        </w:rPr>
+        <w:t>[ W10 ]  Histórico de modelos — hash, seed, porosidade, data e status</w:t>
+      </w:r>
+    </w:p>
+    <w:p>
+      <w:pPr>
+        <w:spacing w:before="80" w:after="240"/>
+        <w:ind w:firstLine="0"/>
+        <w:jc w:val="center"/>
+      </w:pPr>
+      <w:r>
+        <w:rPr>
+          <w:rFonts w:ascii="Calibri" w:hAnsi="Calibri"/>
+          <w:b w:val="0"/>
+          <w:i/>
+          <w:color w:val="555555"/>
+          <w:sz w:val="20"/>
+        </w:rPr>
+        <w:t>Figura XX — Histórico de execuções do BEDFLOW-ATLAS. Fonte: produção autoral (2026) Tabela de execuções com colunas de hash, seed, porosidade, data e status.</w:t>
+      </w:r>
+    </w:p>
+    <w:p>
+      <w:pPr>
+        <w:spacing w:before="200" w:after="200"/>
+        <w:ind w:firstLine="0"/>
+        <w:jc w:val="center"/>
+        <w:shd w:val="clear" w:color="auto" w:fill="EFEFEF"/>
+        <w:pBdr>
+          <w:top w:val="single" w:sz="6" w:space="4" w:color="AAAAAA"/>
+          <w:left w:val="single" w:sz="6" w:space="4" w:color="AAAAAA"/>
+          <w:bottom w:val="single" w:sz="6" w:space="4" w:color="AAAAAA"/>
+          <w:right w:val="single" w:sz="6" w:space="4" w:color="AAAAAA"/>
+        </w:pBdr>
+      </w:pPr>
+      <w:r>
+        <w:rPr>
+          <w:rFonts w:ascii="Calibri" w:hAnsi="Calibri"/>
+          <w:b w:val="0"/>
+          <w:i/>
+          <w:color w:val="555555"/>
+          <w:sz w:val="22"/>
+        </w:rPr>
+        <w:t>[ W11 ]  Detalhe de execução — hash copiável, metadados e downloads</w:t>
+      </w:r>
+    </w:p>
+    <w:p>
+      <w:pPr>
+        <w:spacing w:before="80" w:after="240"/>
+        <w:ind w:firstLine="0"/>
+        <w:jc w:val="center"/>
+      </w:pPr>
+      <w:r>
+        <w:rPr>
+          <w:rFonts w:ascii="Calibri" w:hAnsi="Calibri"/>
+          <w:b w:val="0"/>
+          <w:i/>
+          <w:color w:val="555555"/>
+          <w:sz w:val="20"/>
+        </w:rPr>
+        <w:t>Figura XX — Página de detalhe com hash, metadados e downloads dos artefatos. Fonte: produção autoral (2026) Página de detalhe com hash SHA-256 copiável, métricas da geração e botões de download para todos os artefatos da execução.</w:t>
+      </w:r>
+    </w:p>
+    <w:p>
+      <w:pPr>
+        <w:spacing w:before="0" w:after="120"/>
+        <w:ind w:firstLine="709"/>
+        <w:jc w:val="both"/>
+      </w:pPr>
+      <w:r>
+        <w:rPr>
+          <w:rFonts w:ascii="Calibri" w:hAnsi="Calibri"/>
+          <w:b w:val="0"/>
+          <w:i w:val="0"/>
+          <w:sz w:val="24"/>
+        </w:rPr>
+        <w:t>As quatro novas páginas desenvolvidas para a etapa atual ampliam as capacidades da plataforma em relação à versão anterior, introduzindo acesso ao banco de dados, anotações por execução, configurações de perfil e preferências do usuário.</w:t>
+      </w:r>
+    </w:p>
+    <w:p>
+      <w:pPr>
+        <w:spacing w:before="200" w:after="200"/>
+        <w:ind w:firstLine="0"/>
+        <w:jc w:val="center"/>
+        <w:shd w:val="clear" w:color="auto" w:fill="EFEFEF"/>
+        <w:pBdr>
+          <w:top w:val="single" w:sz="6" w:space="4" w:color="AAAAAA"/>
+          <w:left w:val="single" w:sz="6" w:space="4" w:color="AAAAAA"/>
+          <w:bottom w:val="single" w:sz="6" w:space="4" w:color="AAAAAA"/>
+          <w:right w:val="single" w:sz="6" w:space="4" w:color="AAAAAA"/>
+        </w:pBdr>
+      </w:pPr>
+      <w:r>
+        <w:rPr>
+          <w:rFonts w:ascii="Calibri" w:hAnsi="Calibri"/>
+          <w:b w:val="0"/>
+          <w:i/>
+          <w:color w:val="555555"/>
+          <w:sz w:val="22"/>
+        </w:rPr>
+        <w:t>[ W12 ]  Página Banco de Dados — contagens SQL em tempo real</w:t>
+      </w:r>
+    </w:p>
+    <w:p>
+      <w:pPr>
+        <w:spacing w:before="80" w:after="240"/>
+        <w:ind w:firstLine="0"/>
+        <w:jc w:val="center"/>
+      </w:pPr>
+      <w:r>
+        <w:rPr>
+          <w:rFonts w:ascii="Calibri" w:hAnsi="Calibri"/>
+          <w:b w:val="0"/>
+          <w:i/>
+          <w:color w:val="555555"/>
+          <w:sz w:val="20"/>
+        </w:rPr>
+        <w:t>Figura XX — Página Banco de Dados com contagens das entidades do sistema. Fonte: produção autoral (2026) Painel com contagens de execuções, templates e jobs diretamente do banco.</w:t>
+      </w:r>
+    </w:p>
+    <w:p>
+      <w:pPr>
+        <w:spacing w:before="200" w:after="200"/>
+        <w:ind w:firstLine="0"/>
+        <w:jc w:val="center"/>
+        <w:shd w:val="clear" w:color="auto" w:fill="EFEFEF"/>
+        <w:pBdr>
+          <w:top w:val="single" w:sz="6" w:space="4" w:color="AAAAAA"/>
+          <w:left w:val="single" w:sz="6" w:space="4" w:color="AAAAAA"/>
+          <w:bottom w:val="single" w:sz="6" w:space="4" w:color="AAAAAA"/>
+          <w:right w:val="single" w:sz="6" w:space="4" w:color="AAAAAA"/>
+        </w:pBdr>
+      </w:pPr>
+      <w:r>
+        <w:rPr>
+          <w:rFonts w:ascii="Calibri" w:hAnsi="Calibri"/>
+          <w:b w:val="0"/>
+          <w:i/>
+          <w:color w:val="555555"/>
+          <w:sz w:val="22"/>
+        </w:rPr>
+        <w:t>[ W13 ]  Página Relatórios — anotação vinculada a uma execução</w:t>
+      </w:r>
+    </w:p>
+    <w:p>
+      <w:pPr>
+        <w:spacing w:before="80" w:after="240"/>
+        <w:ind w:firstLine="0"/>
+        <w:jc w:val="center"/>
+      </w:pPr>
+      <w:r>
+        <w:rPr>
+          <w:rFonts w:ascii="Calibri" w:hAnsi="Calibri"/>
+          <w:b w:val="0"/>
+          <w:i/>
+          <w:color w:val="555555"/>
+          <w:sz w:val="20"/>
+        </w:rPr>
+        <w:t>Figura XX — Página Relatórios com formulário de criação de anotação. Fonte: produção autoral (2026) Formulário de criação de anotação com seleção de execução e campo de texto livre.</w:t>
+      </w:r>
+    </w:p>
+    <w:p>
+      <w:pPr>
+        <w:spacing w:before="200" w:after="200"/>
+        <w:ind w:firstLine="0"/>
+        <w:jc w:val="center"/>
+        <w:shd w:val="clear" w:color="auto" w:fill="EFEFEF"/>
+        <w:pBdr>
+          <w:top w:val="single" w:sz="6" w:space="4" w:color="AAAAAA"/>
+          <w:left w:val="single" w:sz="6" w:space="4" w:color="AAAAAA"/>
+          <w:bottom w:val="single" w:sz="6" w:space="4" w:color="AAAAAA"/>
+          <w:right w:val="single" w:sz="6" w:space="4" w:color="AAAAAA"/>
+        </w:pBdr>
+      </w:pPr>
+      <w:r>
+        <w:rPr>
+          <w:rFonts w:ascii="Calibri" w:hAnsi="Calibri"/>
+          <w:b w:val="0"/>
+          <w:i/>
+          <w:color w:val="555555"/>
+          <w:sz w:val="22"/>
+        </w:rPr>
+        <w:t>[ W14 ]  Página Configurações — seleção de perfil de modelagem</w:t>
+      </w:r>
+    </w:p>
+    <w:p>
+      <w:pPr>
+        <w:spacing w:before="80" w:after="240"/>
+        <w:ind w:firstLine="0"/>
+        <w:jc w:val="center"/>
+      </w:pPr>
+      <w:r>
+        <w:rPr>
+          <w:rFonts w:ascii="Calibri" w:hAnsi="Calibri"/>
+          <w:b w:val="0"/>
+          <w:i/>
+          <w:color w:val="555555"/>
+          <w:sz w:val="20"/>
+        </w:rPr>
+        <w:t>Figura XX — Página Configurações com seleção do perfil Blender ou Python. Fonte: produção autoral (2026) Painel de configurações com alternância entre os perfis Blender 4.x e Python Puro.</w:t>
+      </w:r>
+    </w:p>
+    <w:p>
+      <w:pPr>
+        <w:spacing w:before="200" w:after="200"/>
+        <w:ind w:firstLine="0"/>
+        <w:jc w:val="center"/>
+        <w:shd w:val="clear" w:color="auto" w:fill="EFEFEF"/>
+        <w:pBdr>
+          <w:top w:val="single" w:sz="6" w:space="4" w:color="AAAAAA"/>
+          <w:left w:val="single" w:sz="6" w:space="4" w:color="AAAAAA"/>
+          <w:bottom w:val="single" w:sz="6" w:space="4" w:color="AAAAAA"/>
+          <w:right w:val="single" w:sz="6" w:space="4" w:color="AAAAAA"/>
+        </w:pBdr>
+      </w:pPr>
+      <w:r>
+        <w:rPr>
+          <w:rFonts w:ascii="Calibri" w:hAnsi="Calibri"/>
+          <w:b w:val="0"/>
+          <w:i/>
+          <w:color w:val="555555"/>
+          <w:sz w:val="22"/>
+        </w:rPr>
+        <w:t>[ W15 ]  Página Perfil de Usuário — preferências pessoais</w:t>
+      </w:r>
+    </w:p>
+    <w:p>
+      <w:pPr>
+        <w:spacing w:before="80" w:after="240"/>
+        <w:ind w:firstLine="0"/>
+        <w:jc w:val="center"/>
+      </w:pPr>
+      <w:r>
+        <w:rPr>
+          <w:rFonts w:ascii="Calibri" w:hAnsi="Calibri"/>
+          <w:b w:val="0"/>
+          <w:i/>
+          <w:color w:val="555555"/>
+          <w:sz w:val="20"/>
+        </w:rPr>
+        <w:t>Figura XX — Página Perfil de Usuário com preferências de configuração. Fonte: produção autoral (2026) Página de perfil com configurações de idioma, tema e notificações.</w:t>
       </w:r>
     </w:p>
     <w:p>
@@ -8941,7 +10128,7 @@
           <w:color w:val="00467F"/>
           <w:sz w:val="24"/>
         </w:rPr>
-        <w:t>6.2 Fluxo via Interface Web</w:t>
+        <w:t>6.2 Fluxo via Terminal</w:t>
       </w:r>
     </w:p>
     <w:p>
@@ -8957,7 +10144,48 @@
           <w:i w:val="0"/>
           <w:sz w:val="24"/>
         </w:rPr>
-        <w:t>Pré-requisito: backend rodando em localhost:3000; frontend em localhost:5173.</w:t>
+        <w:t>O fluxo terminal inicia com python bed_wizard.py na raiz do repositório. O wizard exibe um menu principal implementado com Rich, que organiza todas as operações disponíveis em uma interface numerada e colorida.</w:t>
+      </w:r>
+    </w:p>
+    <w:p>
+      <w:pPr>
+        <w:spacing w:before="200" w:after="200"/>
+        <w:ind w:firstLine="0"/>
+        <w:jc w:val="center"/>
+        <w:shd w:val="clear" w:color="auto" w:fill="EFEFEF"/>
+        <w:pBdr>
+          <w:top w:val="single" w:sz="6" w:space="4" w:color="AAAAAA"/>
+          <w:left w:val="single" w:sz="6" w:space="4" w:color="AAAAAA"/>
+          <w:bottom w:val="single" w:sz="6" w:space="4" w:color="AAAAAA"/>
+          <w:right w:val="single" w:sz="6" w:space="4" w:color="AAAAAA"/>
+        </w:pBdr>
+      </w:pPr>
+      <w:r>
+        <w:rPr>
+          <w:rFonts w:ascii="Calibri" w:hAnsi="Calibri"/>
+          <w:b w:val="0"/>
+          <w:i/>
+          <w:color w:val="555555"/>
+          <w:sz w:val="22"/>
+        </w:rPr>
+        <w:t>[ T1 ]  Menu principal do bed_wizard.py com opções numeradas</w:t>
+      </w:r>
+    </w:p>
+    <w:p>
+      <w:pPr>
+        <w:spacing w:before="80" w:after="240"/>
+        <w:ind w:firstLine="0"/>
+        <w:jc w:val="center"/>
+      </w:pPr>
+      <w:r>
+        <w:rPr>
+          <w:rFonts w:ascii="Calibri" w:hAnsi="Calibri"/>
+          <w:b w:val="0"/>
+          <w:i/>
+          <w:color w:val="555555"/>
+          <w:sz w:val="20"/>
+        </w:rPr>
+        <w:t>Figura XX — Menu principal do BEDFLOW-ATLAS no terminal. Fonte: produção autoral (2026) Terminal com menu Rich exibindo as opções numeradas de criação, compilação, geração e inspeção.</w:t>
       </w:r>
     </w:p>
     <w:p>
@@ -8973,7 +10201,89 @@
           <w:i w:val="0"/>
           <w:sz w:val="24"/>
         </w:rPr>
-        <w:t>cd backend &amp;&amp; python -m uvicorn app.main:app --reload --port 3000 cd frontend &amp;&amp; npm run dev</w:t>
+        <w:t>No modo interativo, o wizard conduz o usuário com perguntas sequenciais para cada bloco da DSL. Ao final, o arquivo .bed é montado e exibido para revisão antes do envio para compilação.</w:t>
+      </w:r>
+    </w:p>
+    <w:p>
+      <w:pPr>
+        <w:spacing w:before="200" w:after="200"/>
+        <w:ind w:firstLine="0"/>
+        <w:jc w:val="center"/>
+        <w:shd w:val="clear" w:color="auto" w:fill="EFEFEF"/>
+        <w:pBdr>
+          <w:top w:val="single" w:sz="6" w:space="4" w:color="AAAAAA"/>
+          <w:left w:val="single" w:sz="6" w:space="4" w:color="AAAAAA"/>
+          <w:bottom w:val="single" w:sz="6" w:space="4" w:color="AAAAAA"/>
+          <w:right w:val="single" w:sz="6" w:space="4" w:color="AAAAAA"/>
+        </w:pBdr>
+      </w:pPr>
+      <w:r>
+        <w:rPr>
+          <w:rFonts w:ascii="Calibri" w:hAnsi="Calibri"/>
+          <w:b w:val="0"/>
+          <w:i/>
+          <w:color w:val="555555"/>
+          <w:sz w:val="22"/>
+        </w:rPr>
+        <w:t>[ T2 ]  Wizard interativo — sequência de perguntas e respostas</w:t>
+      </w:r>
+    </w:p>
+    <w:p>
+      <w:pPr>
+        <w:spacing w:before="80" w:after="240"/>
+        <w:ind w:firstLine="0"/>
+        <w:jc w:val="center"/>
+      </w:pPr>
+      <w:r>
+        <w:rPr>
+          <w:rFonts w:ascii="Calibri" w:hAnsi="Calibri"/>
+          <w:b w:val="0"/>
+          <w:i/>
+          <w:color w:val="555555"/>
+          <w:sz w:val="20"/>
+        </w:rPr>
+        <w:t>Figura XX — Modo interativo do wizard guiando o preenchimento dos parâmetros. Fonte: produção autoral (2026) Terminal com pergunta do wizard, resposta do usuário e progressão para o próximo campo da DSL.</w:t>
+      </w:r>
+    </w:p>
+    <w:p>
+      <w:pPr>
+        <w:spacing w:before="200" w:after="200"/>
+        <w:ind w:firstLine="0"/>
+        <w:jc w:val="center"/>
+        <w:shd w:val="clear" w:color="auto" w:fill="EFEFEF"/>
+        <w:pBdr>
+          <w:top w:val="single" w:sz="6" w:space="4" w:color="AAAAAA"/>
+          <w:left w:val="single" w:sz="6" w:space="4" w:color="AAAAAA"/>
+          <w:bottom w:val="single" w:sz="6" w:space="4" w:color="AAAAAA"/>
+          <w:right w:val="single" w:sz="6" w:space="4" w:color="AAAAAA"/>
+        </w:pBdr>
+      </w:pPr>
+      <w:r>
+        <w:rPr>
+          <w:rFonts w:ascii="Calibri" w:hAnsi="Calibri"/>
+          <w:b w:val="0"/>
+          <w:i/>
+          <w:color w:val="555555"/>
+          <w:sz w:val="22"/>
+        </w:rPr>
+        <w:t>[ T3 ]  Arquivo .bed completo exibido no terminal</w:t>
+      </w:r>
+    </w:p>
+    <w:p>
+      <w:pPr>
+        <w:spacing w:before="80" w:after="240"/>
+        <w:ind w:firstLine="0"/>
+        <w:jc w:val="center"/>
+      </w:pPr>
+      <w:r>
+        <w:rPr>
+          <w:rFonts w:ascii="Calibri" w:hAnsi="Calibri"/>
+          <w:b w:val="0"/>
+          <w:i/>
+          <w:color w:val="555555"/>
+          <w:sz w:val="20"/>
+        </w:rPr>
+        <w:t>Figura XX — Arquivo .bed gerado pelo wizard com todos os blocos da DSL. Fonte: produção autoral (2026) Terminal exibindo o arquivo .bed completo com todos os blocos preenchidos e opção de confirmação antes da compilação.</w:t>
       </w:r>
     </w:p>
     <w:p>
@@ -8989,7 +10299,89 @@
           <w:i w:val="0"/>
           <w:sz w:val="24"/>
         </w:rPr>
-        <w:t>Passo 1 — Criar o leito: abrir http://localhost:5173, clicar em "Criar Leito", preencher (D=5cm, H=10cm, esferas de 5mm, 100 partículas, hexagonal_3d, laminar) e clicar em "Gerar Leito".</w:t>
+        <w:t>A compilação é executada com bedc compile cases/meu_leito.bed, gerando params.json, hash SHA-256 e report.txt em uma única chamada.</w:t>
+      </w:r>
+    </w:p>
+    <w:p>
+      <w:pPr>
+        <w:spacing w:before="200" w:after="200"/>
+        <w:ind w:firstLine="0"/>
+        <w:jc w:val="center"/>
+        <w:shd w:val="clear" w:color="auto" w:fill="EFEFEF"/>
+        <w:pBdr>
+          <w:top w:val="single" w:sz="6" w:space="4" w:color="AAAAAA"/>
+          <w:left w:val="single" w:sz="6" w:space="4" w:color="AAAAAA"/>
+          <w:bottom w:val="single" w:sz="6" w:space="4" w:color="AAAAAA"/>
+          <w:right w:val="single" w:sz="6" w:space="4" w:color="AAAAAA"/>
+        </w:pBdr>
+      </w:pPr>
+      <w:r>
+        <w:rPr>
+          <w:rFonts w:ascii="Calibri" w:hAnsi="Calibri"/>
+          <w:b w:val="0"/>
+          <w:i/>
+          <w:color w:val="555555"/>
+          <w:sz w:val="22"/>
+        </w:rPr>
+        <w:t>[ T4 ]  Compilação bem-sucedida — params.json e hash SHA-256 exibidos</w:t>
+      </w:r>
+    </w:p>
+    <w:p>
+      <w:pPr>
+        <w:spacing w:before="80" w:after="240"/>
+        <w:ind w:firstLine="0"/>
+        <w:jc w:val="center"/>
+      </w:pPr>
+      <w:r>
+        <w:rPr>
+          <w:rFonts w:ascii="Calibri" w:hAnsi="Calibri"/>
+          <w:b w:val="0"/>
+          <w:i/>
+          <w:color w:val="555555"/>
+          <w:sz w:val="20"/>
+        </w:rPr>
+        <w:t>Figura XX — Saída do compilador ANTLR ao processar um arquivo .bed válido. Fonte: produção autoral (2026) Terminal com saída de compilação bem-sucedida, hash SHA-256 e caminho do params.json gerado.</w:t>
+      </w:r>
+    </w:p>
+    <w:p>
+      <w:pPr>
+        <w:spacing w:before="200" w:after="200"/>
+        <w:ind w:firstLine="0"/>
+        <w:jc w:val="center"/>
+        <w:shd w:val="clear" w:color="auto" w:fill="EFEFEF"/>
+        <w:pBdr>
+          <w:top w:val="single" w:sz="6" w:space="4" w:color="AAAAAA"/>
+          <w:left w:val="single" w:sz="6" w:space="4" w:color="AAAAAA"/>
+          <w:bottom w:val="single" w:sz="6" w:space="4" w:color="AAAAAA"/>
+          <w:right w:val="single" w:sz="6" w:space="4" w:color="AAAAAA"/>
+        </w:pBdr>
+      </w:pPr>
+      <w:r>
+        <w:rPr>
+          <w:rFonts w:ascii="Calibri" w:hAnsi="Calibri"/>
+          <w:b w:val="0"/>
+          <w:i/>
+          <w:color w:val="555555"/>
+          <w:sz w:val="22"/>
+        </w:rPr>
+        <w:t>[ T5 ]  Compilação com erro intencional — número de linha e correção</w:t>
+      </w:r>
+    </w:p>
+    <w:p>
+      <w:pPr>
+        <w:spacing w:before="80" w:after="240"/>
+        <w:ind w:firstLine="0"/>
+        <w:jc w:val="center"/>
+      </w:pPr>
+      <w:r>
+        <w:rPr>
+          <w:rFonts w:ascii="Calibri" w:hAnsi="Calibri"/>
+          <w:b w:val="0"/>
+          <w:i/>
+          <w:color w:val="555555"/>
+          <w:sz w:val="20"/>
+        </w:rPr>
+        <w:t>Figura XX — Mensagem de erro do compilador com indicação de linha e correção. Fonte: produção autoral (2026) Terminal com mensagem de erro do compilador ANTLR indicando a linha, o tipo de erro e a sugestão de correção.</w:t>
       </w:r>
     </w:p>
     <w:p>
@@ -9005,7 +10397,89 @@
           <w:i w:val="0"/>
           <w:sz w:val="24"/>
         </w:rPr>
-        <w:t>Passo 2 — Acompanhar o job: o sistema exibe status queued → running → completed com barra de progresso e logs em tempo real. O job_id é retornado imediatamente.</w:t>
+        <w:t>A geração segue com bedc generate ou bedc pipeline cases/meu_leito.bed, selecionando automaticamente o perfil de modelagem configurado.</w:t>
+      </w:r>
+    </w:p>
+    <w:p>
+      <w:pPr>
+        <w:spacing w:before="200" w:after="200"/>
+        <w:ind w:firstLine="0"/>
+        <w:jc w:val="center"/>
+        <w:shd w:val="clear" w:color="auto" w:fill="EFEFEF"/>
+        <w:pBdr>
+          <w:top w:val="single" w:sz="6" w:space="4" w:color="AAAAAA"/>
+          <w:left w:val="single" w:sz="6" w:space="4" w:color="AAAAAA"/>
+          <w:bottom w:val="single" w:sz="6" w:space="4" w:color="AAAAAA"/>
+          <w:right w:val="single" w:sz="6" w:space="4" w:color="AAAAAA"/>
+        </w:pBdr>
+      </w:pPr>
+      <w:r>
+        <w:rPr>
+          <w:rFonts w:ascii="Calibri" w:hAnsi="Calibri"/>
+          <w:b w:val="0"/>
+          <w:i/>
+          <w:color w:val="555555"/>
+          <w:sz w:val="22"/>
+        </w:rPr>
+        <w:t>[ T6 ]  Geração 3D em execução — saída de progresso por etapa</w:t>
+      </w:r>
+    </w:p>
+    <w:p>
+      <w:pPr>
+        <w:spacing w:before="80" w:after="240"/>
+        <w:ind w:firstLine="0"/>
+        <w:jc w:val="center"/>
+      </w:pPr>
+      <w:r>
+        <w:rPr>
+          <w:rFonts w:ascii="Calibri" w:hAnsi="Calibri"/>
+          <w:b w:val="0"/>
+          <w:i/>
+          <w:color w:val="555555"/>
+          <w:sz w:val="20"/>
+        </w:rPr>
+        <w:t>Figura XX — Motor de geração em execução com saída de progresso. Fonte: produção autoral (2026) Terminal com saída passo a passo do motor de geração: criação do cilindro, empacotamento, validação e exportação STL.</w:t>
+      </w:r>
+    </w:p>
+    <w:p>
+      <w:pPr>
+        <w:spacing w:before="200" w:after="200"/>
+        <w:ind w:firstLine="0"/>
+        <w:jc w:val="center"/>
+        <w:shd w:val="clear" w:color="auto" w:fill="EFEFEF"/>
+        <w:pBdr>
+          <w:top w:val="single" w:sz="6" w:space="4" w:color="AAAAAA"/>
+          <w:left w:val="single" w:sz="6" w:space="4" w:color="AAAAAA"/>
+          <w:bottom w:val="single" w:sz="6" w:space="4" w:color="AAAAAA"/>
+          <w:right w:val="single" w:sz="6" w:space="4" w:color="AAAAAA"/>
+        </w:pBdr>
+      </w:pPr>
+      <w:r>
+        <w:rPr>
+          <w:rFonts w:ascii="Calibri" w:hAnsi="Calibri"/>
+          <w:b w:val="0"/>
+          <w:i/>
+          <w:color w:val="555555"/>
+          <w:sz w:val="22"/>
+        </w:rPr>
+        <w:t>[ T7 ]  Diretório runs/&lt;hash&gt;/ com árvore de artefatos gerados</w:t>
+      </w:r>
+    </w:p>
+    <w:p>
+      <w:pPr>
+        <w:spacing w:before="80" w:after="240"/>
+        <w:ind w:firstLine="0"/>
+        <w:jc w:val="center"/>
+      </w:pPr>
+      <w:r>
+        <w:rPr>
+          <w:rFonts w:ascii="Calibri" w:hAnsi="Calibri"/>
+          <w:b w:val="0"/>
+          <w:i/>
+          <w:color w:val="555555"/>
+          <w:sz w:val="20"/>
+        </w:rPr>
+        <w:t>Figura XX — Estrutura de diretório com STL, OBJ, JSON e report após geração. Fonte: produção autoral (2026) Terminal com saída de tree mostrando a estrutura runs/&lt;hash&gt;/ contendo os artefatos da execução.</w:t>
       </w:r>
     </w:p>
     <w:p>
@@ -9021,7 +10495,145 @@
           <w:i w:val="0"/>
           <w:sz w:val="24"/>
         </w:rPr>
-        <w:t>Passo 3 — Visualizar o modelo: na tela de Resultados, o STL aparece com metadados (tamanho, data, hash). Clicar em "Visualizar" abre o render 3D interativo em Three.js.</w:t>
+        <w:t>O sistema de corte 3D permite inspecionar o interior do leito sem software externo, produzindo a geometria pseudo-2D a partir de parâmetros de eixo, posição e espessura.</w:t>
+      </w:r>
+    </w:p>
+    <w:p>
+      <w:pPr>
+        <w:spacing w:before="200" w:after="200"/>
+        <w:ind w:firstLine="0"/>
+        <w:jc w:val="center"/>
+        <w:shd w:val="clear" w:color="auto" w:fill="EFEFEF"/>
+        <w:pBdr>
+          <w:top w:val="single" w:sz="6" w:space="4" w:color="AAAAAA"/>
+          <w:left w:val="single" w:sz="6" w:space="4" w:color="AAAAAA"/>
+          <w:bottom w:val="single" w:sz="6" w:space="4" w:color="AAAAAA"/>
+          <w:right w:val="single" w:sz="6" w:space="4" w:color="AAAAAA"/>
+        </w:pBdr>
+      </w:pPr>
+      <w:r>
+        <w:rPr>
+          <w:rFonts w:ascii="Calibri" w:hAnsi="Calibri"/>
+          <w:b w:val="0"/>
+          <w:i/>
+          <w:color w:val="555555"/>
+          <w:sz w:val="22"/>
+        </w:rPr>
+        <w:t>[ T8 ]  Corte 3D via terminal — eixo, posição, espessura e artefatos de saída</w:t>
+      </w:r>
+    </w:p>
+    <w:p>
+      <w:pPr>
+        <w:spacing w:before="80" w:after="240"/>
+        <w:ind w:firstLine="0"/>
+        <w:jc w:val="center"/>
+      </w:pPr>
+      <w:r>
+        <w:rPr>
+          <w:rFonts w:ascii="Calibri" w:hAnsi="Calibri"/>
+          <w:b w:val="0"/>
+          <w:i/>
+          <w:color w:val="555555"/>
+          <w:sz w:val="20"/>
+        </w:rPr>
+        <w:t>Figura XX — Execução do corte 3D paramétrico com saída dos artefatos. Fonte: produção autoral (2026) Terminal com comando de corte, parâmetros de eixo/espessura e confirmação de geração do STL da fatia.</w:t>
+      </w:r>
+    </w:p>
+    <w:p>
+      <w:pPr>
+        <w:spacing w:before="200" w:after="200"/>
+        <w:ind w:firstLine="0"/>
+        <w:jc w:val="center"/>
+        <w:shd w:val="clear" w:color="auto" w:fill="EFEFEF"/>
+        <w:pBdr>
+          <w:top w:val="single" w:sz="6" w:space="4" w:color="AAAAAA"/>
+          <w:left w:val="single" w:sz="6" w:space="4" w:color="AAAAAA"/>
+          <w:bottom w:val="single" w:sz="6" w:space="4" w:color="AAAAAA"/>
+          <w:right w:val="single" w:sz="6" w:space="4" w:color="AAAAAA"/>
+        </w:pBdr>
+      </w:pPr>
+      <w:r>
+        <w:rPr>
+          <w:rFonts w:ascii="Calibri" w:hAnsi="Calibri"/>
+          <w:b w:val="0"/>
+          <w:i/>
+          <w:color w:val="555555"/>
+          <w:sz w:val="22"/>
+        </w:rPr>
+        <w:t>[ T9 ]  Visualizador desktop open3d — leito empacotado completo</w:t>
+      </w:r>
+    </w:p>
+    <w:p>
+      <w:pPr>
+        <w:spacing w:before="80" w:after="240"/>
+        <w:ind w:firstLine="0"/>
+        <w:jc w:val="center"/>
+      </w:pPr>
+      <w:r>
+        <w:rPr>
+          <w:rFonts w:ascii="Calibri" w:hAnsi="Calibri"/>
+          <w:b w:val="0"/>
+          <w:i/>
+          <w:color w:val="555555"/>
+          <w:sz w:val="20"/>
+        </w:rPr>
+        <w:t>Figura XX — Leito empacotado completo no visualizador desktop open3d. Fonte: produção autoral (2026) Janela do visualizador desktop com o leito empacotado completo e controles de câmera.</w:t>
+      </w:r>
+    </w:p>
+    <w:p>
+      <w:pPr>
+        <w:spacing w:before="200" w:after="200"/>
+        <w:ind w:firstLine="0"/>
+        <w:jc w:val="center"/>
+        <w:shd w:val="clear" w:color="auto" w:fill="EFEFEF"/>
+        <w:pBdr>
+          <w:top w:val="single" w:sz="6" w:space="4" w:color="AAAAAA"/>
+          <w:left w:val="single" w:sz="6" w:space="4" w:color="AAAAAA"/>
+          <w:bottom w:val="single" w:sz="6" w:space="4" w:color="AAAAAA"/>
+          <w:right w:val="single" w:sz="6" w:space="4" w:color="AAAAAA"/>
+        </w:pBdr>
+      </w:pPr>
+      <w:r>
+        <w:rPr>
+          <w:rFonts w:ascii="Calibri" w:hAnsi="Calibri"/>
+          <w:b w:val="0"/>
+          <w:i/>
+          <w:color w:val="555555"/>
+          <w:sz w:val="22"/>
+        </w:rPr>
+        <w:t>[ T10 ]  Visualizador desktop — seção transversal do leito após corte 3D</w:t>
+      </w:r>
+    </w:p>
+    <w:p>
+      <w:pPr>
+        <w:spacing w:before="80" w:after="240"/>
+        <w:ind w:firstLine="0"/>
+        <w:jc w:val="center"/>
+      </w:pPr>
+      <w:r>
+        <w:rPr>
+          <w:rFonts w:ascii="Calibri" w:hAnsi="Calibri"/>
+          <w:b w:val="0"/>
+          <w:i/>
+          <w:color w:val="555555"/>
+          <w:sz w:val="20"/>
+        </w:rPr>
+        <w:t>Figura XX — Seção transversal renderizada no open3d após operação de corte. Fonte: produção autoral (2026) Janela do visualizador desktop com a seção transversal do leito, mostrando a distribuição das partículas no plano de corte.</w:t>
+      </w:r>
+    </w:p>
+    <w:p>
+      <w:pPr>
+        <w:pStyle w:val="Heading3"/>
+        <w:ind w:firstLine="0"/>
+      </w:pPr>
+      <w:r>
+        <w:rPr>
+          <w:rFonts w:ascii="Calibri" w:hAnsi="Calibri"/>
+          <w:b/>
+          <w:color w:val="00467F"/>
+          <w:sz w:val="24"/>
+        </w:rPr>
+        <w:t>6.3 Pipeline Completo: da DSL ao Artefato Final</w:t>
       </w:r>
     </w:p>
     <w:p>
@@ -9037,7 +10649,7 @@
           <w:i w:val="0"/>
           <w:sz w:val="24"/>
         </w:rPr>
-        <w:t>Passo 4 — Exportar: o STL está disponível para download via link ou via GET /files/models_3d/{filename}. O caso OpenFOAM gerado está em generated/cfd/ e pode ser aberto no ParaView carregando o arquivo .foam.</w:t>
+        <w:t>O pipeline transforma o arquivo .bed em params.json canônico com hash SHA-256, que alimenta a geração geométrica (STL + sidecar JSON). O artefato resultante é indexado pelo PostgreSQL e disponibilizado via MinIO, e então consumido pelo dashboard para visualização e download. Qualquer modificação nos parâmetros produz um novo hash, criando uma execução rastreável e comparável às anteriores. O resultado é um artefato auditável de ponta a ponta: da descrição declarativa em linguagem de domínio específica ao arquivo de malha pronto para solver externo.</w:t>
       </w:r>
     </w:p>
     <w:p>
@@ -9052,7 +10664,7 @@
           <w:color w:val="00467F"/>
           <w:sz w:val="24"/>
         </w:rPr>
-        <w:t>6.3 Fluxo via CLI Wizard</w:t>
+        <w:t>6.4 Reprodutibilidade: Seed e Hash em Ação</w:t>
       </w:r>
     </w:p>
     <w:p>
@@ -9068,7 +10680,171 @@
           <w:i w:val="0"/>
           <w:sz w:val="24"/>
         </w:rPr>
-        <w:t>Modo interativo: cd /home/user/BEDFLOW-ATLAS-TCC-2 python3 -m cli generate (o wizard pergunta: diâmetro, altura, tipo de partícula, diâmetro, contagem, método de packing, seed; ao final, confirma e gera o STL)</w:t>
+        <w:t>No perfil Python, a reprodutibilidade é matematicamente garantida: as funções uv_sphere, cylinder_axis e write_stl_binary são determinísticas dado o mesmo conjunto de parâmetros e a mesma seed. O hash SHA-256 do STL binário resultante é idêntico entre execuções. A política de idempotência no backend bloqueia submissões com hash repetido, preservando a integridade do histórico.</w:t>
+      </w:r>
+    </w:p>
+    <w:p>
+      <w:pPr>
+        <w:spacing w:before="200" w:after="200"/>
+        <w:ind w:firstLine="0"/>
+        <w:jc w:val="center"/>
+        <w:shd w:val="clear" w:color="auto" w:fill="EFEFEF"/>
+        <w:pBdr>
+          <w:top w:val="single" w:sz="6" w:space="4" w:color="AAAAAA"/>
+          <w:left w:val="single" w:sz="6" w:space="4" w:color="AAAAAA"/>
+          <w:bottom w:val="single" w:sz="6" w:space="4" w:color="AAAAAA"/>
+          <w:right w:val="single" w:sz="6" w:space="4" w:color="AAAAAA"/>
+        </w:pBdr>
+      </w:pPr>
+      <w:r>
+        <w:rPr>
+          <w:rFonts w:ascii="Calibri" w:hAnsi="Calibri"/>
+          <w:b w:val="0"/>
+          <w:i/>
+          <w:color w:val="555555"/>
+          <w:sz w:val="22"/>
+        </w:rPr>
+        <w:t>[ R1 ]  Duas execuções com mesma seed — hashes idênticos no histórico</w:t>
+      </w:r>
+    </w:p>
+    <w:p>
+      <w:pPr>
+        <w:spacing w:before="80" w:after="240"/>
+        <w:ind w:firstLine="0"/>
+        <w:jc w:val="center"/>
+      </w:pPr>
+      <w:r>
+        <w:rPr>
+          <w:rFonts w:ascii="Calibri" w:hAnsi="Calibri"/>
+          <w:b w:val="0"/>
+          <w:i/>
+          <w:color w:val="555555"/>
+          <w:sz w:val="20"/>
+        </w:rPr>
+        <w:t>Figura XX — Mesma seed produz mesmo hash e mesma geometria. Fonte: produção autoral (2026) Histórico com duas execuções de mesma seed exibindo hashes SHA-256 idênticos.</w:t>
+      </w:r>
+    </w:p>
+    <w:p>
+      <w:pPr>
+        <w:spacing w:before="200" w:after="200"/>
+        <w:ind w:firstLine="0"/>
+        <w:jc w:val="center"/>
+        <w:shd w:val="clear" w:color="auto" w:fill="EFEFEF"/>
+        <w:pBdr>
+          <w:top w:val="single" w:sz="6" w:space="4" w:color="AAAAAA"/>
+          <w:left w:val="single" w:sz="6" w:space="4" w:color="AAAAAA"/>
+          <w:bottom w:val="single" w:sz="6" w:space="4" w:color="AAAAAA"/>
+          <w:right w:val="single" w:sz="6" w:space="4" w:color="AAAAAA"/>
+        </w:pBdr>
+      </w:pPr>
+      <w:r>
+        <w:rPr>
+          <w:rFonts w:ascii="Calibri" w:hAnsi="Calibri"/>
+          <w:b w:val="0"/>
+          <w:i/>
+          <w:color w:val="555555"/>
+          <w:sz w:val="22"/>
+        </w:rPr>
+        <w:t>[ R2 ]  Duas execuções com seeds diferentes — hashes distintos</w:t>
+      </w:r>
+    </w:p>
+    <w:p>
+      <w:pPr>
+        <w:spacing w:before="80" w:after="240"/>
+        <w:ind w:firstLine="0"/>
+        <w:jc w:val="center"/>
+      </w:pPr>
+      <w:r>
+        <w:rPr>
+          <w:rFonts w:ascii="Calibri" w:hAnsi="Calibri"/>
+          <w:b w:val="0"/>
+          <w:i/>
+          <w:color w:val="555555"/>
+          <w:sz w:val="20"/>
+        </w:rPr>
+        <w:t>Figura XX — Seeds diferentes produzem hashes e geometrias distintos. Fonte: produção autoral (2026) Histórico com duas execuções de seeds diferentes, evidenciando hashes e porosidades distintos.</w:t>
+      </w:r>
+    </w:p>
+    <w:p>
+      <w:pPr>
+        <w:spacing w:before="200" w:after="200"/>
+        <w:ind w:firstLine="0"/>
+        <w:jc w:val="center"/>
+        <w:shd w:val="clear" w:color="auto" w:fill="EFEFEF"/>
+        <w:pBdr>
+          <w:top w:val="single" w:sz="6" w:space="4" w:color="AAAAAA"/>
+          <w:left w:val="single" w:sz="6" w:space="4" w:color="AAAAAA"/>
+          <w:bottom w:val="single" w:sz="6" w:space="4" w:color="AAAAAA"/>
+          <w:right w:val="single" w:sz="6" w:space="4" w:color="AAAAAA"/>
+        </w:pBdr>
+      </w:pPr>
+      <w:r>
+        <w:rPr>
+          <w:rFonts w:ascii="Calibri" w:hAnsi="Calibri"/>
+          <w:b w:val="0"/>
+          <w:i/>
+          <w:color w:val="555555"/>
+          <w:sz w:val="22"/>
+        </w:rPr>
+        <w:t>[ R3 ]  Sidecar JSON — geometry_mode, seed, hash, porosity_result</w:t>
+      </w:r>
+    </w:p>
+    <w:p>
+      <w:pPr>
+        <w:spacing w:before="80" w:after="240"/>
+        <w:ind w:firstLine="0"/>
+        <w:jc w:val="center"/>
+      </w:pPr>
+      <w:r>
+        <w:rPr>
+          <w:rFonts w:ascii="Calibri" w:hAnsi="Calibri"/>
+          <w:b w:val="0"/>
+          <w:i/>
+          <w:color w:val="555555"/>
+          <w:sz w:val="20"/>
+        </w:rPr>
+        <w:t>Figura XX — Sidecar JSON com metadados completos de uma malha gerada. Fonte: produção autoral (2026) Conteúdo do arquivo sidecar JSON com campos geometry_mode, seed, hash SHA-256 e porosity_result.</w:t>
+      </w:r>
+    </w:p>
+    <w:p>
+      <w:pPr>
+        <w:spacing w:before="200" w:after="200"/>
+        <w:ind w:firstLine="0"/>
+        <w:jc w:val="center"/>
+        <w:shd w:val="clear" w:color="auto" w:fill="EFEFEF"/>
+        <w:pBdr>
+          <w:top w:val="single" w:sz="6" w:space="4" w:color="AAAAAA"/>
+          <w:left w:val="single" w:sz="6" w:space="4" w:color="AAAAAA"/>
+          <w:bottom w:val="single" w:sz="6" w:space="4" w:color="AAAAAA"/>
+          <w:right w:val="single" w:sz="6" w:space="4" w:color="AAAAAA"/>
+        </w:pBdr>
+      </w:pPr>
+      <w:r>
+        <w:rPr>
+          <w:rFonts w:ascii="Calibri" w:hAnsi="Calibri"/>
+          <w:b w:val="0"/>
+          <w:i/>
+          <w:color w:val="555555"/>
+          <w:sz w:val="22"/>
+        </w:rPr>
+        <w:t>[ R4 ]  Download do STL via dashboard — botão e confirmação de arquivo</w:t>
+      </w:r>
+    </w:p>
+    <w:p>
+      <w:pPr>
+        <w:spacing w:before="80" w:after="240"/>
+        <w:ind w:firstLine="0"/>
+        <w:jc w:val="center"/>
+      </w:pPr>
+      <w:r>
+        <w:rPr>
+          <w:rFonts w:ascii="Calibri" w:hAnsi="Calibri"/>
+          <w:b w:val="0"/>
+          <w:i/>
+          <w:color w:val="555555"/>
+          <w:sz w:val="20"/>
+        </w:rPr>
+        <w:t>Figura XX — Download do STL via interface web para uso em solver externo. Fonte: produção autoral (2026) Dashboard com botão de download do STL e confirmação de arquivo recebido no sistema de arquivos local.</w:t>
       </w:r>
     </w:p>
     <w:p>
@@ -9084,261 +10860,7 @@
           <w:i w:val="0"/>
           <w:sz w:val="24"/>
         </w:rPr>
-        <w:t>Modo headless (automação): python3 -m cli --load-json dsl/_test_hex.bed.json --pure-python --no-prompt (carrega .bed.json existente, usa Python puro, gera STL sem interação)</w:t>
-      </w:r>
-    </w:p>
-    <w:p>
-      <w:pPr>
-        <w:spacing w:before="0" w:after="120"/>
-        <w:ind w:firstLine="709"/>
-        <w:jc w:val="both"/>
-      </w:pPr>
-      <w:r>
-        <w:rPr>
-          <w:rFonts w:ascii="Calibri" w:hAnsi="Calibri"/>
-          <w:b w:val="0"/>
-          <w:i w:val="0"/>
-          <w:sz w:val="24"/>
-        </w:rPr>
-        <w:t>Fluxo típico de inspeção do artefato: ls -la dsl/*.stl dsl/*_pure_bed.json python3 -c "import json; d=json.load(open('SIDECAR.json')); \ print(d['n_particles'], d['porosity_estimate'], d['validation_ok'])"</w:t>
-      </w:r>
-    </w:p>
-    <w:p>
-      <w:pPr>
-        <w:pStyle w:val="Heading3"/>
-        <w:ind w:firstLine="0"/>
-      </w:pPr>
-      <w:r>
-        <w:rPr>
-          <w:rFonts w:ascii="Calibri" w:hAnsi="Calibri"/>
-          <w:b/>
-          <w:color w:val="00467F"/>
-          <w:sz w:val="24"/>
-        </w:rPr>
-        <w:t>6.4 Criação e Edição do Arquivo .bed</w:t>
-      </w:r>
-    </w:p>
-    <w:p>
-      <w:pPr>
-        <w:spacing w:before="0" w:after="120"/>
-        <w:ind w:firstLine="709"/>
-        <w:jc w:val="both"/>
-      </w:pPr>
-      <w:r>
-        <w:rPr>
-          <w:rFonts w:ascii="Calibri" w:hAnsi="Calibri"/>
-          <w:b w:val="0"/>
-          <w:i w:val="0"/>
-          <w:sz w:val="24"/>
-        </w:rPr>
-        <w:t>Exemplo de .bed para leito pseudo-2D com corte fino (dsl/examples/leito_pseudo2d_slice.bed):</w:t>
-      </w:r>
-    </w:p>
-    <w:p>
-      <w:pPr>
-        <w:spacing w:before="0" w:after="120"/>
-        <w:ind w:firstLine="709"/>
-        <w:jc w:val="both"/>
-      </w:pPr>
-      <w:r>
-        <w:rPr>
-          <w:rFonts w:ascii="Calibri" w:hAnsi="Calibri"/>
-          <w:b w:val="0"/>
-          <w:i w:val="0"/>
-          <w:sz w:val="24"/>
-        </w:rPr>
-        <w:t>bed { diameter = 5cm height = 8cm wall_thickness = 2mm internal_cylinder_mode = hollow_boolean_applied } particles { kind = "sphere"; diameter = 2mm; count = 40; seed = 42 } packing   { method = "hexagonal_3d" } geometry  { mode = pseudo_2d_thin_slice } generation{ backend = python_engine } slice     { enabled = true; axis = "y"; thickness = 0.002m } export    { formats = [stl_binary] }</w:t>
-      </w:r>
-    </w:p>
-    <w:p>
-      <w:pPr>
-        <w:pStyle w:val="Heading3"/>
-        <w:ind w:firstLine="0"/>
-      </w:pPr>
-      <w:r>
-        <w:rPr>
-          <w:rFonts w:ascii="Calibri" w:hAnsi="Calibri"/>
-          <w:b/>
-          <w:color w:val="00467F"/>
-          <w:sz w:val="24"/>
-        </w:rPr>
-        <w:t>6.5 Visualização do Corte 2D (Desktop)</w:t>
-      </w:r>
-    </w:p>
-    <w:p>
-      <w:pPr>
-        <w:spacing w:before="0" w:after="120"/>
-        <w:ind w:firstLine="709"/>
-        <w:jc w:val="both"/>
-      </w:pPr>
-      <w:r>
-        <w:rPr>
-          <w:rFonts w:ascii="Calibri" w:hAnsi="Calibri"/>
-          <w:b w:val="0"/>
-          <w:i w:val="0"/>
-          <w:sz w:val="24"/>
-        </w:rPr>
-        <w:t>Após gerar o leito com slice.enabled, o STL de fatia está disponível em: scripts/python_modeling/_tmp_slice.stl</w:t>
-      </w:r>
-    </w:p>
-    <w:p>
-      <w:pPr>
-        <w:spacing w:before="0" w:after="120"/>
-        <w:ind w:firstLine="709"/>
-        <w:jc w:val="both"/>
-      </w:pPr>
-      <w:r>
-        <w:rPr>
-          <w:rFonts w:ascii="Calibri" w:hAnsi="Calibri"/>
-          <w:b w:val="0"/>
-          <w:i w:val="0"/>
-          <w:sz w:val="24"/>
-        </w:rPr>
-        <w:t>Para inspecionar com o viewer desktop: python3 scripts/python_modeling/mesh_viewer/scientific_app.py --stl FILE.stl</w:t>
-      </w:r>
-    </w:p>
-    <w:p>
-      <w:pPr>
-        <w:spacing w:before="0" w:after="120"/>
-        <w:ind w:firstLine="709"/>
-        <w:jc w:val="both"/>
-      </w:pPr>
-      <w:r>
-        <w:rPr>
-          <w:rFonts w:ascii="Calibri" w:hAnsi="Calibri"/>
-          <w:b w:val="0"/>
-          <w:i w:val="0"/>
-          <w:sz w:val="24"/>
-        </w:rPr>
-        <w:t>O CutController permite ajustar o plano de corte interativamente via crop_mesh_slab(), exibindo a seção transversal do leito.</w:t>
-      </w:r>
-    </w:p>
-    <w:p>
-      <w:pPr>
-        <w:pStyle w:val="Heading3"/>
-        <w:ind w:firstLine="0"/>
-      </w:pPr>
-      <w:r>
-        <w:rPr>
-          <w:rFonts w:ascii="Calibri" w:hAnsi="Calibri"/>
-          <w:b/>
-          <w:color w:val="00467F"/>
-          <w:sz w:val="24"/>
-        </w:rPr>
-        <w:t>6.6 Cenários de Demonstração para a Banca</w:t>
-      </w:r>
-    </w:p>
-    <w:p>
-      <w:pPr>
-        <w:spacing w:before="0" w:after="60"/>
-        <w:ind w:hanging="283" w:left="992"/>
-        <w:jc w:val="both"/>
-      </w:pPr>
-      <w:r>
-        <w:rPr>
-          <w:rFonts w:ascii="Calibri" w:hAnsi="Calibri"/>
-          <w:b w:val="0"/>
-          <w:i w:val="0"/>
-          <w:sz w:val="24"/>
-        </w:rPr>
-        <w:t>D1 — Fluxo Completo via Web (5 min): criar leito no formulário → acompanhar job → visualizar 3D em Three.js. Enfatizar: zero linhas de código.</w:t>
-      </w:r>
-    </w:p>
-    <w:p>
-      <w:pPr>
-        <w:spacing w:before="0" w:after="60"/>
-        <w:ind w:hanging="283" w:left="992"/>
-        <w:jc w:val="both"/>
-      </w:pPr>
-      <w:r>
-        <w:rPr>
-          <w:rFonts w:ascii="Calibri" w:hAnsi="Calibri"/>
-          <w:b w:val="0"/>
-          <w:i w:val="0"/>
-          <w:sz w:val="24"/>
-        </w:rPr>
-        <w:t>D2 — Reprodutibilidade (3 min): rodar o mesmo .bed.json duas vezes com a mesma seed → comparar hashes SHA-256 dos STLs → mostrar sidecar com seed.</w:t>
-      </w:r>
-    </w:p>
-    <w:p>
-      <w:pPr>
-        <w:spacing w:before="0" w:after="60"/>
-        <w:ind w:hanging="283" w:left="992"/>
-        <w:jc w:val="both"/>
-      </w:pPr>
-      <w:r>
-        <w:rPr>
-          <w:rFonts w:ascii="Calibri" w:hAnsi="Calibri"/>
-          <w:b w:val="0"/>
-          <w:i w:val="0"/>
-          <w:sz w:val="24"/>
-        </w:rPr>
-        <w:t>D3 — Corte 2D / Pseudo-2D (5 min): gerar leito_pseudo2d_slice.bed → mostrar o STL da fatia (discos no plano) → exibir a porosidade 2D calculada → abrir no visualizador desktop com CutController.</w:t>
-      </w:r>
-    </w:p>
-    <w:p>
-      <w:pPr>
-        <w:spacing w:before="0" w:after="60"/>
-        <w:ind w:hanging="283" w:left="992"/>
-        <w:jc w:val="both"/>
-      </w:pPr>
-      <w:r>
-        <w:rPr>
-          <w:rFonts w:ascii="Calibri" w:hAnsi="Calibri"/>
-          <w:b w:val="0"/>
-          <w:i w:val="0"/>
-          <w:sz w:val="24"/>
-        </w:rPr>
-        <w:t>D4 — Testes Automatizados (3 min): executar pytest, mostrar 89 testes passando. Destacar test_thin_slice_algorithm.py (raio aparente, descarte) e test_packing_seed.py (determinismo).</w:t>
-      </w:r>
-    </w:p>
-    <w:p>
-      <w:pPr>
-        <w:spacing w:before="0" w:after="60"/>
-        <w:ind w:hanging="283" w:left="992"/>
-        <w:jc w:val="both"/>
-      </w:pPr>
-      <w:r>
-        <w:rPr>
-          <w:rFonts w:ascii="Calibri" w:hAnsi="Calibri"/>
-          <w:b w:val="0"/>
-          <w:i w:val="0"/>
-          <w:sz w:val="24"/>
-        </w:rPr>
-        <w:t>D5 — Rastreabilidade (2 min): mostrar sidecar JSON → apontar hash, seed, n_particles, validation_ok → explicar que qualquer STL pode ser reproduzido a partir do sidecar + .bed.json.</w:t>
-      </w:r>
-    </w:p>
-    <w:p>
-      <w:pPr>
-        <w:spacing w:before="40" w:after="160"/>
-        <w:ind w:firstLine="0" w:left="709"/>
-        <w:jc w:val="both"/>
-      </w:pPr>
-      <w:r>
-        <w:rPr>
-          <w:rFonts w:ascii="Calibri" w:hAnsi="Calibri"/>
-          <w:b w:val="0"/>
-          <w:i w:val="0"/>
-          <w:color w:val="555555"/>
-          <w:sz w:val="20"/>
-        </w:rPr>
-        <w:t>Observação para a banca: usar _test_hex.bed com backend=python_engine para demonstrações rápidas sem Blender. Para o corte, usar leito_pseudo2d_slice.bed.</w:t>
-      </w:r>
-    </w:p>
-    <w:p>
-      <w:pPr>
-        <w:spacing w:before="0" w:after="120"/>
-        <w:ind w:firstLine="709"/>
-        <w:jc w:val="both"/>
-      </w:pPr>
-      <w:r>
-        <w:rPr>
-          <w:rFonts w:ascii="Calibri" w:hAnsi="Calibri"/>
-          <w:b w:val="0"/>
-          <w:i w:val="0"/>
-          <w:sz w:val="24"/>
-        </w:rPr>
-        <w:t>Os roteiros apresentados demonstram, em termos operacionais, que o sistema produz os artefatos esperados nos diferentes cenários de uso. A pergunta que permanece aberta — "o sistema funciona corretamente, e como isso pode ser medido de forma sistemática?" — é respondida no próximo capítulo, que descreve os instrumentos de avaliação utilizados, os resultados quantitativos obtidos e as limitações identificadas ao longo do processo.</w:t>
+        <w:t>Os fluxos apresentados neste capítulo tornam concretas as capacidades do sistema, desde a configuração declarativa pela DSL até a entrega de artefatos rastreáveis. A análise rigorosa de como essas capacidades foram avaliadas — incluindo a comparação entre a primeira etapa e a etapa atual —, os resultados quantitativos obtidos e as limitações identificadas são apresentados no capítulo seguinte.</w:t>
       </w:r>
     </w:p>
     <w:p>
@@ -10990,6 +12512,21 @@
     </w:p>
     <w:p>
       <w:pPr>
+        <w:pStyle w:val="Heading3"/>
+        <w:ind w:firstLine="0"/>
+      </w:pPr>
+      <w:r>
+        <w:rPr>
+          <w:rFonts w:ascii="Calibri" w:hAnsi="Calibri"/>
+          <w:b/>
+          <w:color w:val="00467F"/>
+          <w:sz w:val="24"/>
+        </w:rPr>
+        <w:t>7.10 Evolução da Demonstração — Comparação Crítica entre Etapas</w:t>
+      </w:r>
+    </w:p>
+    <w:p>
+      <w:pPr>
         <w:spacing w:before="0" w:after="120"/>
         <w:ind w:firstLine="709"/>
         <w:jc w:val="both"/>
@@ -11001,7 +12538,281 @@
           <w:i w:val="0"/>
           <w:sz w:val="24"/>
         </w:rPr>
-        <w:t>A avaliação confirmou que o sistema atende aos critérios estabelecidos, com exceção da execução completa do solver OpenFOAM, identificada como pendência desde a primeira avaliação. Os resultados quantitativos, as evidências de testes e as referências do repositório sustentam as afirmações que serão sintetizadas no capítulo final, juntamente com a análise das contribuições e as perspectivas de desenvolvimento futuro.</w:t>
+        <w:t>A avaliação foi conduzida em duas etapas distintas, separadas por um semestre de desenvolvimento. Esta seção compara as demonstrações realizadas em cada etapa, identifica os avanços objetivos e aponta as limitações que persistem ou foram introduzidas ao longo do processo.</w:t>
+      </w:r>
+    </w:p>
+    <w:p>
+      <w:pPr>
+        <w:spacing w:before="0" w:after="120"/>
+        <w:ind w:firstLine="709"/>
+        <w:jc w:val="both"/>
+      </w:pPr>
+      <w:r>
+        <w:rPr>
+          <w:rFonts w:ascii="Calibri" w:hAnsi="Calibri"/>
+          <w:b w:val="0"/>
+          <w:i w:val="0"/>
+          <w:sz w:val="24"/>
+        </w:rPr>
+        <w:t>A primeira demonstração, realizada ao fim do primeiro semestre (commit 62cb4fc, 19/11/2025), avaliou o núcleo do pipeline: DSL .bed com 10 seções, compilador ANTLR4 gerando hash SHA-256, motor Blender em modo headless, dashboard React com visualizador 3D básico e backend FastAPI com persistência local em SQLite. O conjunto G4 percorreu o pipeline em seis execuções, com tempos totais de 74 a 87 s por execução completa.</w:t>
+      </w:r>
+    </w:p>
+    <w:p>
+      <w:pPr>
+        <w:spacing w:before="0" w:after="120"/>
+        <w:ind w:firstLine="709"/>
+        <w:jc w:val="both"/>
+      </w:pPr>
+      <w:r>
+        <w:rPr>
+          <w:rFonts w:ascii="Calibri" w:hAnsi="Calibri"/>
+          <w:b w:val="0"/>
+          <w:i w:val="0"/>
+          <w:sz w:val="24"/>
+        </w:rPr>
+        <w:t>Tabela A — Capacidades demonstradas por etapa.</w:t>
+      </w:r>
+    </w:p>
+    <w:tbl>
+      <w:tblPr>
+        <w:tblStyle w:val="TableGrid"/>
+        <w:tblW w:type="auto" w:w="0"/>
+        <w:jc w:val="center"/>
+        <w:tblLook w:firstColumn="1" w:firstRow="1" w:lastColumn="0" w:lastRow="0" w:noHBand="0" w:noVBand="1" w:val="04A0"/>
+      </w:tblPr>
+      <w:tblGrid>
+        <w:gridCol w:w="3024"/>
+        <w:gridCol w:w="3024"/>
+        <w:gridCol w:w="3024"/>
+      </w:tblGrid>
+      <w:tr>
+        <w:tc>
+          <w:tcPr>
+            <w:tcW w:type="dxa" w:w="3024"/>
+            <w:shd w:val="clear" w:color="auto" w:fill="D9D9D9"/>
+          </w:tcPr>
+          <w:p>
+            <w:pPr>
+              <w:spacing w:before="40" w:after="40"/>
+              <w:ind w:firstLine="0"/>
+              <w:jc w:val="center"/>
+            </w:pPr>
+            <w:r>
+              <w:rPr>
+                <w:rFonts w:ascii="Calibri" w:hAnsi="Calibri"/>
+                <w:b/>
+                <w:sz w:val="18"/>
+              </w:rPr>
+              <w:t>Capacidade</w:t>
+            </w:r>
+          </w:p>
+        </w:tc>
+        <w:tc>
+          <w:tcPr>
+            <w:tcW w:type="dxa" w:w="3024"/>
+            <w:shd w:val="clear" w:color="auto" w:fill="D9D9D9"/>
+          </w:tcPr>
+          <w:p>
+            <w:pPr>
+              <w:spacing w:before="40" w:after="40"/>
+              <w:ind w:firstLine="0"/>
+              <w:jc w:val="center"/>
+            </w:pPr>
+            <w:r>
+              <w:rPr>
+                <w:rFonts w:ascii="Calibri" w:hAnsi="Calibri"/>
+                <w:b/>
+                <w:sz w:val="18"/>
+              </w:rPr>
+              <w:t>Primeira etapa</w:t>
+            </w:r>
+          </w:p>
+        </w:tc>
+        <w:tc>
+          <w:tcPr>
+            <w:tcW w:type="dxa" w:w="3024"/>
+            <w:shd w:val="clear" w:color="auto" w:fill="D9D9D9"/>
+          </w:tcPr>
+          <w:p>
+            <w:pPr>
+              <w:spacing w:before="40" w:after="40"/>
+              <w:ind w:firstLine="0"/>
+              <w:jc w:val="center"/>
+            </w:pPr>
+            <w:r>
+              <w:rPr>
+                <w:rFonts w:ascii="Calibri" w:hAnsi="Calibri"/>
+                <w:b/>
+                <w:sz w:val="18"/>
+              </w:rPr>
+              <w:t>Etapa atual</w:t>
+            </w:r>
+          </w:p>
+        </w:tc>
+      </w:tr>
+      <w:tr>
+        <w:tc>
+          <w:tcPr>
+            <w:tcW w:type="dxa" w:w="3024"/>
+          </w:tcPr>
+          <w:p>
+            <w:pPr>
+              <w:spacing w:before="40" w:after="40"/>
+              <w:ind w:firstLine="0"/>
+              <w:jc w:val="center"/>
+            </w:pPr>
+            <w:r>
+              <w:rPr>
+                <w:rFonts w:ascii="Calibri" w:hAnsi="Calibri"/>
+                <w:b w:val="0"/>
+                <w:sz w:val="18"/>
+              </w:rPr>
+              <w:t>Motor de geração CLI Wizard Corte 3D / Pseudo-2D Visualizador desktop Arquivos de teste Funções de teste (corte) Páginas no dashboard Sistema de templates Sistema de jobs Sidecar JSON por artefato</w:t>
+            </w:r>
+          </w:p>
+        </w:tc>
+        <w:tc>
+          <w:tcPr>
+            <w:tcW w:type="dxa" w:w="3024"/>
+          </w:tcPr>
+          <w:p>
+            <w:pPr>
+              <w:spacing w:before="40" w:after="40"/>
+              <w:ind w:firstLine="0"/>
+              <w:jc w:val="center"/>
+            </w:pPr>
+            <w:r>
+              <w:rPr>
+                <w:rFonts w:ascii="Calibri" w:hAnsi="Calibri"/>
+                <w:b w:val="0"/>
+                <w:sz w:val="18"/>
+              </w:rPr>
+              <w:t>Blender (único) Não existia Não existia Não existia 6 0 5 (básico) Não existia Síncrono Não existia</w:t>
+            </w:r>
+          </w:p>
+        </w:tc>
+        <w:tc>
+          <w:tcPr>
+            <w:tcW w:type="dxa" w:w="3024"/>
+          </w:tcPr>
+          <w:p>
+            <w:pPr>
+              <w:spacing w:before="40" w:after="40"/>
+              <w:ind w:firstLine="0"/>
+              <w:jc w:val="center"/>
+            </w:pPr>
+            <w:r>
+              <w:rPr>
+                <w:rFonts w:ascii="Calibri" w:hAnsi="Calibri"/>
+                <w:b w:val="0"/>
+                <w:sz w:val="18"/>
+              </w:rPr>
+              <w:t>Blender + Python puro Interativo + headless thin_slice paramétrico scientific_app + corte 27 (+ 350 %) 29 9 (+ DB, Rel., Conf., Perf.) CRUD completo (19 fixtures) Assíncrono (JobRecord) seed, hash, porosidade</w:t>
+            </w:r>
+          </w:p>
+        </w:tc>
+      </w:tr>
+    </w:tbl>
+    <w:p>
+      <w:pPr>
+        <w:spacing w:after="160"/>
+      </w:pPr>
+    </w:p>
+    <w:p>
+      <w:pPr>
+        <w:spacing w:before="40" w:after="160"/>
+        <w:ind w:firstLine="0" w:left="709"/>
+        <w:jc w:val="both"/>
+      </w:pPr>
+      <w:r>
+        <w:rPr>
+          <w:rFonts w:ascii="Calibri" w:hAnsi="Calibri"/>
+          <w:b w:val="0"/>
+          <w:i w:val="0"/>
+          <w:color w:val="555555"/>
+          <w:sz w:val="20"/>
+        </w:rPr>
+        <w:t>Fonte: produção autoral, a partir da comparação entre o commit 62cb4fc e o HEAD.</w:t>
+      </w:r>
+    </w:p>
+    <w:p>
+      <w:pPr>
+        <w:spacing w:before="0" w:after="120"/>
+        <w:ind w:firstLine="709"/>
+        <w:jc w:val="both"/>
+      </w:pPr>
+      <w:r>
+        <w:rPr>
+          <w:rFonts w:ascii="Calibri" w:hAnsi="Calibri"/>
+          <w:b w:val="0"/>
+          <w:i w:val="0"/>
+          <w:sz w:val="24"/>
+        </w:rPr>
+        <w:t>Os resultados da primeira avaliação formativa foram positivos: média de 4,5/5 para a DSL, 5,0/5 para o compilador e 4,8/5 para o dashboard. As limitações então identificadas foram facilidade geral de edição (3/5) e confiança nos resultados (4/5). Ambas orientaram diretamente o desenvolvimento da etapa seguinte: a facilidade foi endereçada pelo CLI Wizard, pelo sistema de templates e pelo modo headless; a confiança, pelo sistema de seed determinística, pela suíte de 27 arquivos de teste e pelo sidecar JSON por artefato.</w:t>
+      </w:r>
+    </w:p>
+    <w:p>
+      <w:pPr>
+        <w:spacing w:before="0" w:after="120"/>
+        <w:ind w:firstLine="709"/>
+        <w:jc w:val="both"/>
+      </w:pPr>
+      <w:r>
+        <w:rPr>
+          <w:rFonts w:ascii="Calibri" w:hAnsi="Calibri"/>
+          <w:b w:val="0"/>
+          <w:i w:val="0"/>
+          <w:sz w:val="24"/>
+        </w:rPr>
+        <w:t>A etapa atual apresenta avanços objetivos e verificáveis. O motor Python puro elimina a dependência do Blender para geração básica e permite execução em ambientes sem GPU ou licença gráfica. Os 27 arquivos de teste substituem a verificação manual por evidências automatizadas, cobrindo o algoritmo de corte com 29 funções de teste específicas. O CLI Wizard e o modo headless tornam o sistema acessível para scripts e pipelines em lote, e o sistema de templates reduz a repetição de configurações de leito.</w:t>
+      </w:r>
+    </w:p>
+    <w:p>
+      <w:pPr>
+        <w:spacing w:before="0" w:after="120"/>
+        <w:ind w:firstLine="709"/>
+        <w:jc w:val="both"/>
+      </w:pPr>
+      <w:r>
+        <w:rPr>
+          <w:rFonts w:ascii="Calibri" w:hAnsi="Calibri"/>
+          <w:b w:val="0"/>
+          <w:i w:val="0"/>
+          <w:sz w:val="24"/>
+        </w:rPr>
+        <w:t>Do ponto de vista crítico, os avanços concentraram-se principalmente nas camadas de geração e automação, enquanto a lacuna de execução completa do solver OpenFOAM permanece como a principal limitação técnica não endereçada — a mesma identificada na primeira avaliação. Ademais, a introdução de dois motores de geração paralelos aumenta a superfície de manutenção do sistema e requer atenção para que o comportamento dos dois perfis permaneça consistente à medida que novos recursos forem adicionados.</w:t>
+      </w:r>
+    </w:p>
+    <w:p>
+      <w:pPr>
+        <w:spacing w:before="0" w:after="120"/>
+        <w:ind w:firstLine="709"/>
+        <w:jc w:val="both"/>
+      </w:pPr>
+      <w:r>
+        <w:rPr>
+          <w:rFonts w:ascii="Calibri" w:hAnsi="Calibri"/>
+          <w:b w:val="0"/>
+          <w:i w:val="0"/>
+          <w:sz w:val="24"/>
+        </w:rPr>
+        <w:t>A coleta real dos dados subjetivos da segunda demonstração — clareza, facilidade, satisfação — ainda é necessária para confirmar ou refutar as projeções de melhoria registradas na Seção 7.5. Por fim, a comparação entre as duas etapas evidencia uma mudança de foco deliberada: enquanto a primeira etapa centrou-se na prova do pipeline fim a fim (DSL → malha → CFD), a etapa atual ampliou a plataforma em direção à reprodutibilidade auditável e à diversificação das superfícies de uso, consolidando o sistema como uma plataforma de pesquisa extensível e não apenas como um pipeline de geração de geometria.</w:t>
+      </w:r>
+    </w:p>
+    <w:p>
+      <w:pPr>
+        <w:spacing w:before="0" w:after="120"/>
+        <w:ind w:firstLine="709"/>
+        <w:jc w:val="both"/>
+      </w:pPr>
+      <w:r>
+        <w:rPr>
+          <w:rFonts w:ascii="Calibri" w:hAnsi="Calibri"/>
+          <w:b w:val="0"/>
+          <w:i w:val="0"/>
+          <w:sz w:val="24"/>
+        </w:rPr>
+        <w:t>A avaliação confirmou que o sistema atende aos critérios estabelecidos, com exceção da execução completa do solver OpenFOAM, identificada como pendência desde a primeira avaliação. Os resultados quantitativos, as evidências de testes, a comparação entre etapas e as referências do repositório sustentam as afirmações sintetizadas no capítulo final, juntamente com a análise das contribuições e as perspectivas de desenvolvimento futuro.</w:t>
       </w:r>
     </w:p>
     <w:p>

</xml_diff>

<commit_message>
Rebalance chapter structure: 3–4 subsections each with 2–3 subsubsections
Restructures all 8 chapters so each has 3–4 subsections and each subsection
has 2–3 subsubsections, creating a balanced document hierarchy. Adds missing
subsubsections to 1.4 (Organização do Documento) and 6.3 (Pipeline Completo),
and regenerates the DOCX with 430 parsed blocks including 6 embedded diagrams
and 29 screenshot placeholders.

https://claude.ai/code/session_01SEH2kENXG5HX2gGuB7hsSN
</commit_message>
<xml_diff>
--- a/docs/TCC_BEDFLOW_ATLAS_COMPLETO.docx
+++ b/docs/TCC_BEDFLOW_ATLAS_COMPLETO.docx
@@ -2888,6 +2888,36 @@
     </w:p>
     <w:p>
       <w:pPr>
+        <w:pStyle w:val="Heading2"/>
+        <w:ind w:firstLine="0"/>
+      </w:pPr>
+      <w:r>
+        <w:rPr>
+          <w:rFonts w:ascii="Calibri" w:hAnsi="Calibri"/>
+          <w:b/>
+          <w:color w:val="00467F"/>
+          <w:sz w:val="26"/>
+        </w:rPr>
+        <w:t>1.1 Contexto e Motivação</w:t>
+      </w:r>
+    </w:p>
+    <w:p>
+      <w:pPr>
+        <w:pStyle w:val="Heading3"/>
+        <w:ind w:firstLine="0"/>
+      </w:pPr>
+      <w:r>
+        <w:rPr>
+          <w:rFonts w:ascii="Calibri" w:hAnsi="Calibri"/>
+          <w:b/>
+          <w:color w:val="00467F"/>
+          <w:sz w:val="24"/>
+        </w:rPr>
+        <w:t>1.1.1 Leitos Empacotados e Simulação CFD</w:t>
+      </w:r>
+    </w:p>
+    <w:p>
+      <w:pPr>
         <w:spacing w:before="0" w:after="120"/>
         <w:ind w:firstLine="709"/>
         <w:jc w:val="both"/>
@@ -2904,6 +2934,21 @@
     </w:p>
     <w:p>
       <w:pPr>
+        <w:pStyle w:val="Heading3"/>
+        <w:ind w:firstLine="0"/>
+      </w:pPr>
+      <w:r>
+        <w:rPr>
+          <w:rFonts w:ascii="Calibri" w:hAnsi="Calibri"/>
+          <w:b/>
+          <w:color w:val="00467F"/>
+          <w:sz w:val="24"/>
+        </w:rPr>
+        <w:t>1.1.2 Desafios na Preparação de Geometrias</w:t>
+      </w:r>
+    </w:p>
+    <w:p>
+      <w:pPr>
         <w:spacing w:before="0" w:after="120"/>
         <w:ind w:firstLine="709"/>
         <w:jc w:val="both"/>
@@ -2920,6 +2965,36 @@
     </w:p>
     <w:p>
       <w:pPr>
+        <w:pStyle w:val="Heading2"/>
+        <w:ind w:firstLine="0"/>
+      </w:pPr>
+      <w:r>
+        <w:rPr>
+          <w:rFonts w:ascii="Calibri" w:hAnsi="Calibri"/>
+          <w:b/>
+          <w:color w:val="00467F"/>
+          <w:sz w:val="26"/>
+        </w:rPr>
+        <w:t>1.2 A Proposta BEDFLOW-ATLAS</w:t>
+      </w:r>
+    </w:p>
+    <w:p>
+      <w:pPr>
+        <w:pStyle w:val="Heading3"/>
+        <w:ind w:firstLine="0"/>
+      </w:pPr>
+      <w:r>
+        <w:rPr>
+          <w:rFonts w:ascii="Calibri" w:hAnsi="Calibri"/>
+          <w:b/>
+          <w:color w:val="00467F"/>
+          <w:sz w:val="24"/>
+        </w:rPr>
+        <w:t>1.2.1 Visão Geral da Plataforma</w:t>
+      </w:r>
+    </w:p>
+    <w:p>
+      <w:pPr>
         <w:spacing w:before="0" w:after="120"/>
         <w:ind w:firstLine="709"/>
         <w:jc w:val="both"/>
@@ -2936,6 +3011,21 @@
     </w:p>
     <w:p>
       <w:pPr>
+        <w:pStyle w:val="Heading3"/>
+        <w:ind w:firstLine="0"/>
+      </w:pPr>
+      <w:r>
+        <w:rPr>
+          <w:rFonts w:ascii="Calibri" w:hAnsi="Calibri"/>
+          <w:b/>
+          <w:color w:val="00467F"/>
+          <w:sz w:val="24"/>
+        </w:rPr>
+        <w:t>1.2.2 Pilares do Sistema</w:t>
+      </w:r>
+    </w:p>
+    <w:p>
+      <w:pPr>
         <w:spacing w:before="0" w:after="120"/>
         <w:ind w:firstLine="709"/>
         <w:jc w:val="both"/>
@@ -2952,6 +3042,36 @@
     </w:p>
     <w:p>
       <w:pPr>
+        <w:pStyle w:val="Heading2"/>
+        <w:ind w:firstLine="0"/>
+      </w:pPr>
+      <w:r>
+        <w:rPr>
+          <w:rFonts w:ascii="Calibri" w:hAnsi="Calibri"/>
+          <w:b/>
+          <w:color w:val="00467F"/>
+          <w:sz w:val="26"/>
+        </w:rPr>
+        <w:t>1.3 Evolução e Escopo do Trabalho</w:t>
+      </w:r>
+    </w:p>
+    <w:p>
+      <w:pPr>
+        <w:pStyle w:val="Heading3"/>
+        <w:ind w:firstLine="0"/>
+      </w:pPr>
+      <w:r>
+        <w:rPr>
+          <w:rFonts w:ascii="Calibri" w:hAnsi="Calibri"/>
+          <w:b/>
+          <w:color w:val="00467F"/>
+          <w:sz w:val="24"/>
+        </w:rPr>
+        <w:t>1.3.1 Da Versão Inicial à Versão Consolidada</w:t>
+      </w:r>
+    </w:p>
+    <w:p>
+      <w:pPr>
         <w:spacing w:before="0" w:after="120"/>
         <w:ind w:firstLine="709"/>
         <w:jc w:val="both"/>
@@ -2968,6 +3088,21 @@
     </w:p>
     <w:p>
       <w:pPr>
+        <w:pStyle w:val="Heading3"/>
+        <w:ind w:firstLine="0"/>
+      </w:pPr>
+      <w:r>
+        <w:rPr>
+          <w:rFonts w:ascii="Calibri" w:hAnsi="Calibri"/>
+          <w:b/>
+          <w:color w:val="00467F"/>
+          <w:sz w:val="24"/>
+        </w:rPr>
+        <w:t>1.3.2 Delimitação do Escopo</w:t>
+      </w:r>
+    </w:p>
+    <w:p>
+      <w:pPr>
         <w:spacing w:before="0" w:after="120"/>
         <w:ind w:firstLine="709"/>
         <w:jc w:val="both"/>
@@ -2984,6 +3119,21 @@
     </w:p>
     <w:p>
       <w:pPr>
+        <w:pStyle w:val="Heading2"/>
+        <w:ind w:firstLine="0"/>
+      </w:pPr>
+      <w:r>
+        <w:rPr>
+          <w:rFonts w:ascii="Calibri" w:hAnsi="Calibri"/>
+          <w:b/>
+          <w:color w:val="00467F"/>
+          <w:sz w:val="26"/>
+        </w:rPr>
+        <w:t>1.4 Organização do Documento</w:t>
+      </w:r>
+    </w:p>
+    <w:p>
+      <w:pPr>
         <w:spacing w:before="0" w:after="120"/>
         <w:ind w:firstLine="709"/>
         <w:jc w:val="both"/>
@@ -2995,7 +3145,22 @@
           <w:i w:val="0"/>
           <w:sz w:val="24"/>
         </w:rPr>
-        <w:t>Este texto está organizado da seguinte maneira: o Capítulo 2 apresenta o referencial teórico necessário para a compreensão do trabalho; o Capítulo 3 discute trabalhos relacionados; o Capítulo 4 documenta a proposta de solução; o Capítulo 5 descreve a implementação; o Capítulo 6 apresenta os fluxos de demonstração; o Capítulo 7 aborda a avaliação; e o Capítulo 8 apresenta a conclusão, com a análise dos objetivos, contribuições, limitações e trabalhos futuros.</w:t>
+        <w:t>Este capítulo introdutório estabeleceu o problema, motivou a proposta e delimitou o escopo do trabalho. As seções a seguir descrevem como o restante do documento está estruturado e quais convenções de notação são adotadas ao longo do texto.</w:t>
+      </w:r>
+    </w:p>
+    <w:p>
+      <w:pPr>
+        <w:pStyle w:val="Heading3"/>
+        <w:ind w:firstLine="0"/>
+      </w:pPr>
+      <w:r>
+        <w:rPr>
+          <w:rFonts w:ascii="Calibri" w:hAnsi="Calibri"/>
+          <w:b/>
+          <w:color w:val="00467F"/>
+          <w:sz w:val="24"/>
+        </w:rPr>
+        <w:t>1.4.1 Estrutura do Texto</w:t>
       </w:r>
     </w:p>
     <w:p>
@@ -3011,6 +3176,53 @@
           <w:i w:val="0"/>
           <w:sz w:val="24"/>
         </w:rPr>
+        <w:t>O documento está organizado em oito capítulos. O Capítulo 2 apresenta o referencial teórico necessário para a compreensão do trabalho, abrangendo CFD, leitos empacotados, reprodutibilidade computacional e linguagens de domínio específico. O Capítulo 3 discute os principais trabalhos relacionados e posiciona o BEDFLOW-ATLAS frente a eles. O Capítulo 4 documenta a proposta de solução, incluindo objetivos, arquitetura e requisitos. O Capítulo 5 descreve em detalhe a implementação de cada módulo. O Capítulo 6 apresenta os fluxos de demonstração passo a passo. O Capítulo 7 aborda a avaliação do sistema, com comparação entre as duas etapas do trabalho. O Capítulo 8 conclui com a análise dos objetivos, contribuições, limitações e perspectivas futuras.</w:t>
+      </w:r>
+    </w:p>
+    <w:p>
+      <w:pPr>
+        <w:pStyle w:val="Heading3"/>
+        <w:ind w:firstLine="0"/>
+      </w:pPr>
+      <w:r>
+        <w:rPr>
+          <w:rFonts w:ascii="Calibri" w:hAnsi="Calibri"/>
+          <w:b/>
+          <w:color w:val="00467F"/>
+          <w:sz w:val="24"/>
+        </w:rPr>
+        <w:t>1.4.2 Convenções e Notação</w:t>
+      </w:r>
+    </w:p>
+    <w:p>
+      <w:pPr>
+        <w:spacing w:before="0" w:after="120"/>
+        <w:ind w:firstLine="709"/>
+        <w:jc w:val="both"/>
+      </w:pPr>
+      <w:r>
+        <w:rPr>
+          <w:rFonts w:ascii="Calibri" w:hAnsi="Calibri"/>
+          <w:b w:val="0"/>
+          <w:i w:val="0"/>
+          <w:sz w:val="24"/>
+        </w:rPr>
+        <w:t>Ao longo do texto, nomes de arquivos, comandos e trechos de código são apresentados em fonte monoespaçada (ex.: params.json, bedflow run). Siglas são definidas na primeira ocorrência e reutilizadas posteriormente sem redefinição. Referências bibliográficas seguem a norma ABNT NBR 6023. Figuras são numeradas sequencialmente e referenciadas no corpo do texto no ponto em que se tornam relevantes para a leitura. Marcadores no formato [W1], [T1] e [R1] indicam capturas de tela da interface e do terminal que serão inseridas na versão final do documento.</w:t>
+      </w:r>
+    </w:p>
+    <w:p>
+      <w:pPr>
+        <w:spacing w:before="0" w:after="120"/>
+        <w:ind w:firstLine="709"/>
+        <w:jc w:val="both"/>
+      </w:pPr>
+      <w:r>
+        <w:rPr>
+          <w:rFonts w:ascii="Calibri" w:hAnsi="Calibri"/>
+          <w:b w:val="0"/>
+          <w:i w:val="0"/>
+          <w:sz w:val="24"/>
+        </w:rPr>
         <w:t>Para compreender as escolhas técnicas que sustentam o BEDFLOW-ATLAS — desde o uso de uma linguagem formal para descrever leitos até a combinação de hash e seed para garantir reprodutibilidade — é necessário percorrer os fundamentos teóricos que dão base a essas decisões. É o que o próximo capítulo apresenta.</w:t>
       </w:r>
     </w:p>
@@ -3063,6 +3275,21 @@
     </w:p>
     <w:p>
       <w:pPr>
+        <w:pStyle w:val="Heading2"/>
+        <w:ind w:firstLine="0"/>
+      </w:pPr>
+      <w:r>
+        <w:rPr>
+          <w:rFonts w:ascii="Calibri" w:hAnsi="Calibri"/>
+          <w:b/>
+          <w:color w:val="00467F"/>
+          <w:sz w:val="26"/>
+        </w:rPr>
+        <w:t>2.1 DINÂMICA DOS FLUIDOS COMPUTACIONAL (CFD)</w:t>
+      </w:r>
+    </w:p>
+    <w:p>
+      <w:pPr>
         <w:pStyle w:val="Heading3"/>
         <w:ind w:firstLine="0"/>
       </w:pPr>
@@ -3073,7 +3300,7 @@
           <w:color w:val="00467F"/>
           <w:sz w:val="24"/>
         </w:rPr>
-        <w:t>2.1 DINÂMICA DOS FLUIDOS COMPUTACIONAL (CFD)</w:t>
+        <w:t>2.1.1 Definição e Etapas da Simulação</w:t>
       </w:r>
     </w:p>
     <w:p>
@@ -3142,6 +3369,21 @@
     </w:p>
     <w:p>
       <w:pPr>
+        <w:pStyle w:val="Heading3"/>
+        <w:ind w:firstLine="0"/>
+      </w:pPr>
+      <w:r>
+        <w:rPr>
+          <w:rFonts w:ascii="Calibri" w:hAnsi="Calibri"/>
+          <w:b/>
+          <w:color w:val="00467F"/>
+          <w:sz w:val="24"/>
+        </w:rPr>
+        <w:t>2.1.2 Relevância para Leitos Empacotados</w:t>
+      </w:r>
+    </w:p>
+    <w:p>
+      <w:pPr>
         <w:spacing w:before="0" w:after="120"/>
         <w:ind w:firstLine="709"/>
         <w:jc w:val="both"/>
@@ -3175,6 +3417,21 @@
     </w:p>
     <w:p>
       <w:pPr>
+        <w:pStyle w:val="Heading2"/>
+        <w:ind w:firstLine="0"/>
+      </w:pPr>
+      <w:r>
+        <w:rPr>
+          <w:rFonts w:ascii="Calibri" w:hAnsi="Calibri"/>
+          <w:b/>
+          <w:color w:val="00467F"/>
+          <w:sz w:val="26"/>
+        </w:rPr>
+        <w:t>2.2 LEITOS EMPACOTADOS NA ENGENHARIA QUÍMICA</w:t>
+      </w:r>
+    </w:p>
+    <w:p>
+      <w:pPr>
         <w:pStyle w:val="Heading3"/>
         <w:ind w:firstLine="0"/>
       </w:pPr>
@@ -3185,7 +3442,7 @@
           <w:color w:val="00467F"/>
           <w:sz w:val="24"/>
         </w:rPr>
-        <w:t>2.2 LEITOS EMPACOTADOS NA ENGENHARIA QUÍMICA</w:t>
+        <w:t>2.2.1 Caracterização e Aplicações</w:t>
       </w:r>
     </w:p>
     <w:p>
@@ -3223,6 +3480,21 @@
     </w:p>
     <w:p>
       <w:pPr>
+        <w:pStyle w:val="Heading3"/>
+        <w:ind w:firstLine="0"/>
+      </w:pPr>
+      <w:r>
+        <w:rPr>
+          <w:rFonts w:ascii="Calibri" w:hAnsi="Calibri"/>
+          <w:b/>
+          <w:color w:val="00467F"/>
+          <w:sz w:val="24"/>
+        </w:rPr>
+        <w:t>2.2.2 Correlações Empíricas e o Papel da CFD</w:t>
+      </w:r>
+    </w:p>
+    <w:p>
+      <w:pPr>
         <w:spacing w:before="0" w:after="120"/>
         <w:ind w:firstLine="709"/>
         <w:jc w:val="both"/>
@@ -3305,6 +3577,21 @@
     </w:p>
     <w:p>
       <w:pPr>
+        <w:pStyle w:val="Heading2"/>
+        <w:ind w:firstLine="0"/>
+      </w:pPr>
+      <w:r>
+        <w:rPr>
+          <w:rFonts w:ascii="Calibri" w:hAnsi="Calibri"/>
+          <w:b/>
+          <w:color w:val="00467F"/>
+          <w:sz w:val="26"/>
+        </w:rPr>
+        <w:t>2.3 REPRODUTIBILIDADE COMPUTACIONAL EM SIMULAÇÕES CIENTÍFICAS</w:t>
+      </w:r>
+    </w:p>
+    <w:p>
+      <w:pPr>
         <w:pStyle w:val="Heading3"/>
         <w:ind w:firstLine="0"/>
       </w:pPr>
@@ -3315,7 +3602,7 @@
           <w:color w:val="00467F"/>
           <w:sz w:val="24"/>
         </w:rPr>
-        <w:t>2.3 REPRODUTIBILIDADE COMPUTACIONAL EM SIMULAÇÕES CIENTÍFICAS</w:t>
+        <w:t>2.3.1 Princípios e Hash Criptográfico</w:t>
       </w:r>
     </w:p>
     <w:p>
@@ -3352,6 +3639,21 @@
     </w:p>
     <w:p>
       <w:pPr>
+        <w:pStyle w:val="Heading3"/>
+        <w:ind w:firstLine="0"/>
+      </w:pPr>
+      <w:r>
+        <w:rPr>
+          <w:rFonts w:ascii="Calibri" w:hAnsi="Calibri"/>
+          <w:b/>
+          <w:color w:val="00467F"/>
+          <w:sz w:val="24"/>
+        </w:rPr>
+        <w:t>2.3.2 Controle de Seed</w:t>
+      </w:r>
+    </w:p>
+    <w:p>
+      <w:pPr>
         <w:spacing w:before="0" w:after="120"/>
         <w:ind w:firstLine="709"/>
         <w:jc w:val="both"/>
@@ -3368,6 +3670,21 @@
     </w:p>
     <w:p>
       <w:pPr>
+        <w:pStyle w:val="Heading2"/>
+        <w:ind w:firstLine="0"/>
+      </w:pPr>
+      <w:r>
+        <w:rPr>
+          <w:rFonts w:ascii="Calibri" w:hAnsi="Calibri"/>
+          <w:b/>
+          <w:color w:val="00467F"/>
+          <w:sz w:val="26"/>
+        </w:rPr>
+        <w:t>2.4 LINGUAGENS DE DOMÍNIO ESPECÍFICO (DSL)</w:t>
+      </w:r>
+    </w:p>
+    <w:p>
+      <w:pPr>
         <w:pStyle w:val="Heading3"/>
         <w:ind w:firstLine="0"/>
       </w:pPr>
@@ -3378,7 +3695,7 @@
           <w:color w:val="00467F"/>
           <w:sz w:val="24"/>
         </w:rPr>
-        <w:t>2.4 LINGUAGENS DE DOMÍNIO ESPECÍFICO (DSL)</w:t>
+        <w:t>2.4.1 Conceito e Vantagens</w:t>
       </w:r>
     </w:p>
     <w:p>
@@ -3415,6 +3732,21 @@
     </w:p>
     <w:p>
       <w:pPr>
+        <w:pStyle w:val="Heading3"/>
+        <w:ind w:firstLine="0"/>
+      </w:pPr>
+      <w:r>
+        <w:rPr>
+          <w:rFonts w:ascii="Calibri" w:hAnsi="Calibri"/>
+          <w:b/>
+          <w:color w:val="00467F"/>
+          <w:sz w:val="24"/>
+        </w:rPr>
+        <w:t>2.4.2 Gramáticas Formais e Classificação</w:t>
+      </w:r>
+    </w:p>
+    <w:p>
+      <w:pPr>
         <w:spacing w:before="0" w:after="120"/>
         <w:ind w:firstLine="709"/>
         <w:jc w:val="both"/>
@@ -3494,6 +3826,37 @@
     </w:p>
     <w:p>
       <w:pPr>
+        <w:pStyle w:val="Heading2"/>
+        <w:ind w:firstLine="0"/>
+      </w:pPr>
+      <w:r>
+        <w:rPr>
+          <w:rFonts w:ascii="Calibri" w:hAnsi="Calibri"/>
+          <w:b/>
+          <w:color w:val="00467F"/>
+          <w:sz w:val="26"/>
+        </w:rPr>
+        <w:t>3.1 WORKFLOWS DE GERAÇÃO E SIMULAÇÃO DE LEITOS</w:t>
+      </w:r>
+    </w:p>
+    <w:p>
+      <w:pPr>
+        <w:spacing w:before="0" w:after="120"/>
+        <w:ind w:firstLine="709"/>
+        <w:jc w:val="both"/>
+      </w:pPr>
+      <w:r>
+        <w:rPr>
+          <w:rFonts w:ascii="Calibri" w:hAnsi="Calibri"/>
+          <w:b w:val="0"/>
+          <w:i w:val="0"/>
+          <w:sz w:val="24"/>
+        </w:rPr>
+        <w:t>Esta seção descreve três workflows de referência da literatura, organizados em ordem cronológica, que influenciaram diretamente as decisões metodológicas do BEDFLOW-ATLAS e servem de base para a análise comparativa apresentada na sequência.</w:t>
+      </w:r>
+    </w:p>
+    <w:p>
+      <w:pPr>
         <w:pStyle w:val="Heading3"/>
         <w:ind w:firstLine="0"/>
       </w:pPr>
@@ -3504,7 +3867,7 @@
           <w:color w:val="00467F"/>
           <w:sz w:val="24"/>
         </w:rPr>
-        <w:t>3.1 WORKFLOW DE BOCCARDO ET AL. (2015): BLENDER + OPENFOAM</w:t>
+        <w:t>3.1.1 Boccardo et al. (2015): Blender + OpenFOAM</w:t>
       </w:r>
     </w:p>
     <w:p>
@@ -3551,7 +3914,7 @@
           <w:color w:val="00467F"/>
           <w:sz w:val="24"/>
         </w:rPr>
-        <w:t>3.2 WORKFLOW DE FERNENGEL ET AL. (2018): SCRIPTS BASH/PYTHON + OPENFOAM</w:t>
+        <w:t>3.1.2 Fernengel et al. (2018): Scripts Bash/Python + OpenFOAM</w:t>
       </w:r>
     </w:p>
     <w:p>
@@ -3614,7 +3977,7 @@
           <w:color w:val="00467F"/>
           <w:sz w:val="24"/>
         </w:rPr>
-        <w:t>3.3 WORKFLOW DE PARTOPOUR E DIXON (2017): FÍSICA DE CORPOS RÍGIDOS + CFD</w:t>
+        <w:t>3.1.3 Partopour e Dixon (2017): Física de Corpos Rígidos + CFD</w:t>
       </w:r>
     </w:p>
     <w:p>
@@ -3651,6 +4014,21 @@
     </w:p>
     <w:p>
       <w:pPr>
+        <w:pStyle w:val="Heading2"/>
+        <w:ind w:firstLine="0"/>
+      </w:pPr>
+      <w:r>
+        <w:rPr>
+          <w:rFonts w:ascii="Calibri" w:hAnsi="Calibri"/>
+          <w:b/>
+          <w:color w:val="00467F"/>
+          <w:sz w:val="26"/>
+        </w:rPr>
+        <w:t>3.2 ANÁLISE COMPARATIVA</w:t>
+      </w:r>
+    </w:p>
+    <w:p>
+      <w:pPr>
         <w:pStyle w:val="Heading3"/>
         <w:ind w:firstLine="0"/>
       </w:pPr>
@@ -3661,7 +4039,23 @@
           <w:color w:val="00467F"/>
           <w:sz w:val="24"/>
         </w:rPr>
-        <w:t>3.4 TABELA COMPARATIVA</w:t>
+        <w:t>3.2.1 Quadro Comparativo</w:t>
+      </w:r>
+    </w:p>
+    <w:p>
+      <w:pPr>
+        <w:spacing w:before="0" w:after="120"/>
+        <w:ind w:firstLine="709"/>
+        <w:jc w:val="both"/>
+      </w:pPr>
+      <w:r>
+        <w:rPr>
+          <w:rFonts w:ascii="Calibri" w:hAnsi="Calibri"/>
+          <w:b w:val="0"/>
+          <w:i w:val="0"/>
+          <w:sz w:val="24"/>
+        </w:rPr>
+        <w:t>A tabela a seguir confronta o BEDFLOW-ATLAS com os três workflows discutidos, considerando o tipo de entrada, os perfis de geração, os formatos de saída, os recursos de visualização e os mecanismos de rastreabilidade.</w:t>
       </w:r>
     </w:p>
     <w:tbl>
@@ -3922,7 +4316,7 @@
           <w:color w:val="00467F"/>
           <w:sz w:val="24"/>
         </w:rPr>
-        <w:t>3.5 POSICIONAMENTO DO BEDFLOW-ATLAS</w:t>
+        <w:t>3.2.2 Síntese da Comparação</w:t>
       </w:r>
     </w:p>
     <w:p>
@@ -3938,7 +4332,37 @@
           <w:i w:val="0"/>
           <w:sz w:val="24"/>
         </w:rPr>
-        <w:t>O BEDFLOW-ATLAS ocupa uma posição distinta em relação aos trabalhos analisados. Enquanto os fluxos de trabalho anteriores dependem de operações manuais ou de conjuntos de scripts especializados, o BEDFLOW-ATLAS foi concebido como uma plataforma de software integrada, capaz de abstrair e automatizar grande parte do fluxo de geração geométrica para simulações computacionais.</w:t>
+        <w:t>O quadro evidencia que os três workflows compartilham a dependência de operação manual e a ausência de uma camada de entrada declarativa, de rastreabilidade formal e de interfaces de uso para perfis não especializados. O BEDFLOW-ATLAS é o único a reunir, simultaneamente, DSL própria, dois perfis de geração, sistema de corte 3D→2D e múltiplas superfícies de uso, sintetizando em uma única plataforma capacidades que, nos demais trabalhos, aparecem de forma isolada ou inexistente.</w:t>
+      </w:r>
+    </w:p>
+    <w:p>
+      <w:pPr>
+        <w:pStyle w:val="Heading2"/>
+        <w:ind w:firstLine="0"/>
+      </w:pPr>
+      <w:r>
+        <w:rPr>
+          <w:rFonts w:ascii="Calibri" w:hAnsi="Calibri"/>
+          <w:b/>
+          <w:color w:val="00467F"/>
+          <w:sz w:val="26"/>
+        </w:rPr>
+        <w:t>3.3 POSICIONAMENTO DO BEDFLOW-ATLAS</w:t>
+      </w:r>
+    </w:p>
+    <w:p>
+      <w:pPr>
+        <w:pStyle w:val="Heading3"/>
+        <w:ind w:firstLine="0"/>
+      </w:pPr>
+      <w:r>
+        <w:rPr>
+          <w:rFonts w:ascii="Calibri" w:hAnsi="Calibri"/>
+          <w:b/>
+          <w:color w:val="00467F"/>
+          <w:sz w:val="24"/>
+        </w:rPr>
+        <w:t>3.3.1 Diferenciais da Proposta</w:t>
       </w:r>
     </w:p>
     <w:p>
@@ -3954,7 +4378,7 @@
           <w:i w:val="0"/>
           <w:sz w:val="24"/>
         </w:rPr>
-        <w:t>Entre seus principais diferenciais estão a utilização de uma DSL declarativa para definição dos parâmetros do leito, o mecanismo formal de rastreabilidade baseado em hash, os recursos integrados de visualização e a possibilidade de uso tanto por interface web quanto por linha de comando. Além disso, a existência de dois perfis de geração — um baseado em Blender e outro em Python puro —, representa um diferencial arquitetural importante, especialmente para uso em ambientes computacionais heterogêneos e com diferentes restrições de infraestrutura. O recurso de corte geométrico 3D→2D, ausente nos três trabalhos comparados, constitui a principal contribuição técnica da versão consolidada e é detalhado no Capítulo 5.</w:t>
+        <w:t>O BEDFLOW-ATLAS ocupa uma posição distinta em relação aos trabalhos analisados. Enquanto os fluxos de trabalho anteriores dependem de operações manuais ou de conjuntos de scripts especializados, o BEDFLOW-ATLAS foi concebido como uma plataforma de software integrada, capaz de abstrair e automatizar grande parte do fluxo de geração geométrica para simulações computacionais.</w:t>
       </w:r>
     </w:p>
     <w:p>
@@ -3970,6 +4394,53 @@
           <w:i w:val="0"/>
           <w:sz w:val="24"/>
         </w:rPr>
+        <w:t>Entre seus principais diferenciais estão a utilização de uma DSL declarativa para definição dos parâmetros do leito, o mecanismo formal de rastreabilidade baseado em hash, os recursos integrados de visualização e a possibilidade de uso tanto por interface web quanto por linha de comando. Além disso, a existência de dois perfis de geração — um baseado em Blender e outro em Python puro —, representa um diferencial arquitetural importante, especialmente para uso em ambientes computacionais heterogêneos e com diferentes restrições de infraestrutura.</w:t>
+      </w:r>
+    </w:p>
+    <w:p>
+      <w:pPr>
+        <w:pStyle w:val="Heading3"/>
+        <w:ind w:firstLine="0"/>
+      </w:pPr>
+      <w:r>
+        <w:rPr>
+          <w:rFonts w:ascii="Calibri" w:hAnsi="Calibri"/>
+          <w:b/>
+          <w:color w:val="00467F"/>
+          <w:sz w:val="24"/>
+        </w:rPr>
+        <w:t>3.3.2 Contribuição Distintiva</w:t>
+      </w:r>
+    </w:p>
+    <w:p>
+      <w:pPr>
+        <w:spacing w:before="0" w:after="120"/>
+        <w:ind w:firstLine="709"/>
+        <w:jc w:val="both"/>
+      </w:pPr>
+      <w:r>
+        <w:rPr>
+          <w:rFonts w:ascii="Calibri" w:hAnsi="Calibri"/>
+          <w:b w:val="0"/>
+          <w:i w:val="0"/>
+          <w:sz w:val="24"/>
+        </w:rPr>
+        <w:t>O recurso de corte geométrico 3D→2D, ausente nos três trabalhos comparados, constitui a principal contribuição técnica da versão consolidada e é detalhado no Capítulo 5. Esse recurso, somado à entrada declarativa e à rastreabilidade formal por hash e seed, distingue o BEDFLOW-ATLAS como uma plataforma de pesquisa extensível, e não apenas como mais um conjunto de scripts de automação.</w:t>
+      </w:r>
+    </w:p>
+    <w:p>
+      <w:pPr>
+        <w:spacing w:before="0" w:after="120"/>
+        <w:ind w:firstLine="709"/>
+        <w:jc w:val="both"/>
+      </w:pPr>
+      <w:r>
+        <w:rPr>
+          <w:rFonts w:ascii="Calibri" w:hAnsi="Calibri"/>
+          <w:b w:val="0"/>
+          <w:i w:val="0"/>
+          <w:sz w:val="24"/>
+        </w:rPr>
         <w:t>Os fundamentos teóricos apresentados nos capítulos anteriores e o panorama dos trabalhos relacionados estabelecem o contexto dentro do qual o BEDFLOW-ATLAS foi projetado. O capítulo seguinte descreve formalmente a proposta de solução: seus objetivos, a arquitetura do sistema e os critérios que guiaram as decisões de projeto.</w:t>
       </w:r>
     </w:p>
@@ -3990,6 +4461,21 @@
     </w:p>
     <w:p>
       <w:pPr>
+        <w:pStyle w:val="Heading2"/>
+        <w:ind w:firstLine="0"/>
+      </w:pPr>
+      <w:r>
+        <w:rPr>
+          <w:rFonts w:ascii="Calibri" w:hAnsi="Calibri"/>
+          <w:b/>
+          <w:color w:val="00467F"/>
+          <w:sz w:val="26"/>
+        </w:rPr>
+        <w:t>4.1 Origem e Motivação</w:t>
+      </w:r>
+    </w:p>
+    <w:p>
+      <w:pPr>
         <w:pStyle w:val="Heading3"/>
         <w:ind w:firstLine="0"/>
       </w:pPr>
@@ -4000,7 +4486,7 @@
           <w:color w:val="00467F"/>
           <w:sz w:val="24"/>
         </w:rPr>
-        <w:t>4.1 Origem e Contexto Histórico</w:t>
+        <w:t>4.1.1 Origem e Contexto Histórico</w:t>
       </w:r>
     </w:p>
     <w:p>
@@ -5119,7 +5605,7 @@
           <w:color w:val="00467F"/>
           <w:sz w:val="24"/>
         </w:rPr>
-        <w:t>4.2 Motivação e Problema</w:t>
+        <w:t>4.1.2 Motivação e Problema</w:t>
       </w:r>
     </w:p>
     <w:p>
@@ -5156,6 +5642,21 @@
     </w:p>
     <w:p>
       <w:pPr>
+        <w:pStyle w:val="Heading2"/>
+        <w:ind w:firstLine="0"/>
+      </w:pPr>
+      <w:r>
+        <w:rPr>
+          <w:rFonts w:ascii="Calibri" w:hAnsi="Calibri"/>
+          <w:b/>
+          <w:color w:val="00467F"/>
+          <w:sz w:val="26"/>
+        </w:rPr>
+        <w:t>4.2 Objetivos da Proposta</w:t>
+      </w:r>
+    </w:p>
+    <w:p>
+      <w:pPr>
         <w:pStyle w:val="Heading3"/>
         <w:ind w:firstLine="0"/>
       </w:pPr>
@@ -5166,7 +5667,7 @@
           <w:color w:val="00467F"/>
           <w:sz w:val="24"/>
         </w:rPr>
-        <w:t>4.3 Objetivos da Proposta</w:t>
+        <w:t>4.2.1 Objetivo Geral</w:t>
       </w:r>
     </w:p>
     <w:p>
@@ -5187,6 +5688,21 @@
     </w:p>
     <w:p>
       <w:pPr>
+        <w:pStyle w:val="Heading3"/>
+        <w:ind w:firstLine="0"/>
+      </w:pPr>
+      <w:r>
+        <w:rPr>
+          <w:rFonts w:ascii="Calibri" w:hAnsi="Calibri"/>
+          <w:b/>
+          <w:color w:val="00467F"/>
+          <w:sz w:val="24"/>
+        </w:rPr>
+        <w:t>4.2.2 Objetivos Específicos</w:t>
+      </w:r>
+    </w:p>
+    <w:p>
+      <w:pPr>
         <w:spacing w:before="0" w:after="120"/>
         <w:ind w:firstLine="709"/>
         <w:jc w:val="both"/>
@@ -5331,6 +5847,21 @@
     </w:p>
     <w:p>
       <w:pPr>
+        <w:pStyle w:val="Heading2"/>
+        <w:ind w:firstLine="0"/>
+      </w:pPr>
+      <w:r>
+        <w:rPr>
+          <w:rFonts w:ascii="Calibri" w:hAnsi="Calibri"/>
+          <w:b/>
+          <w:color w:val="00467F"/>
+          <w:sz w:val="26"/>
+        </w:rPr>
+        <w:t>4.3 Arquitetura e Módulos do Sistema</w:t>
+      </w:r>
+    </w:p>
+    <w:p>
+      <w:pPr>
         <w:pStyle w:val="Heading3"/>
         <w:ind w:firstLine="0"/>
       </w:pPr>
@@ -5341,7 +5872,7 @@
           <w:color w:val="00467F"/>
           <w:sz w:val="24"/>
         </w:rPr>
-        <w:t>4.4 Arquitetura Geral do Sistema</w:t>
+        <w:t>4.3.1 Arquitetura Geral do Sistema</w:t>
       </w:r>
     </w:p>
     <w:p>
@@ -5404,7 +5935,7 @@
           <w:color w:val="00467F"/>
           <w:sz w:val="24"/>
         </w:rPr>
-        <w:t>4.5 Módulos do Sistema</w:t>
+        <w:t>4.3.2 Módulos do Sistema</w:t>
       </w:r>
     </w:p>
     <w:p>
@@ -6341,7 +6872,7 @@
           <w:color w:val="00467F"/>
           <w:sz w:val="24"/>
         </w:rPr>
-        <w:t>4.6 Componentes Principais e Responsabilidades</w:t>
+        <w:t>4.3.3 Componentes Principais e Responsabilidades</w:t>
       </w:r>
     </w:p>
     <w:p>
@@ -6823,6 +7354,21 @@
     </w:p>
     <w:p>
       <w:pPr>
+        <w:pStyle w:val="Heading2"/>
+        <w:ind w:firstLine="0"/>
+      </w:pPr>
+      <w:r>
+        <w:rPr>
+          <w:rFonts w:ascii="Calibri" w:hAnsi="Calibri"/>
+          <w:b/>
+          <w:color w:val="00467F"/>
+          <w:sz w:val="26"/>
+        </w:rPr>
+        <w:t>4.4 Requisitos e Critérios de Aceitação</w:t>
+      </w:r>
+    </w:p>
+    <w:p>
+      <w:pPr>
         <w:pStyle w:val="Heading3"/>
         <w:ind w:firstLine="0"/>
       </w:pPr>
@@ -6833,7 +7379,7 @@
           <w:color w:val="00467F"/>
           <w:sz w:val="24"/>
         </w:rPr>
-        <w:t>4.7 Requisitos Funcionais e Não Funcionais</w:t>
+        <w:t>4.4.1 Requisitos Funcionais e Não Funcionais</w:t>
       </w:r>
     </w:p>
     <w:p>
@@ -7136,7 +7682,7 @@
           <w:color w:val="00467F"/>
           <w:sz w:val="24"/>
         </w:rPr>
-        <w:t>4.8 Critérios de Aceitação</w:t>
+        <w:t>4.4.2 Critérios de Aceitação</w:t>
       </w:r>
     </w:p>
     <w:p>
@@ -7392,6 +7938,21 @@
     </w:p>
     <w:p>
       <w:pPr>
+        <w:pStyle w:val="Heading2"/>
+        <w:ind w:firstLine="0"/>
+      </w:pPr>
+      <w:r>
+        <w:rPr>
+          <w:rFonts w:ascii="Calibri" w:hAnsi="Calibri"/>
+          <w:b/>
+          <w:color w:val="00467F"/>
+          <w:sz w:val="26"/>
+        </w:rPr>
+        <w:t>5.1 Visão Geral e Organização</w:t>
+      </w:r>
+    </w:p>
+    <w:p>
+      <w:pPr>
         <w:pStyle w:val="Heading3"/>
         <w:ind w:firstLine="0"/>
       </w:pPr>
@@ -7402,7 +7963,7 @@
           <w:color w:val="00467F"/>
           <w:sz w:val="24"/>
         </w:rPr>
-        <w:t>5.1 Visão Geral e Evidências de Desenvolvimento</w:t>
+        <w:t>5.1.1 Evidências de Desenvolvimento</w:t>
       </w:r>
     </w:p>
     <w:p>
@@ -7561,7 +8122,7 @@
           <w:color w:val="00467F"/>
           <w:sz w:val="24"/>
         </w:rPr>
-        <w:t>5.2 Organização do Repositório</w:t>
+        <w:t>5.1.2 Organização do Repositório</w:t>
       </w:r>
     </w:p>
     <w:p>
@@ -7608,7 +8169,22 @@
           <w:color w:val="00467F"/>
           <w:sz w:val="24"/>
         </w:rPr>
-        <w:t>5.3 Linguagem de Domínio Específico — DSL .bed</w:t>
+        <w:t>5.2 A Linguagem .bed e seu Compilador</w:t>
+      </w:r>
+    </w:p>
+    <w:p>
+      <w:pPr>
+        <w:pStyle w:val="Heading3"/>
+        <w:ind w:firstLine="0"/>
+      </w:pPr>
+      <w:r>
+        <w:rPr>
+          <w:rFonts w:ascii="Calibri" w:hAnsi="Calibri"/>
+          <w:b/>
+          <w:color w:val="00467F"/>
+          <w:sz w:val="24"/>
+        </w:rPr>
+        <w:t>5.2.1 Linguagem de Domínio Específico — DSL .bed</w:t>
       </w:r>
     </w:p>
     <w:p>
@@ -7687,7 +8263,7 @@
           <w:color w:val="00467F"/>
           <w:sz w:val="24"/>
         </w:rPr>
-        <w:t>5.4 Compilador ANTLR4 — Fluxo Interno</w:t>
+        <w:t>5.2.2 Compilador ANTLR4 — Fluxo Interno</w:t>
       </w:r>
     </w:p>
     <w:p>
@@ -7962,6 +8538,21 @@
     </w:p>
     <w:p>
       <w:pPr>
+        <w:pStyle w:val="Heading2"/>
+        <w:ind w:firstLine="0"/>
+      </w:pPr>
+      <w:r>
+        <w:rPr>
+          <w:rFonts w:ascii="Calibri" w:hAnsi="Calibri"/>
+          <w:b/>
+          <w:color w:val="00467F"/>
+          <w:sz w:val="26"/>
+        </w:rPr>
+        <w:t>5.3 Motores de Geração Geométrica</w:t>
+      </w:r>
+    </w:p>
+    <w:p>
+      <w:pPr>
         <w:pStyle w:val="Heading3"/>
         <w:ind w:firstLine="0"/>
       </w:pPr>
@@ -7972,7 +8563,7 @@
           <w:color w:val="00467F"/>
           <w:sz w:val="24"/>
         </w:rPr>
-        <w:t>5.5 Motor de Modelagem Blender</w:t>
+        <w:t>5.3.1 Motor de Modelagem Blender</w:t>
       </w:r>
     </w:p>
     <w:p>
@@ -8003,7 +8594,7 @@
           <w:color w:val="00467F"/>
           <w:sz w:val="24"/>
         </w:rPr>
-        <w:t>5.6 Motor Python Puro</w:t>
+        <w:t>5.3.2 Motor Python Puro</w:t>
       </w:r>
     </w:p>
     <w:p>
@@ -8146,7 +8737,7 @@
           <w:color w:val="00467F"/>
           <w:sz w:val="24"/>
         </w:rPr>
-        <w:t>5.7 Sistema de Corte do Leito 3D em Plano 2D</w:t>
+        <w:t>5.3.3 Sistema de Corte do Leito 3D em Plano 2D</w:t>
       </w:r>
     </w:p>
     <w:p>
@@ -8633,6 +9224,21 @@
     </w:p>
     <w:p>
       <w:pPr>
+        <w:pStyle w:val="Heading2"/>
+        <w:ind w:firstLine="0"/>
+      </w:pPr>
+      <w:r>
+        <w:rPr>
+          <w:rFonts w:ascii="Calibri" w:hAnsi="Calibri"/>
+          <w:b/>
+          <w:color w:val="00467F"/>
+          <w:sz w:val="26"/>
+        </w:rPr>
+        <w:t>5.4 Interfaces, Rastreabilidade e Qualidade</w:t>
+      </w:r>
+    </w:p>
+    <w:p>
+      <w:pPr>
         <w:pStyle w:val="Heading3"/>
         <w:ind w:firstLine="0"/>
       </w:pPr>
@@ -8643,7 +9249,7 @@
           <w:color w:val="00467F"/>
           <w:sz w:val="24"/>
         </w:rPr>
-        <w:t>5.8 Interface Web — Dashboard React</w:t>
+        <w:t>5.4.1 Interfaces de Uso: Web, Desktop e Terminal</w:t>
       </w:r>
     </w:p>
     <w:p>
@@ -8659,7 +9265,7 @@
           <w:i w:val="0"/>
           <w:sz w:val="24"/>
         </w:rPr>
-        <w:t>A interface web é uma SPA (Single Page Application) em React 18 com Vite. As principais dependências são: axios (HTTP centralizado em frontend/src/services/ api.js), @react-three/fiber + @react-three/drei + three.js (visualização 3D de STL no navegador) e recharts (gráficos). A navegação por sidebar expõe: Criar Leito, Pipeline Completo, Simulação CFD, Casos CFD, Jobs e Resultados.</w:t>
+        <w:t>O sistema oferece três superfícies de uso equivalentes — web, desktop e terminal —, todas apoiadas no mesmo motor de geração. A interface web é descrita a seguir, seguida do visualizador desktop e da interface de linha de comando.</w:t>
       </w:r>
     </w:p>
     <w:p>
@@ -8675,7 +9281,7 @@
           <w:i w:val="0"/>
           <w:sz w:val="24"/>
         </w:rPr>
-        <w:t>O formulário de criação parametriza diâmetro, altura, tipo e diâmetro de partículas, método de empacotamento e regime CFD. O monitor de jobs faz polling assíncrono a GET /api/job/{job_id}, exibindo barra de progresso e logs em tempo real. O visualizador de modelos renderiza o STL com controles orbitais Three.js. Contextos LanguageContext e ThemeContext permitem alternar idioma e tema sem afetar o contrato HTTP.</w:t>
+        <w:t>A interface web é uma SPA (Single Page Application) em React 18 com Vite. As principais dependências são: axios (HTTP centralizado em frontend/src/services/ api.js), @react-three/fiber + @react-three/drei + three.js (visualização 3D de STL no navegador) e recharts (gráficos). A navegação por sidebar expõe: Criar Leito, Pipeline Completo, Simulação CFD, Casos CFD, Jobs e Resultados.</w:t>
       </w:r>
     </w:p>
     <w:p>
@@ -8691,7 +9297,103 @@
           <w:i w:val="0"/>
           <w:sz w:val="24"/>
         </w:rPr>
+        <w:t>O formulário de criação parametriza diâmetro, altura, tipo e diâmetro de partículas, método de empacotamento e regime CFD. O monitor de jobs faz polling assíncrono a GET /api/job/{job_id}, exibindo barra de progresso e logs em tempo real. O visualizador de modelos renderiza o STL com controles orbitais Three.js. Contextos LanguageContext e ThemeContext permitem alternar idioma e tema sem afetar o contrato HTTP.</w:t>
+      </w:r>
+    </w:p>
+    <w:p>
+      <w:pPr>
+        <w:spacing w:before="0" w:after="120"/>
+        <w:ind w:firstLine="709"/>
+        <w:jc w:val="both"/>
+      </w:pPr>
+      <w:r>
+        <w:rPr>
+          <w:rFonts w:ascii="Calibri" w:hAnsi="Calibri"/>
+          <w:b w:val="0"/>
+          <w:i w:val="0"/>
+          <w:sz w:val="24"/>
+        </w:rPr>
         <w:t>Na versão consolidada, o frontend recebeu +40 arquivos novos em frontend/src/, incluindo telas de comparação, histórico de simulações, gerenciador de templates, modal informativo e paginação de resultados.</w:t>
+      </w:r>
+    </w:p>
+    <w:p>
+      <w:pPr>
+        <w:spacing w:before="0" w:after="120"/>
+        <w:ind w:firstLine="709"/>
+        <w:jc w:val="both"/>
+      </w:pPr>
+      <w:r>
+        <w:rPr>
+          <w:rFonts w:ascii="Calibri" w:hAnsi="Calibri"/>
+          <w:b w:val="0"/>
+          <w:i w:val="0"/>
+          <w:sz w:val="24"/>
+        </w:rPr>
+        <w:t>O módulo scripts/python_modeling/mesh_viewer/ oferece uma aplicação desktop (scientific_app.py) com câmera configurável (camera_controller.py), plano de corte interativo (cut_controller.CutController, geometry_core.crop_mesh_slab()), controle de visibilidade de componentes (mesh_visibility_controller.py) e sobreposição de UI (ui_overlay_manager.py). Este visualizador é net-new em relação à primeira avaliação e complementa o viewer web, permitindo inspecionar o corte 2D em ambiente desktop sem abrir o navegador.</w:t>
+      </w:r>
+    </w:p>
+    <w:p>
+      <w:pPr>
+        <w:spacing w:before="0" w:after="120"/>
+        <w:ind w:firstLine="709"/>
+        <w:jc w:val="both"/>
+      </w:pPr>
+      <w:r>
+        <w:rPr>
+          <w:rFonts w:ascii="Calibri" w:hAnsi="Calibri"/>
+          <w:b w:val="0"/>
+          <w:i w:val="0"/>
+          <w:sz w:val="24"/>
+        </w:rPr>
+        <w:t>O CLI Wizard (dsl/cli/ + wizard_cli.py), implementado com Typer (net-new), suporta dois modos:</w:t>
+      </w:r>
+    </w:p>
+    <w:p>
+      <w:pPr>
+        <w:spacing w:before="0" w:after="60"/>
+        <w:ind w:hanging="283" w:left="992"/>
+        <w:jc w:val="both"/>
+      </w:pPr>
+      <w:r>
+        <w:rPr>
+          <w:rFonts w:ascii="Calibri" w:hAnsi="Calibri"/>
+          <w:b w:val="0"/>
+          <w:i w:val="0"/>
+          <w:sz w:val="24"/>
+        </w:rPr>
+        <w:t>• Interativo: perguntas ao usuário sobre parâmetros; revisão antes de gerar.</w:t>
+      </w:r>
+    </w:p>
+    <w:p>
+      <w:pPr>
+        <w:spacing w:before="0" w:after="60"/>
+        <w:ind w:hanging="283" w:left="992"/>
+        <w:jc w:val="both"/>
+      </w:pPr>
+      <w:r>
+        <w:rPr>
+          <w:rFonts w:ascii="Calibri" w:hAnsi="Calibri"/>
+          <w:b w:val="0"/>
+          <w:i w:val="0"/>
+          <w:sz w:val="24"/>
+        </w:rPr>
+        <w:t>• Headless: todos os parâmetros via flags; sem interação. Exemplo: python3 -m cli --load-json leito.bed.json --pure-python --no-prompt</w:t>
+      </w:r>
+    </w:p>
+    <w:p>
+      <w:pPr>
+        <w:spacing w:before="0" w:after="120"/>
+        <w:ind w:firstLine="709"/>
+        <w:jc w:val="both"/>
+      </w:pPr>
+      <w:r>
+        <w:rPr>
+          <w:rFonts w:ascii="Calibri" w:hAnsi="Calibri"/>
+          <w:b w:val="0"/>
+          <w:i w:val="0"/>
+          <w:sz w:val="24"/>
+        </w:rPr>
+        <w:t>O despacho (dispatch_main()) detecta flags legadas e roteia ao executor correto.</w:t>
       </w:r>
     </w:p>
     <w:p>
@@ -8706,7 +9408,7 @@
           <w:color w:val="00467F"/>
           <w:sz w:val="24"/>
         </w:rPr>
-        <w:t>5.9 Visualizador Desktop</w:t>
+        <w:t>5.4.2 Rastreabilidade, Templates e Jobs</w:t>
       </w:r>
     </w:p>
     <w:p>
@@ -8722,7 +9424,167 @@
           <w:i w:val="0"/>
           <w:sz w:val="24"/>
         </w:rPr>
-        <w:t>O módulo scripts/python_modeling/mesh_viewer/ oferece uma aplicação desktop (scientific_app.py) com câmera configurável (camera_controller.py), plano de corte interativo (cut_controller.CutController, geometry_core.crop_mesh_slab()), controle de visibilidade de componentes (mesh_visibility_controller.py) e sobreposição de UI (ui_overlay_manager.py). Este visualizador é net-new em relação à primeira avaliação e complementa o viewer web, permitindo inspecionar o corte 2D em ambiente desktop sem abrir o navegador.</w:t>
+        <w:t>Dois componentes complementares garantem rastreabilidade completa:</w:t>
+      </w:r>
+    </w:p>
+    <w:p>
+      <w:pPr>
+        <w:spacing w:before="0" w:after="60"/>
+        <w:ind w:hanging="283" w:left="992"/>
+        <w:jc w:val="both"/>
+      </w:pPr>
+      <w:r>
+        <w:rPr>
+          <w:rFonts w:ascii="Calibri" w:hAnsi="Calibri"/>
+          <w:b w:val="0"/>
+          <w:i w:val="0"/>
+          <w:sz w:val="24"/>
+        </w:rPr>
+        <w:t>• packing_seed.py — resolve o seed de empacotamento: seed fixo no .bed.json</w:t>
+      </w:r>
+    </w:p>
+    <w:p>
+      <w:pPr>
+        <w:spacing w:before="0" w:after="40"/>
+        <w:ind w:firstLine="0" w:left="709"/>
+        <w:jc w:val="left"/>
+      </w:pPr>
+      <w:r>
+        <w:rPr>
+          <w:rFonts w:ascii="Courier New" w:hAnsi="Courier New"/>
+          <w:b w:val="0"/>
+          <w:i w:val="0"/>
+          <w:sz w:val="20"/>
+        </w:rPr>
+        <w:t xml:space="preserve">    → comportamento determinístico; seed ausente → gerado automaticamente e</w:t>
+      </w:r>
+    </w:p>
+    <w:p>
+      <w:pPr>
+        <w:spacing w:before="0" w:after="40"/>
+        <w:ind w:firstLine="0" w:left="709"/>
+        <w:jc w:val="left"/>
+      </w:pPr>
+      <w:r>
+        <w:rPr>
+          <w:rFonts w:ascii="Courier New" w:hAnsi="Courier New"/>
+          <w:b w:val="0"/>
+          <w:i w:val="0"/>
+          <w:sz w:val="20"/>
+        </w:rPr>
+        <w:t xml:space="preserve">    registrado no sidecar. Verificado por 3 funções de teste</w:t>
+      </w:r>
+    </w:p>
+    <w:p>
+      <w:pPr>
+        <w:spacing w:before="0" w:after="40"/>
+        <w:ind w:firstLine="0" w:left="709"/>
+        <w:jc w:val="left"/>
+      </w:pPr>
+      <w:r>
+        <w:rPr>
+          <w:rFonts w:ascii="Courier New" w:hAnsi="Courier New"/>
+          <w:b w:val="0"/>
+          <w:i w:val="0"/>
+          <w:sz w:val="20"/>
+        </w:rPr>
+        <w:t xml:space="preserve">    (test_resolve_seed_*, test_packing_same_seed_same_centers).</w:t>
+      </w:r>
+    </w:p>
+    <w:p>
+      <w:pPr>
+        <w:spacing w:before="0" w:after="60"/>
+        <w:ind w:hanging="283" w:left="992"/>
+        <w:jc w:val="both"/>
+      </w:pPr>
+      <w:r>
+        <w:rPr>
+          <w:rFonts w:ascii="Calibri" w:hAnsi="Calibri"/>
+          <w:b w:val="0"/>
+          <w:i w:val="0"/>
+          <w:sz w:val="24"/>
+        </w:rPr>
+        <w:t>• bedflow_export_metadata.py — produz o sidecar JSON por artefato: n_particles,</w:t>
+      </w:r>
+    </w:p>
+    <w:p>
+      <w:pPr>
+        <w:spacing w:before="0" w:after="40"/>
+        <w:ind w:firstLine="0" w:left="709"/>
+        <w:jc w:val="left"/>
+      </w:pPr>
+      <w:r>
+        <w:rPr>
+          <w:rFonts w:ascii="Courier New" w:hAnsi="Courier New"/>
+          <w:b w:val="0"/>
+          <w:i w:val="0"/>
+          <w:sz w:val="20"/>
+        </w:rPr>
+        <w:t xml:space="preserve">    packing_method, porosity_estimate, elapsed_sec, validation_ok (zero colisões),</w:t>
+      </w:r>
+    </w:p>
+    <w:p>
+      <w:pPr>
+        <w:spacing w:before="0" w:after="40"/>
+        <w:ind w:firstLine="0" w:left="709"/>
+        <w:jc w:val="left"/>
+      </w:pPr>
+      <w:r>
+        <w:rPr>
+          <w:rFonts w:ascii="Courier New" w:hAnsi="Courier New"/>
+          <w:b w:val="0"/>
+          <w:i w:val="0"/>
+          <w:sz w:val="20"/>
+        </w:rPr>
+        <w:t xml:space="preserve">    hash (SHA-256 do .bed.json), particle_centers_preview.</w:t>
+      </w:r>
+    </w:p>
+    <w:p>
+      <w:pPr>
+        <w:spacing w:before="0" w:after="120"/>
+        <w:ind w:firstLine="709"/>
+        <w:jc w:val="both"/>
+      </w:pPr>
+      <w:r>
+        <w:rPr>
+          <w:rFonts w:ascii="Calibri" w:hAnsi="Calibri"/>
+          <w:b w:val="0"/>
+          <w:i w:val="0"/>
+          <w:sz w:val="24"/>
+        </w:rPr>
+        <w:t>Esta combinação garante que qualquer STL gerado seja auditável: dado o sidecar, é possível recriar exatamente o mesmo STL com a mesma seed e o mesmo .bed.json.</w:t>
+      </w:r>
+    </w:p>
+    <w:p>
+      <w:pPr>
+        <w:spacing w:before="0" w:after="120"/>
+        <w:ind w:firstLine="709"/>
+        <w:jc w:val="both"/>
+      </w:pPr>
+      <w:r>
+        <w:rPr>
+          <w:rFonts w:ascii="Calibri" w:hAnsi="Calibri"/>
+          <w:b w:val="0"/>
+          <w:i w:val="0"/>
+          <w:sz w:val="24"/>
+        </w:rPr>
+        <w:t>O sistema de templates (routes_templates.py, tabela BedTemplate em SQLite) persiste configurações de leito nomeadas com CRUD completo (POST/GET/PUT/DELETE /api/templates). O diretório dsl/wizard_templates/ contém 19 fixtures, várias delas de cenários pseudo-2D e slice.</w:t>
+      </w:r>
+    </w:p>
+    <w:p>
+      <w:pPr>
+        <w:spacing w:before="0" w:after="120"/>
+        <w:ind w:firstLine="709"/>
+        <w:jc w:val="both"/>
+      </w:pPr>
+      <w:r>
+        <w:rPr>
+          <w:rFonts w:ascii="Calibri" w:hAnsi="Calibri"/>
+          <w:b w:val="0"/>
+          <w:i w:val="0"/>
+          <w:sz w:val="24"/>
+        </w:rPr>
+        <w:t>O sistema de jobs (mesh_job_runner.py) usa fila single-slot (_MESH_LOCK): apenas um job de geração executa de cada vez, evitando contention. Jobs adicionais ficam com status queued e são promovidos automaticamente. O estado é persistido na tabela JobRecord e consultado por GET /api/job/{id} em tempo constante.</w:t>
       </w:r>
     </w:p>
     <w:p>
@@ -8737,7 +9599,7 @@
           <w:color w:val="00467F"/>
           <w:sz w:val="24"/>
         </w:rPr>
-        <w:t>5.10 Interface de Terminal — CLI Wizard</w:t>
+        <w:t>5.4.3 Backend, Pipeline OpenFOAM e Testes Automatizados</w:t>
       </w:r>
     </w:p>
     <w:p>
@@ -8753,7 +9615,39 @@
           <w:i w:val="0"/>
           <w:sz w:val="24"/>
         </w:rPr>
-        <w:t>O CLI Wizard (dsl/cli/ + wizard_cli.py), implementado com Typer (net-new), suporta dois modos:</w:t>
+        <w:t>O backend (backend/app/main.py) escuta na porta 3000. Routers por domínio: routes.py (compilação, geração, jobs), routes_database.py (CRUD de leitos e simulações), routes_integrated.py (fluxo compile→generate→CFD), routes_templates.py e routes_cfd.py.</w:t>
+      </w:r>
+    </w:p>
+    <w:p>
+      <w:pPr>
+        <w:spacing w:before="0" w:after="120"/>
+        <w:ind w:firstLine="709"/>
+        <w:jc w:val="both"/>
+      </w:pPr>
+      <w:r>
+        <w:rPr>
+          <w:rFonts w:ascii="Calibri" w:hAnsi="Calibri"/>
+          <w:b w:val="0"/>
+          <w:i w:val="0"/>
+          <w:sz w:val="24"/>
+        </w:rPr>
+        <w:t>O pipeline OpenFOAM (scripts/openfoam_scripts/) configura blockMeshDict, snappyHexMeshDict e condições de contorno a partir do .bed.json e do STL. A pasta tutorial/ contém três casos de referência para validação: cavity-icoFoam (benchmark de Ghia et al., 1982), channel-simpleFoam e sphere-snappyHexMesh.</w:t>
+      </w:r>
+    </w:p>
+    <w:p>
+      <w:pPr>
+        <w:spacing w:before="0" w:after="120"/>
+        <w:ind w:firstLine="709"/>
+        <w:jc w:val="both"/>
+      </w:pPr>
+      <w:r>
+        <w:rPr>
+          <w:rFonts w:ascii="Calibri" w:hAnsi="Calibri"/>
+          <w:b w:val="0"/>
+          <w:i w:val="0"/>
+          <w:sz w:val="24"/>
+        </w:rPr>
+        <w:t>O pytest.ini configura testpaths = scripts/python_modeling/tests. A suíte cresceu de 6 para 27 arquivos de teste entre a primeira avaliação e a etapa atual. Distribuição por área:</w:t>
       </w:r>
     </w:p>
     <w:p>
@@ -8769,7 +9663,7 @@
           <w:i w:val="0"/>
           <w:sz w:val="24"/>
         </w:rPr>
-        <w:t>• Interativo: perguntas ao usuário sobre parâmetros; revisão antes de gerar.</w:t>
+        <w:t>• Corte fino (thin slice)         — 29 funções (3 arquivos).</w:t>
       </w:r>
     </w:p>
     <w:p>
@@ -8785,7 +9679,135 @@
           <w:i w:val="0"/>
           <w:sz w:val="24"/>
         </w:rPr>
-        <w:t>• Headless: todos os parâmetros via flags; sem interação. Exemplo: python3 -m cli --load-json leito.bed.json --pure-python --no-prompt</w:t>
+        <w:t>• Modos de geometria interna      — 12 funções (test_bed_internal_modes).</w:t>
+      </w:r>
+    </w:p>
+    <w:p>
+      <w:pPr>
+        <w:spacing w:before="0" w:after="60"/>
+        <w:ind w:hanging="283" w:left="992"/>
+        <w:jc w:val="both"/>
+      </w:pPr>
+      <w:r>
+        <w:rPr>
+          <w:rFonts w:ascii="Calibri" w:hAnsi="Calibri"/>
+          <w:b w:val="0"/>
+          <w:i w:val="0"/>
+          <w:sz w:val="24"/>
+        </w:rPr>
+        <w:t>• Cálculos geométricos gerais     — 13 funções (test_geometry_modes).</w:t>
+      </w:r>
+    </w:p>
+    <w:p>
+      <w:pPr>
+        <w:spacing w:before="0" w:after="60"/>
+        <w:ind w:hanging="283" w:left="992"/>
+        <w:jc w:val="both"/>
+      </w:pPr>
+      <w:r>
+        <w:rPr>
+          <w:rFonts w:ascii="Calibri" w:hAnsi="Calibri"/>
+          <w:b w:val="0"/>
+          <w:i w:val="0"/>
+          <w:sz w:val="24"/>
+        </w:rPr>
+        <w:t>• Contratos de geometria          — 7 funções  (test_geometry_contract_*).</w:t>
+      </w:r>
+    </w:p>
+    <w:p>
+      <w:pPr>
+        <w:spacing w:before="0" w:after="60"/>
+        <w:ind w:hanging="283" w:left="992"/>
+        <w:jc w:val="both"/>
+      </w:pPr>
+      <w:r>
+        <w:rPr>
+          <w:rFonts w:ascii="Calibri" w:hAnsi="Calibri"/>
+          <w:b w:val="0"/>
+          <w:i w:val="0"/>
+          <w:sz w:val="24"/>
+        </w:rPr>
+        <w:t>• Seed e reprodutibilidade        — 3 funções  (test_packing_seed).</w:t>
+      </w:r>
+    </w:p>
+    <w:p>
+      <w:pPr>
+        <w:spacing w:before="0" w:after="60"/>
+        <w:ind w:hanging="283" w:left="992"/>
+        <w:jc w:val="both"/>
+      </w:pPr>
+      <w:r>
+        <w:rPr>
+          <w:rFonts w:ascii="Calibri" w:hAnsi="Calibri"/>
+          <w:b w:val="0"/>
+          <w:i w:val="0"/>
+          <w:sz w:val="24"/>
+        </w:rPr>
+        <w:t>• STL e fusão de malhas           — 4 funções  (test_stl_mesh_utils).</w:t>
+      </w:r>
+    </w:p>
+    <w:p>
+      <w:pPr>
+        <w:spacing w:before="0" w:after="60"/>
+        <w:ind w:hanging="283" w:left="992"/>
+        <w:jc w:val="both"/>
+      </w:pPr>
+      <w:r>
+        <w:rPr>
+          <w:rFonts w:ascii="Calibri" w:hAnsi="Calibri"/>
+          <w:b w:val="0"/>
+          <w:i w:val="0"/>
+          <w:sz w:val="24"/>
+        </w:rPr>
+        <w:t>• Solver DEM                      — 4 funções  (test_dem_solver).</w:t>
+      </w:r>
+    </w:p>
+    <w:p>
+      <w:pPr>
+        <w:spacing w:before="0" w:after="60"/>
+        <w:ind w:hanging="283" w:left="992"/>
+        <w:jc w:val="both"/>
+      </w:pPr>
+      <w:r>
+        <w:rPr>
+          <w:rFonts w:ascii="Calibri" w:hAnsi="Calibri"/>
+          <w:b w:val="0"/>
+          <w:i w:val="0"/>
+          <w:sz w:val="24"/>
+        </w:rPr>
+        <w:t>• Pipeline packed bed STL         — 7 funções  (test_packed_bed_stl).</w:t>
+      </w:r>
+    </w:p>
+    <w:p>
+      <w:pPr>
+        <w:spacing w:before="0" w:after="60"/>
+        <w:ind w:hanging="283" w:left="992"/>
+        <w:jc w:val="both"/>
+      </w:pPr>
+      <w:r>
+        <w:rPr>
+          <w:rFonts w:ascii="Calibri" w:hAnsi="Calibri"/>
+          <w:b w:val="0"/>
+          <w:i w:val="0"/>
+          <w:sz w:val="24"/>
+        </w:rPr>
+        <w:t>• Integração DSL/compilador       — 7 funções  (dsl/tests/).</w:t>
+      </w:r>
+    </w:p>
+    <w:p>
+      <w:pPr>
+        <w:spacing w:before="0" w:after="60"/>
+        <w:ind w:hanging="283" w:left="992"/>
+        <w:jc w:val="both"/>
+      </w:pPr>
+      <w:r>
+        <w:rPr>
+          <w:rFonts w:ascii="Calibri" w:hAnsi="Calibri"/>
+          <w:b w:val="0"/>
+          <w:i w:val="0"/>
+          <w:sz w:val="24"/>
+        </w:rPr>
+        <w:t>• Integração API/banco            — 9 funções  (backend/test_*.py).</w:t>
       </w:r>
     </w:p>
     <w:p>
@@ -8801,7 +9823,133 @@
           <w:i w:val="0"/>
           <w:sz w:val="24"/>
         </w:rPr>
-        <w:t>O despacho (dispatch_main()) detecta flags legadas e roteia ao executor correto.</w:t>
+        <w:t>Por fim, cabe destacar que a arquitetura da versão consolidada favorece o reúso, consolidando o projeto como um modelo de referência. Esse reúso apresenta graus distintos de maturidade:</w:t>
+      </w:r>
+    </w:p>
+    <w:p>
+      <w:pPr>
+        <w:spacing w:before="0" w:after="120"/>
+        <w:ind w:firstLine="709"/>
+        <w:jc w:val="both"/>
+      </w:pPr>
+      <w:r>
+        <w:rPr>
+          <w:rFonts w:ascii="Calibri" w:hAnsi="Calibri"/>
+          <w:b w:val="0"/>
+          <w:i w:val="0"/>
+          <w:sz w:val="24"/>
+        </w:rPr>
+        <w:t>Já implementado: DSL e compilador desacoplados do motor; dois motores intercambiáveis pela mesma DSL; separação dsl/scripts/backend/frontend; documento docs/tcc2/USO_COMO_TEMPLATE.md.</w:t>
+      </w:r>
+    </w:p>
+    <w:p>
+      <w:pPr>
+        <w:spacing w:before="0" w:after="120"/>
+        <w:ind w:firstLine="709"/>
+        <w:jc w:val="both"/>
+      </w:pPr>
+      <w:r>
+        <w:rPr>
+          <w:rFonts w:ascii="Calibri" w:hAnsi="Calibri"/>
+          <w:b w:val="0"/>
+          <w:i w:val="0"/>
+          <w:sz w:val="24"/>
+        </w:rPr>
+        <w:t>Facilitado pela arquitetura (não pronto): adicionar um terceiro motor (basta consumir o .bed.json e produzir STL + sidecar no mesmo contrato); criar novos exportadores; reusar apenas a DSL/compilador.</w:t>
+      </w:r>
+    </w:p>
+    <w:p>
+      <w:pPr>
+        <w:spacing w:before="0" w:after="120"/>
+        <w:ind w:firstLine="709"/>
+        <w:jc w:val="both"/>
+      </w:pPr>
+      <w:r>
+        <w:rPr>
+          <w:rFonts w:ascii="Calibri" w:hAnsi="Calibri"/>
+          <w:b w:val="0"/>
+          <w:i w:val="0"/>
+          <w:sz w:val="24"/>
+        </w:rPr>
+        <w:t>Trabalho futuro: variantes com Maya 3D, Godot, FreeCAD ou outros motores — viabilizadas pela arquitetura, mas não implementadas.</w:t>
+      </w:r>
+    </w:p>
+    <w:p>
+      <w:pPr>
+        <w:spacing w:before="0" w:after="120"/>
+        <w:ind w:firstLine="709"/>
+        <w:jc w:val="both"/>
+      </w:pPr>
+      <w:r>
+        <w:rPr>
+          <w:rFonts w:ascii="Calibri" w:hAnsi="Calibri"/>
+          <w:b w:val="0"/>
+          <w:i w:val="0"/>
+          <w:sz w:val="24"/>
+        </w:rPr>
+        <w:t>O projeto evoluiu de uma ferramenta fechada para um modelo de referência: a especificação declarativa e o contrato de saída (STL + sidecar JSON) desacoplam a descrição do problema do motor que o resolve, de modo que a coexistência de um motor em Blender e de um motor em Python puro, ambos acionados pelo mesmo arquivo .bed, demonstra concretamente essa capacidade de substituição e consolida o princípio de extensibilidade que orienta a arquitetura do sistema.</w:t>
+      </w:r>
+    </w:p>
+    <w:p>
+      <w:pPr>
+        <w:spacing w:before="0" w:after="120"/>
+        <w:ind w:firstLine="709"/>
+        <w:jc w:val="both"/>
+      </w:pPr>
+      <w:r>
+        <w:rPr>
+          <w:rFonts w:ascii="Calibri" w:hAnsi="Calibri"/>
+          <w:b w:val="0"/>
+          <w:i w:val="0"/>
+          <w:sz w:val="24"/>
+        </w:rPr>
+        <w:t>Todos esses componentes — gramática, compilador, motores, API, interfaces e testes — formam o sistema descrito no Capítulo 4. Para torná-los concretos e verificáveis, o próximo capítulo percorre os principais fluxos de uso do BEDFLOW-ATLAS em cenários reais, da criação de um leito pelo formulário web até o corte bidimensional pelo visualizador desktop.</w:t>
+      </w:r>
+    </w:p>
+    <w:p>
+      <w:pPr>
+        <w:pStyle w:val="Heading1"/>
+        <w:ind w:firstLine="0"/>
+      </w:pPr>
+      <w:r>
+        <w:rPr>
+          <w:rFonts w:ascii="Calibri" w:hAnsi="Calibri"/>
+          <w:b/>
+          <w:color w:val="00467F"/>
+          <w:sz w:val="32"/>
+        </w:rPr>
+        <w:t>6 DEMONSTRAÇÃO</w:t>
+      </w:r>
+    </w:p>
+    <w:p>
+      <w:pPr>
+        <w:spacing w:before="0" w:after="120"/>
+        <w:ind w:firstLine="709"/>
+        <w:jc w:val="both"/>
+      </w:pPr>
+      <w:r>
+        <w:rPr>
+          <w:rFonts w:ascii="Calibri" w:hAnsi="Calibri"/>
+          <w:b w:val="0"/>
+          <w:i w:val="0"/>
+          <w:sz w:val="24"/>
+        </w:rPr>
+        <w:t>Este capítulo apresenta os fluxos de execução do BEDFLOW-ATLAS de forma prática, com espaços reservados para as capturas de tela das principais etapas. Os fluxos estão organizados em três percursos complementares: via interface web, via terminal e o ciclo de reprodutibilidade. Cada placeholder indica o print correspondente, com descrição do contexto esperado.</w:t>
+      </w:r>
+    </w:p>
+    <w:p>
+      <w:pPr>
+        <w:pStyle w:val="Heading2"/>
+        <w:ind w:firstLine="0"/>
+      </w:pPr>
+      <w:r>
+        <w:rPr>
+          <w:rFonts w:ascii="Calibri" w:hAnsi="Calibri"/>
+          <w:b/>
+          <w:color w:val="00467F"/>
+          <w:sz w:val="26"/>
+        </w:rPr>
+        <w:t>6.1 Fluxo via Interface Web</w:t>
       </w:r>
     </w:p>
     <w:p>
@@ -8816,593 +9964,7 @@
           <w:color w:val="00467F"/>
           <w:sz w:val="24"/>
         </w:rPr>
-        <w:t>5.11 Rastreabilidade por Seed e Hash</w:t>
-      </w:r>
-    </w:p>
-    <w:p>
-      <w:pPr>
-        <w:spacing w:before="0" w:after="120"/>
-        <w:ind w:firstLine="709"/>
-        <w:jc w:val="both"/>
-      </w:pPr>
-      <w:r>
-        <w:rPr>
-          <w:rFonts w:ascii="Calibri" w:hAnsi="Calibri"/>
-          <w:b w:val="0"/>
-          <w:i w:val="0"/>
-          <w:sz w:val="24"/>
-        </w:rPr>
-        <w:t>Dois componentes complementares garantem rastreabilidade completa:</w:t>
-      </w:r>
-    </w:p>
-    <w:p>
-      <w:pPr>
-        <w:spacing w:before="0" w:after="60"/>
-        <w:ind w:hanging="283" w:left="992"/>
-        <w:jc w:val="both"/>
-      </w:pPr>
-      <w:r>
-        <w:rPr>
-          <w:rFonts w:ascii="Calibri" w:hAnsi="Calibri"/>
-          <w:b w:val="0"/>
-          <w:i w:val="0"/>
-          <w:sz w:val="24"/>
-        </w:rPr>
-        <w:t>• packing_seed.py — resolve o seed de empacotamento: seed fixo no .bed.json</w:t>
-      </w:r>
-    </w:p>
-    <w:p>
-      <w:pPr>
-        <w:spacing w:before="0" w:after="40"/>
-        <w:ind w:firstLine="0" w:left="709"/>
-        <w:jc w:val="left"/>
-      </w:pPr>
-      <w:r>
-        <w:rPr>
-          <w:rFonts w:ascii="Courier New" w:hAnsi="Courier New"/>
-          <w:b w:val="0"/>
-          <w:i w:val="0"/>
-          <w:sz w:val="20"/>
-        </w:rPr>
-        <w:t xml:space="preserve">    → comportamento determinístico; seed ausente → gerado automaticamente e</w:t>
-      </w:r>
-    </w:p>
-    <w:p>
-      <w:pPr>
-        <w:spacing w:before="0" w:after="40"/>
-        <w:ind w:firstLine="0" w:left="709"/>
-        <w:jc w:val="left"/>
-      </w:pPr>
-      <w:r>
-        <w:rPr>
-          <w:rFonts w:ascii="Courier New" w:hAnsi="Courier New"/>
-          <w:b w:val="0"/>
-          <w:i w:val="0"/>
-          <w:sz w:val="20"/>
-        </w:rPr>
-        <w:t xml:space="preserve">    registrado no sidecar. Verificado por 3 funções de teste</w:t>
-      </w:r>
-    </w:p>
-    <w:p>
-      <w:pPr>
-        <w:spacing w:before="0" w:after="40"/>
-        <w:ind w:firstLine="0" w:left="709"/>
-        <w:jc w:val="left"/>
-      </w:pPr>
-      <w:r>
-        <w:rPr>
-          <w:rFonts w:ascii="Courier New" w:hAnsi="Courier New"/>
-          <w:b w:val="0"/>
-          <w:i w:val="0"/>
-          <w:sz w:val="20"/>
-        </w:rPr>
-        <w:t xml:space="preserve">    (test_resolve_seed_*, test_packing_same_seed_same_centers).</w:t>
-      </w:r>
-    </w:p>
-    <w:p>
-      <w:pPr>
-        <w:spacing w:before="0" w:after="60"/>
-        <w:ind w:hanging="283" w:left="992"/>
-        <w:jc w:val="both"/>
-      </w:pPr>
-      <w:r>
-        <w:rPr>
-          <w:rFonts w:ascii="Calibri" w:hAnsi="Calibri"/>
-          <w:b w:val="0"/>
-          <w:i w:val="0"/>
-          <w:sz w:val="24"/>
-        </w:rPr>
-        <w:t>• bedflow_export_metadata.py — produz o sidecar JSON por artefato: n_particles,</w:t>
-      </w:r>
-    </w:p>
-    <w:p>
-      <w:pPr>
-        <w:spacing w:before="0" w:after="40"/>
-        <w:ind w:firstLine="0" w:left="709"/>
-        <w:jc w:val="left"/>
-      </w:pPr>
-      <w:r>
-        <w:rPr>
-          <w:rFonts w:ascii="Courier New" w:hAnsi="Courier New"/>
-          <w:b w:val="0"/>
-          <w:i w:val="0"/>
-          <w:sz w:val="20"/>
-        </w:rPr>
-        <w:t xml:space="preserve">    packing_method, porosity_estimate, elapsed_sec, validation_ok (zero colisões),</w:t>
-      </w:r>
-    </w:p>
-    <w:p>
-      <w:pPr>
-        <w:spacing w:before="0" w:after="40"/>
-        <w:ind w:firstLine="0" w:left="709"/>
-        <w:jc w:val="left"/>
-      </w:pPr>
-      <w:r>
-        <w:rPr>
-          <w:rFonts w:ascii="Courier New" w:hAnsi="Courier New"/>
-          <w:b w:val="0"/>
-          <w:i w:val="0"/>
-          <w:sz w:val="20"/>
-        </w:rPr>
-        <w:t xml:space="preserve">    hash (SHA-256 do .bed.json), particle_centers_preview.</w:t>
-      </w:r>
-    </w:p>
-    <w:p>
-      <w:pPr>
-        <w:spacing w:before="0" w:after="120"/>
-        <w:ind w:firstLine="709"/>
-        <w:jc w:val="both"/>
-      </w:pPr>
-      <w:r>
-        <w:rPr>
-          <w:rFonts w:ascii="Calibri" w:hAnsi="Calibri"/>
-          <w:b w:val="0"/>
-          <w:i w:val="0"/>
-          <w:sz w:val="24"/>
-        </w:rPr>
-        <w:t>Esta combinação garante que qualquer STL gerado seja auditável: dado o sidecar, é possível recriar exatamente o mesmo STL com a mesma seed e o mesmo .bed.json.</w:t>
-      </w:r>
-    </w:p>
-    <w:p>
-      <w:pPr>
-        <w:pStyle w:val="Heading3"/>
-        <w:ind w:firstLine="0"/>
-      </w:pPr>
-      <w:r>
-        <w:rPr>
-          <w:rFonts w:ascii="Calibri" w:hAnsi="Calibri"/>
-          <w:b/>
-          <w:color w:val="00467F"/>
-          <w:sz w:val="24"/>
-        </w:rPr>
-        <w:t>5.12 Sistemas de Templates e de Jobs</w:t>
-      </w:r>
-    </w:p>
-    <w:p>
-      <w:pPr>
-        <w:spacing w:before="0" w:after="120"/>
-        <w:ind w:firstLine="709"/>
-        <w:jc w:val="both"/>
-      </w:pPr>
-      <w:r>
-        <w:rPr>
-          <w:rFonts w:ascii="Calibri" w:hAnsi="Calibri"/>
-          <w:b w:val="0"/>
-          <w:i w:val="0"/>
-          <w:sz w:val="24"/>
-        </w:rPr>
-        <w:t>O sistema de templates (routes_templates.py, tabela BedTemplate em SQLite) persiste configurações de leito nomeadas com CRUD completo (POST/GET/PUT/DELETE /api/templates). O diretório dsl/wizard_templates/ contém 19 fixtures, várias delas de cenários pseudo-2D e slice.</w:t>
-      </w:r>
-    </w:p>
-    <w:p>
-      <w:pPr>
-        <w:spacing w:before="0" w:after="120"/>
-        <w:ind w:firstLine="709"/>
-        <w:jc w:val="both"/>
-      </w:pPr>
-      <w:r>
-        <w:rPr>
-          <w:rFonts w:ascii="Calibri" w:hAnsi="Calibri"/>
-          <w:b w:val="0"/>
-          <w:i w:val="0"/>
-          <w:sz w:val="24"/>
-        </w:rPr>
-        <w:t>O sistema de jobs (mesh_job_runner.py) usa fila single-slot (_MESH_LOCK): apenas um job de geração executa de cada vez, evitando contention. Jobs adicionais ficam com status queued e são promovidos automaticamente. O estado é persistido na tabela JobRecord e consultado por GET /api/job/{id} em tempo constante.</w:t>
-      </w:r>
-    </w:p>
-    <w:p>
-      <w:pPr>
-        <w:pStyle w:val="Heading3"/>
-        <w:ind w:firstLine="0"/>
-      </w:pPr>
-      <w:r>
-        <w:rPr>
-          <w:rFonts w:ascii="Calibri" w:hAnsi="Calibri"/>
-          <w:b/>
-          <w:color w:val="00467F"/>
-          <w:sz w:val="24"/>
-        </w:rPr>
-        <w:t>5.13 Backend FastAPI e Pipeline OpenFOAM</w:t>
-      </w:r>
-    </w:p>
-    <w:p>
-      <w:pPr>
-        <w:spacing w:before="0" w:after="120"/>
-        <w:ind w:firstLine="709"/>
-        <w:jc w:val="both"/>
-      </w:pPr>
-      <w:r>
-        <w:rPr>
-          <w:rFonts w:ascii="Calibri" w:hAnsi="Calibri"/>
-          <w:b w:val="0"/>
-          <w:i w:val="0"/>
-          <w:sz w:val="24"/>
-        </w:rPr>
-        <w:t>O backend (backend/app/main.py) escuta na porta 3000. Routers por domínio: routes.py (compilação, geração, jobs), routes_database.py (CRUD de leitos e simulações), routes_integrated.py (fluxo compile→generate→CFD), routes_templates.py e routes_cfd.py.</w:t>
-      </w:r>
-    </w:p>
-    <w:p>
-      <w:pPr>
-        <w:spacing w:before="0" w:after="120"/>
-        <w:ind w:firstLine="709"/>
-        <w:jc w:val="both"/>
-      </w:pPr>
-      <w:r>
-        <w:rPr>
-          <w:rFonts w:ascii="Calibri" w:hAnsi="Calibri"/>
-          <w:b w:val="0"/>
-          <w:i w:val="0"/>
-          <w:sz w:val="24"/>
-        </w:rPr>
-        <w:t>O pipeline OpenFOAM (scripts/openfoam_scripts/) configura blockMeshDict, snappyHexMeshDict e condições de contorno a partir do .bed.json e do STL. A pasta tutorial/ contém três casos de referência para validação: cavity-icoFoam (benchmark de Ghia et al., 1982), channel-simpleFoam e sphere-snappyHexMesh.</w:t>
-      </w:r>
-    </w:p>
-    <w:p>
-      <w:pPr>
-        <w:pStyle w:val="Heading3"/>
-        <w:ind w:firstLine="0"/>
-      </w:pPr>
-      <w:r>
-        <w:rPr>
-          <w:rFonts w:ascii="Calibri" w:hAnsi="Calibri"/>
-          <w:b/>
-          <w:color w:val="00467F"/>
-          <w:sz w:val="24"/>
-        </w:rPr>
-        <w:t>5.14 Testes Automatizados</w:t>
-      </w:r>
-    </w:p>
-    <w:p>
-      <w:pPr>
-        <w:spacing w:before="0" w:after="120"/>
-        <w:ind w:firstLine="709"/>
-        <w:jc w:val="both"/>
-      </w:pPr>
-      <w:r>
-        <w:rPr>
-          <w:rFonts w:ascii="Calibri" w:hAnsi="Calibri"/>
-          <w:b w:val="0"/>
-          <w:i w:val="0"/>
-          <w:sz w:val="24"/>
-        </w:rPr>
-        <w:t>O pytest.ini configura testpaths = scripts/python_modeling/tests. A suíte cresceu de 6 para 27 arquivos de teste entre a primeira avaliação e a etapa atual. Distribuição por área:</w:t>
-      </w:r>
-    </w:p>
-    <w:p>
-      <w:pPr>
-        <w:spacing w:before="0" w:after="60"/>
-        <w:ind w:hanging="283" w:left="992"/>
-        <w:jc w:val="both"/>
-      </w:pPr>
-      <w:r>
-        <w:rPr>
-          <w:rFonts w:ascii="Calibri" w:hAnsi="Calibri"/>
-          <w:b w:val="0"/>
-          <w:i w:val="0"/>
-          <w:sz w:val="24"/>
-        </w:rPr>
-        <w:t>• Corte fino (thin slice)         — 29 funções (3 arquivos).</w:t>
-      </w:r>
-    </w:p>
-    <w:p>
-      <w:pPr>
-        <w:spacing w:before="0" w:after="60"/>
-        <w:ind w:hanging="283" w:left="992"/>
-        <w:jc w:val="both"/>
-      </w:pPr>
-      <w:r>
-        <w:rPr>
-          <w:rFonts w:ascii="Calibri" w:hAnsi="Calibri"/>
-          <w:b w:val="0"/>
-          <w:i w:val="0"/>
-          <w:sz w:val="24"/>
-        </w:rPr>
-        <w:t>• Modos de geometria interna      — 12 funções (test_bed_internal_modes).</w:t>
-      </w:r>
-    </w:p>
-    <w:p>
-      <w:pPr>
-        <w:spacing w:before="0" w:after="60"/>
-        <w:ind w:hanging="283" w:left="992"/>
-        <w:jc w:val="both"/>
-      </w:pPr>
-      <w:r>
-        <w:rPr>
-          <w:rFonts w:ascii="Calibri" w:hAnsi="Calibri"/>
-          <w:b w:val="0"/>
-          <w:i w:val="0"/>
-          <w:sz w:val="24"/>
-        </w:rPr>
-        <w:t>• Cálculos geométricos gerais     — 13 funções (test_geometry_modes).</w:t>
-      </w:r>
-    </w:p>
-    <w:p>
-      <w:pPr>
-        <w:spacing w:before="0" w:after="60"/>
-        <w:ind w:hanging="283" w:left="992"/>
-        <w:jc w:val="both"/>
-      </w:pPr>
-      <w:r>
-        <w:rPr>
-          <w:rFonts w:ascii="Calibri" w:hAnsi="Calibri"/>
-          <w:b w:val="0"/>
-          <w:i w:val="0"/>
-          <w:sz w:val="24"/>
-        </w:rPr>
-        <w:t>• Contratos de geometria          — 7 funções  (test_geometry_contract_*).</w:t>
-      </w:r>
-    </w:p>
-    <w:p>
-      <w:pPr>
-        <w:spacing w:before="0" w:after="60"/>
-        <w:ind w:hanging="283" w:left="992"/>
-        <w:jc w:val="both"/>
-      </w:pPr>
-      <w:r>
-        <w:rPr>
-          <w:rFonts w:ascii="Calibri" w:hAnsi="Calibri"/>
-          <w:b w:val="0"/>
-          <w:i w:val="0"/>
-          <w:sz w:val="24"/>
-        </w:rPr>
-        <w:t>• Seed e reprodutibilidade        — 3 funções  (test_packing_seed).</w:t>
-      </w:r>
-    </w:p>
-    <w:p>
-      <w:pPr>
-        <w:spacing w:before="0" w:after="60"/>
-        <w:ind w:hanging="283" w:left="992"/>
-        <w:jc w:val="both"/>
-      </w:pPr>
-      <w:r>
-        <w:rPr>
-          <w:rFonts w:ascii="Calibri" w:hAnsi="Calibri"/>
-          <w:b w:val="0"/>
-          <w:i w:val="0"/>
-          <w:sz w:val="24"/>
-        </w:rPr>
-        <w:t>• STL e fusão de malhas           — 4 funções  (test_stl_mesh_utils).</w:t>
-      </w:r>
-    </w:p>
-    <w:p>
-      <w:pPr>
-        <w:spacing w:before="0" w:after="60"/>
-        <w:ind w:hanging="283" w:left="992"/>
-        <w:jc w:val="both"/>
-      </w:pPr>
-      <w:r>
-        <w:rPr>
-          <w:rFonts w:ascii="Calibri" w:hAnsi="Calibri"/>
-          <w:b w:val="0"/>
-          <w:i w:val="0"/>
-          <w:sz w:val="24"/>
-        </w:rPr>
-        <w:t>• Solver DEM                      — 4 funções  (test_dem_solver).</w:t>
-      </w:r>
-    </w:p>
-    <w:p>
-      <w:pPr>
-        <w:spacing w:before="0" w:after="60"/>
-        <w:ind w:hanging="283" w:left="992"/>
-        <w:jc w:val="both"/>
-      </w:pPr>
-      <w:r>
-        <w:rPr>
-          <w:rFonts w:ascii="Calibri" w:hAnsi="Calibri"/>
-          <w:b w:val="0"/>
-          <w:i w:val="0"/>
-          <w:sz w:val="24"/>
-        </w:rPr>
-        <w:t>• Pipeline packed bed STL         — 7 funções  (test_packed_bed_stl).</w:t>
-      </w:r>
-    </w:p>
-    <w:p>
-      <w:pPr>
-        <w:spacing w:before="0" w:after="60"/>
-        <w:ind w:hanging="283" w:left="992"/>
-        <w:jc w:val="both"/>
-      </w:pPr>
-      <w:r>
-        <w:rPr>
-          <w:rFonts w:ascii="Calibri" w:hAnsi="Calibri"/>
-          <w:b w:val="0"/>
-          <w:i w:val="0"/>
-          <w:sz w:val="24"/>
-        </w:rPr>
-        <w:t>• Integração DSL/compilador       — 7 funções  (dsl/tests/).</w:t>
-      </w:r>
-    </w:p>
-    <w:p>
-      <w:pPr>
-        <w:spacing w:before="0" w:after="60"/>
-        <w:ind w:hanging="283" w:left="992"/>
-        <w:jc w:val="both"/>
-      </w:pPr>
-      <w:r>
-        <w:rPr>
-          <w:rFonts w:ascii="Calibri" w:hAnsi="Calibri"/>
-          <w:b w:val="0"/>
-          <w:i w:val="0"/>
-          <w:sz w:val="24"/>
-        </w:rPr>
-        <w:t>• Integração API/banco            — 9 funções  (backend/test_*.py).</w:t>
-      </w:r>
-    </w:p>
-    <w:p>
-      <w:pPr>
-        <w:pStyle w:val="Heading3"/>
-        <w:ind w:firstLine="0"/>
-      </w:pPr>
-      <w:r>
-        <w:rPr>
-          <w:rFonts w:ascii="Calibri" w:hAnsi="Calibri"/>
-          <w:b/>
-          <w:color w:val="00467F"/>
-          <w:sz w:val="24"/>
-        </w:rPr>
-        <w:t>5.15 O Projeto como Modelo de Referência Reutilizável</w:t>
-      </w:r>
-    </w:p>
-    <w:p>
-      <w:pPr>
-        <w:spacing w:before="0" w:after="120"/>
-        <w:ind w:firstLine="709"/>
-        <w:jc w:val="both"/>
-      </w:pPr>
-      <w:r>
-        <w:rPr>
-          <w:rFonts w:ascii="Calibri" w:hAnsi="Calibri"/>
-          <w:b w:val="0"/>
-          <w:i w:val="0"/>
-          <w:sz w:val="24"/>
-        </w:rPr>
-        <w:t>A arquitetura da versão consolidada favorece o reúso, com graus distintos de maturidade:</w:t>
-      </w:r>
-    </w:p>
-    <w:p>
-      <w:pPr>
-        <w:spacing w:before="0" w:after="120"/>
-        <w:ind w:firstLine="709"/>
-        <w:jc w:val="both"/>
-      </w:pPr>
-      <w:r>
-        <w:rPr>
-          <w:rFonts w:ascii="Calibri" w:hAnsi="Calibri"/>
-          <w:b w:val="0"/>
-          <w:i w:val="0"/>
-          <w:sz w:val="24"/>
-        </w:rPr>
-        <w:t>Já implementado: DSL e compilador desacoplados do motor; dois motores intercambiáveis pela mesma DSL; separação dsl/scripts/backend/frontend; documento docs/tcc2/USO_COMO_TEMPLATE.md.</w:t>
-      </w:r>
-    </w:p>
-    <w:p>
-      <w:pPr>
-        <w:spacing w:before="0" w:after="120"/>
-        <w:ind w:firstLine="709"/>
-        <w:jc w:val="both"/>
-      </w:pPr>
-      <w:r>
-        <w:rPr>
-          <w:rFonts w:ascii="Calibri" w:hAnsi="Calibri"/>
-          <w:b w:val="0"/>
-          <w:i w:val="0"/>
-          <w:sz w:val="24"/>
-        </w:rPr>
-        <w:t>Facilitado pela arquitetura (não pronto): adicionar um terceiro motor (basta consumir o .bed.json e produzir STL + sidecar no mesmo contrato); criar novos exportadores; reusar apenas a DSL/compilador.</w:t>
-      </w:r>
-    </w:p>
-    <w:p>
-      <w:pPr>
-        <w:spacing w:before="0" w:after="120"/>
-        <w:ind w:firstLine="709"/>
-        <w:jc w:val="both"/>
-      </w:pPr>
-      <w:r>
-        <w:rPr>
-          <w:rFonts w:ascii="Calibri" w:hAnsi="Calibri"/>
-          <w:b w:val="0"/>
-          <w:i w:val="0"/>
-          <w:sz w:val="24"/>
-        </w:rPr>
-        <w:t>Trabalho futuro: variantes com Maya 3D, Godot, FreeCAD ou outros motores — viabilizadas pela arquitetura, mas não implementadas.</w:t>
-      </w:r>
-    </w:p>
-    <w:p>
-      <w:pPr>
-        <w:spacing w:before="0" w:after="120"/>
-        <w:ind w:firstLine="709"/>
-        <w:jc w:val="both"/>
-      </w:pPr>
-      <w:r>
-        <w:rPr>
-          <w:rFonts w:ascii="Calibri" w:hAnsi="Calibri"/>
-          <w:b w:val="0"/>
-          <w:i w:val="0"/>
-          <w:sz w:val="24"/>
-        </w:rPr>
-        <w:t>O projeto evoluiu de uma ferramenta fechada para um modelo de referência: a especificação declarativa e o contrato de saída (STL + sidecar JSON) desacoplam a descrição do problema do motor que o resolve, de modo que a coexistência de um motor em Blender e de um motor em Python puro, ambos acionados pelo mesmo arquivo .bed, demonstra concretamente essa capacidade de substituição e consolida o princípio de extensibilidade que orienta a arquitetura do sistema.</w:t>
-      </w:r>
-    </w:p>
-    <w:p>
-      <w:pPr>
-        <w:spacing w:before="0" w:after="120"/>
-        <w:ind w:firstLine="709"/>
-        <w:jc w:val="both"/>
-      </w:pPr>
-      <w:r>
-        <w:rPr>
-          <w:rFonts w:ascii="Calibri" w:hAnsi="Calibri"/>
-          <w:b w:val="0"/>
-          <w:i w:val="0"/>
-          <w:sz w:val="24"/>
-        </w:rPr>
-        <w:t>Todos esses componentes — gramática, compilador, motores, API, interfaces e testes — formam o sistema descrito no Capítulo 4. Para torná-los concretos e verificáveis, o próximo capítulo percorre os principais fluxos de uso do BEDFLOW-ATLAS em cenários reais, da criação de um leito pelo formulário web até o corte bidimensional pelo visualizador desktop.</w:t>
-      </w:r>
-    </w:p>
-    <w:p>
-      <w:pPr>
-        <w:pStyle w:val="Heading1"/>
-        <w:ind w:firstLine="0"/>
-      </w:pPr>
-      <w:r>
-        <w:rPr>
-          <w:rFonts w:ascii="Calibri" w:hAnsi="Calibri"/>
-          <w:b/>
-          <w:color w:val="00467F"/>
-          <w:sz w:val="32"/>
-        </w:rPr>
-        <w:t>6 DEMONSTRAÇÃO</w:t>
-      </w:r>
-    </w:p>
-    <w:p>
-      <w:pPr>
-        <w:spacing w:before="0" w:after="120"/>
-        <w:ind w:firstLine="709"/>
-        <w:jc w:val="both"/>
-      </w:pPr>
-      <w:r>
-        <w:rPr>
-          <w:rFonts w:ascii="Calibri" w:hAnsi="Calibri"/>
-          <w:b w:val="0"/>
-          <w:i w:val="0"/>
-          <w:sz w:val="24"/>
-        </w:rPr>
-        <w:t>Este capítulo apresenta os fluxos de execução do BEDFLOW-ATLAS de forma prática, com espaços reservados para as capturas de tela das principais etapas. Os fluxos estão organizados em três percursos complementares: via interface web, via terminal e o ciclo de reprodutibilidade. Cada placeholder indica o print correspondente, com descrição do contexto esperado.</w:t>
-      </w:r>
-    </w:p>
-    <w:p>
-      <w:pPr>
-        <w:pStyle w:val="Heading3"/>
-        <w:ind w:firstLine="0"/>
-      </w:pPr>
-      <w:r>
-        <w:rPr>
-          <w:rFonts w:ascii="Calibri" w:hAnsi="Calibri"/>
-          <w:b/>
-          <w:color w:val="00467F"/>
-          <w:sz w:val="24"/>
-        </w:rPr>
-        <w:t>6.1 Fluxo via Interface Web</w:t>
+        <w:t>6.1.1 Criação do Leito pelo Wizard</w:t>
       </w:r>
     </w:p>
     <w:p>
@@ -9660,6 +10222,21 @@
     </w:p>
     <w:p>
       <w:pPr>
+        <w:pStyle w:val="Heading3"/>
+        <w:ind w:firstLine="0"/>
+      </w:pPr>
+      <w:r>
+        <w:rPr>
+          <w:rFonts w:ascii="Calibri" w:hAnsi="Calibri"/>
+          <w:b/>
+          <w:color w:val="00467F"/>
+          <w:sz w:val="24"/>
+        </w:rPr>
+        <w:t>6.1.2 Monitoramento e Visualização</w:t>
+      </w:r>
+    </w:p>
+    <w:p>
+      <w:pPr>
         <w:spacing w:before="0" w:after="120"/>
         <w:ind w:firstLine="709"/>
         <w:jc w:val="both"/>
@@ -9938,6 +10515,21 @@
     </w:p>
     <w:p>
       <w:pPr>
+        <w:pStyle w:val="Heading3"/>
+        <w:ind w:firstLine="0"/>
+      </w:pPr>
+      <w:r>
+        <w:rPr>
+          <w:rFonts w:ascii="Calibri" w:hAnsi="Calibri"/>
+          <w:b/>
+          <w:color w:val="00467F"/>
+          <w:sz w:val="24"/>
+        </w:rPr>
+        <w:t>6.1.3 Páginas Complementares</w:t>
+      </w:r>
+    </w:p>
+    <w:p>
+      <w:pPr>
         <w:spacing w:before="0" w:after="120"/>
         <w:ind w:firstLine="709"/>
         <w:jc w:val="both"/>
@@ -10118,6 +10710,21 @@
     </w:p>
     <w:p>
       <w:pPr>
+        <w:pStyle w:val="Heading2"/>
+        <w:ind w:firstLine="0"/>
+      </w:pPr>
+      <w:r>
+        <w:rPr>
+          <w:rFonts w:ascii="Calibri" w:hAnsi="Calibri"/>
+          <w:b/>
+          <w:color w:val="00467F"/>
+          <w:sz w:val="26"/>
+        </w:rPr>
+        <w:t>6.2 Fluxo via Terminal</w:t>
+      </w:r>
+    </w:p>
+    <w:p>
+      <w:pPr>
         <w:pStyle w:val="Heading3"/>
         <w:ind w:firstLine="0"/>
       </w:pPr>
@@ -10128,7 +10735,7 @@
           <w:color w:val="00467F"/>
           <w:sz w:val="24"/>
         </w:rPr>
-        <w:t>6.2 Fluxo via Terminal</w:t>
+        <w:t>6.2.1 Wizard Interativo e Compilação</w:t>
       </w:r>
     </w:p>
     <w:p>
@@ -10386,6 +10993,21 @@
     </w:p>
     <w:p>
       <w:pPr>
+        <w:pStyle w:val="Heading3"/>
+        <w:ind w:firstLine="0"/>
+      </w:pPr>
+      <w:r>
+        <w:rPr>
+          <w:rFonts w:ascii="Calibri" w:hAnsi="Calibri"/>
+          <w:b/>
+          <w:color w:val="00467F"/>
+          <w:sz w:val="24"/>
+        </w:rPr>
+        <w:t>6.2.2 Geração e Inspeção 3D</w:t>
+      </w:r>
+    </w:p>
+    <w:p>
+      <w:pPr>
         <w:spacing w:before="0" w:after="120"/>
         <w:ind w:firstLine="709"/>
         <w:jc w:val="both"/>
@@ -10623,6 +11245,37 @@
     </w:p>
     <w:p>
       <w:pPr>
+        <w:pStyle w:val="Heading2"/>
+        <w:ind w:firstLine="0"/>
+      </w:pPr>
+      <w:r>
+        <w:rPr>
+          <w:rFonts w:ascii="Calibri" w:hAnsi="Calibri"/>
+          <w:b/>
+          <w:color w:val="00467F"/>
+          <w:sz w:val="26"/>
+        </w:rPr>
+        <w:t>6.3 Pipeline Completo: da DSL ao Artefato Final</w:t>
+      </w:r>
+    </w:p>
+    <w:p>
+      <w:pPr>
+        <w:spacing w:before="0" w:after="120"/>
+        <w:ind w:firstLine="709"/>
+        <w:jc w:val="both"/>
+      </w:pPr>
+      <w:r>
+        <w:rPr>
+          <w:rFonts w:ascii="Calibri" w:hAnsi="Calibri"/>
+          <w:b w:val="0"/>
+          <w:i w:val="0"/>
+          <w:sz w:val="24"/>
+        </w:rPr>
+        <w:t>Esta seção acompanha o dado desde a especificação declarativa no arquivo .bed até o artefato de malha pronto para simulação, mostrando como cada etapa do pipeline contribui para a rastreabilidade do resultado.</w:t>
+      </w:r>
+    </w:p>
+    <w:p>
+      <w:pPr>
         <w:pStyle w:val="Heading3"/>
         <w:ind w:firstLine="0"/>
       </w:pPr>
@@ -10633,7 +11286,7 @@
           <w:color w:val="00467F"/>
           <w:sz w:val="24"/>
         </w:rPr>
-        <w:t>6.3 Pipeline Completo: da DSL ao Artefato Final</w:t>
+        <w:t>6.3.1 Fluxo de Transformação</w:t>
       </w:r>
     </w:p>
     <w:p>
@@ -10649,7 +11302,7 @@
           <w:i w:val="0"/>
           <w:sz w:val="24"/>
         </w:rPr>
-        <w:t>O pipeline transforma o arquivo .bed em params.json canônico com hash SHA-256, que alimenta a geração geométrica (STL + sidecar JSON). O artefato resultante é indexado pelo PostgreSQL e disponibilizado via MinIO, e então consumido pelo dashboard para visualização e download. Qualquer modificação nos parâmetros produz um novo hash, criando uma execução rastreável e comparável às anteriores. O resultado é um artefato auditável de ponta a ponta: da descrição declarativa em linguagem de domínio específica ao arquivo de malha pronto para solver externo.</w:t>
+        <w:t>O pipeline inicia com o compilador ANTLR4 lendo o arquivo .bed e produzindo um params.json canônico. Sobre esse JSON, o backend calcula o hash SHA-256 que identificará unicamente a configuração. Em seguida, o motor de geração geométrica escolhido (Blender ou Python puro) consome os parâmetros e produz dois artefatos: o arquivo STL com a geometria tridimensional e o sidecar JSON com os metadados associados (seed, hash, porosidade, modo de geração). O STL é armazenado no MinIO, o registro é persistido no PostgreSQL e o dashboard passa a disponibilizar tanto a visualização quanto o download para uso em solvers externos.</w:t>
       </w:r>
     </w:p>
     <w:p>
@@ -10664,7 +11317,53 @@
           <w:color w:val="00467F"/>
           <w:sz w:val="24"/>
         </w:rPr>
+        <w:t>6.3.2 Rastreabilidade no Pipeline</w:t>
+      </w:r>
+    </w:p>
+    <w:p>
+      <w:pPr>
+        <w:spacing w:before="0" w:after="120"/>
+        <w:ind w:firstLine="709"/>
+        <w:jc w:val="both"/>
+      </w:pPr>
+      <w:r>
+        <w:rPr>
+          <w:rFonts w:ascii="Calibri" w:hAnsi="Calibri"/>
+          <w:b w:val="0"/>
+          <w:i w:val="0"/>
+          <w:sz w:val="24"/>
+        </w:rPr>
+        <w:t>A rastreabilidade é garantida pelo encadeamento hash → artefato: qualquer alteração em qualquer parâmetro do arquivo .bed produz um params.json diferente e, consequentemente, um hash distinto, gerando uma nova entrada no histórico sem sobrescrever execuções anteriores. A política de idempotência no backend bloqueia submissões cujo hash já exista no banco, evitando duplicações. O resultado é um histórico auditável de ponta a ponta: da descrição declarativa em linguagem de domínio específica ao arquivo de malha rastreável e comparável entre execuções. Qualquer modificação nos parâmetros produz um novo hash, criando uma execução rastreável e comparável às anteriores.</w:t>
+      </w:r>
+    </w:p>
+    <w:p>
+      <w:pPr>
+        <w:pStyle w:val="Heading2"/>
+        <w:ind w:firstLine="0"/>
+      </w:pPr>
+      <w:r>
+        <w:rPr>
+          <w:rFonts w:ascii="Calibri" w:hAnsi="Calibri"/>
+          <w:b/>
+          <w:color w:val="00467F"/>
+          <w:sz w:val="26"/>
+        </w:rPr>
         <w:t>6.4 Reprodutibilidade: Seed e Hash em Ação</w:t>
+      </w:r>
+    </w:p>
+    <w:p>
+      <w:pPr>
+        <w:pStyle w:val="Heading3"/>
+        <w:ind w:firstLine="0"/>
+      </w:pPr>
+      <w:r>
+        <w:rPr>
+          <w:rFonts w:ascii="Calibri" w:hAnsi="Calibri"/>
+          <w:b/>
+          <w:color w:val="00467F"/>
+          <w:sz w:val="24"/>
+        </w:rPr>
+        <w:t>6.4.1 Determinismo de Seed</w:t>
       </w:r>
     </w:p>
     <w:p>
@@ -10767,6 +11466,37 @@
     </w:p>
     <w:p>
       <w:pPr>
+        <w:pStyle w:val="Heading3"/>
+        <w:ind w:firstLine="0"/>
+      </w:pPr>
+      <w:r>
+        <w:rPr>
+          <w:rFonts w:ascii="Calibri" w:hAnsi="Calibri"/>
+          <w:b/>
+          <w:color w:val="00467F"/>
+          <w:sz w:val="24"/>
+        </w:rPr>
+        <w:t>6.4.2 Sidecar e Exportação</w:t>
+      </w:r>
+    </w:p>
+    <w:p>
+      <w:pPr>
+        <w:spacing w:before="0" w:after="120"/>
+        <w:ind w:firstLine="709"/>
+        <w:jc w:val="both"/>
+      </w:pPr>
+      <w:r>
+        <w:rPr>
+          <w:rFonts w:ascii="Calibri" w:hAnsi="Calibri"/>
+          <w:b w:val="0"/>
+          <w:i w:val="0"/>
+          <w:sz w:val="24"/>
+        </w:rPr>
+        <w:t>Os metadados que sustentam a rastreabilidade ficam registrados no sidecar JSON de cada artefato, e o STL correspondente pode ser baixado diretamente pelo dashboard para uso em solvers externos.</w:t>
+      </w:r>
+    </w:p>
+    <w:p>
+      <w:pPr>
         <w:spacing w:before="200" w:after="200"/>
         <w:ind w:firstLine="0"/>
         <w:jc w:val="center"/>
@@ -10880,6 +11610,21 @@
     </w:p>
     <w:p>
       <w:pPr>
+        <w:pStyle w:val="Heading2"/>
+        <w:ind w:firstLine="0"/>
+      </w:pPr>
+      <w:r>
+        <w:rPr>
+          <w:rFonts w:ascii="Calibri" w:hAnsi="Calibri"/>
+          <w:b/>
+          <w:color w:val="00467F"/>
+          <w:sz w:val="26"/>
+        </w:rPr>
+        <w:t>7.1 Estratégia de Avaliação</w:t>
+      </w:r>
+    </w:p>
+    <w:p>
+      <w:pPr>
         <w:pStyle w:val="Heading3"/>
         <w:ind w:firstLine="0"/>
       </w:pPr>
@@ -10890,7 +11635,7 @@
           <w:color w:val="00467F"/>
           <w:sz w:val="24"/>
         </w:rPr>
-        <w:t>7.1 Estratégia de Avaliação</w:t>
+        <w:t>7.1.1 Dimensões de Avaliação</w:t>
       </w:r>
     </w:p>
     <w:p>
@@ -10953,309 +11698,7 @@
           <w:color w:val="00467F"/>
           <w:sz w:val="24"/>
         </w:rPr>
-        <w:t>7.2 Primeira Avaliação — Instrumentos e Resultados</w:t>
-      </w:r>
-    </w:p>
-    <w:p>
-      <w:pPr>
-        <w:spacing w:before="0" w:after="120"/>
-        <w:ind w:firstLine="709"/>
-        <w:jc w:val="both"/>
-      </w:pPr>
-      <w:r>
-        <w:rPr>
-          <w:rFonts w:ascii="Calibri" w:hAnsi="Calibri"/>
-          <w:b w:val="0"/>
-          <w:i w:val="0"/>
-          <w:sz w:val="24"/>
-        </w:rPr>
-        <w:t>A primeira avaliação utilizou: questionário estruturado, entrevista semiestruturada, observação moderada, execução de caso-tipo (conjunto G4), registro de tempos por etapa, análise de erros da DSL, taxa de sucesso do pipeline e satisfação em escala de 0 a 5.</w:t>
-      </w:r>
-    </w:p>
-    <w:p>
-      <w:pPr>
-        <w:spacing w:before="0" w:after="120"/>
-        <w:ind w:firstLine="709"/>
-        <w:jc w:val="both"/>
-      </w:pPr>
-      <w:r>
-        <w:rPr>
-          <w:rFonts w:ascii="Calibri" w:hAnsi="Calibri"/>
-          <w:b w:val="0"/>
-          <w:i w:val="0"/>
-          <w:sz w:val="24"/>
-        </w:rPr>
-        <w:t>Resultados quantitativos verificados:</w:t>
-      </w:r>
-    </w:p>
-    <w:p>
-      <w:pPr>
-        <w:spacing w:before="0" w:after="120"/>
-        <w:ind w:firstLine="709"/>
-        <w:jc w:val="both"/>
-      </w:pPr>
-      <w:r>
-        <w:rPr>
-          <w:rFonts w:ascii="Calibri" w:hAnsi="Calibri"/>
-          <w:b w:val="0"/>
-          <w:i w:val="0"/>
-          <w:sz w:val="24"/>
-        </w:rPr>
-        <w:t>Bloco 1 — DSL .bed (média: 4,5 / 5): 1.1 Clareza da sintaxe       — 5 1.2 Facilidade de edição     — 3   ← limitação identificada 1.3 Compreensão dos parâmetros — 5 1.4 Comentários/documentação — 5</w:t>
-      </w:r>
-    </w:p>
-    <w:p>
-      <w:pPr>
-        <w:spacing w:before="0" w:after="120"/>
-        <w:ind w:firstLine="709"/>
-        <w:jc w:val="both"/>
-      </w:pPr>
-      <w:r>
-        <w:rPr>
-          <w:rFonts w:ascii="Calibri" w:hAnsi="Calibri"/>
-          <w:b w:val="0"/>
-          <w:i w:val="0"/>
-          <w:sz w:val="24"/>
-        </w:rPr>
-        <w:t>Bloco 2 — Mensagens do compilador (média: 5 / 5): 2.1 Clareza das mensagens de erro — 5 2.2 Utilidade para correção       — 5 2.3 Mensagens de sucesso          — 5</w:t>
-      </w:r>
-    </w:p>
-    <w:p>
-      <w:pPr>
-        <w:spacing w:before="0" w:after="120"/>
-        <w:ind w:firstLine="709"/>
-        <w:jc w:val="both"/>
-      </w:pPr>
-      <w:r>
-        <w:rPr>
-          <w:rFonts w:ascii="Calibri" w:hAnsi="Calibri"/>
-          <w:b w:val="0"/>
-          <w:i w:val="0"/>
-          <w:sz w:val="24"/>
-        </w:rPr>
-        <w:t>Bloco 3 — Dashboard web (média: 4,8 / 5): 3.1 Facilidade de navegação        — 5 3.2 Localização por hash           — 5 3.3 Visualização 3D                — 4  ← espaço para melhora 3.4 Gráficos e curvas              — 5 3.5 Download de arquivos           — 5</w:t>
-      </w:r>
-    </w:p>
-    <w:p>
-      <w:pPr>
-        <w:spacing w:before="0" w:after="120"/>
-        <w:ind w:firstLine="709"/>
-        <w:jc w:val="both"/>
-      </w:pPr>
-      <w:r>
-        <w:rPr>
-          <w:rFonts w:ascii="Calibri" w:hAnsi="Calibri"/>
-          <w:b w:val="0"/>
-          <w:i w:val="0"/>
-          <w:sz w:val="24"/>
-        </w:rPr>
-        <w:t>Bloco 4 — Confiança e satisfação (média: 4 / 5): 4.1 Confiança nos resultados  — 4 4.2 Facilidade geral de uso   — 3  ← limitação identificada 4.3 Recomendaria o sistema    — 5</w:t>
-      </w:r>
-    </w:p>
-    <w:p>
-      <w:pPr>
-        <w:spacing w:before="0" w:after="120"/>
-        <w:ind w:firstLine="709"/>
-        <w:jc w:val="both"/>
-      </w:pPr>
-      <w:r>
-        <w:rPr>
-          <w:rFonts w:ascii="Calibri" w:hAnsi="Calibri"/>
-          <w:b w:val="0"/>
-          <w:i w:val="0"/>
-          <w:sz w:val="24"/>
-        </w:rPr>
-        <w:t>Perguntas abertas: O que mais ajudou? "Interface clara, semelhante a softwares CFD com GUI. Boa proposta para interface de geração e simulação com OpenFOAM." O que atrapalhou? "Ferramentas do solver em desenvolvimento. Não atrapalhou negativamente, mas interrompeu a análise em parte do fluxo." Sugestões: "Foco em concluir o que estava em desenvolvimento."</w:t>
-      </w:r>
-    </w:p>
-    <w:p>
-      <w:pPr>
-        <w:pStyle w:val="Heading3"/>
-        <w:ind w:firstLine="0"/>
-      </w:pPr>
-      <w:r>
-        <w:rPr>
-          <w:rFonts w:ascii="Calibri" w:hAnsi="Calibri"/>
-          <w:b/>
-          <w:color w:val="00467F"/>
-          <w:sz w:val="24"/>
-        </w:rPr>
-        <w:t>7.3 Conjunto G4 — Resultados da Primeira Avaliação</w:t>
-      </w:r>
-    </w:p>
-    <w:p>
-      <w:pPr>
-        <w:spacing w:before="0" w:after="120"/>
-        <w:ind w:firstLine="709"/>
-        <w:jc w:val="both"/>
-      </w:pPr>
-      <w:r>
-        <w:rPr>
-          <w:rFonts w:ascii="Calibri" w:hAnsi="Calibri"/>
-          <w:b w:val="0"/>
-          <w:i w:val="0"/>
-          <w:sz w:val="24"/>
-        </w:rPr>
-        <w:t>O conjunto G4 foi executado em 18/11/2025 (16:33–16:40), seis execuções. O pipeline percorreu todas as etapas até o final, com geração consistente de hashes e artefatos. Lacunas: malha e curvas Δp/L (OpenFOAM não executado integralmente).</w:t>
-      </w:r>
-    </w:p>
-    <w:p>
-      <w:pPr>
-        <w:spacing w:before="0" w:after="120"/>
-        <w:ind w:firstLine="709"/>
-        <w:jc w:val="both"/>
-      </w:pPr>
-      <w:r>
-        <w:rPr>
-          <w:rFonts w:ascii="Calibri" w:hAnsi="Calibri"/>
-          <w:b w:val="0"/>
-          <w:i w:val="0"/>
-          <w:sz w:val="24"/>
-        </w:rPr>
-        <w:t>Faixas de tempo observadas: compile: 11–13 s | geom: 18–22 s | mesh: 7–9 s | solver: 37–43 s total: 74–87 s</w:t>
-      </w:r>
-    </w:p>
-    <w:p>
-      <w:pPr>
-        <w:spacing w:before="0" w:after="120"/>
-        <w:ind w:firstLine="709"/>
-        <w:jc w:val="both"/>
-      </w:pPr>
-      <w:r>
-        <w:rPr>
-          <w:rFonts w:ascii="Calibri" w:hAnsi="Calibri"/>
-          <w:b w:val="0"/>
-          <w:i w:val="0"/>
-          <w:sz w:val="24"/>
-        </w:rPr>
-        <w:t>Critérios transversais:</w:t>
-      </w:r>
-    </w:p>
-    <w:p>
-      <w:pPr>
-        <w:spacing w:before="0" w:after="60"/>
-        <w:ind w:hanging="283" w:left="992"/>
-        <w:jc w:val="both"/>
-      </w:pPr>
-      <w:r>
-        <w:rPr>
-          <w:rFonts w:ascii="Calibri" w:hAnsi="Calibri"/>
-          <w:b w:val="0"/>
-          <w:i w:val="0"/>
-          <w:sz w:val="24"/>
-        </w:rPr>
-        <w:t>• Compilação sem erros bloqueantes: PASSA (6/6 casos).</w:t>
-      </w:r>
-    </w:p>
-    <w:p>
-      <w:pPr>
-        <w:spacing w:before="0" w:after="60"/>
-        <w:ind w:hanging="283" w:left="992"/>
-        <w:jc w:val="both"/>
-      </w:pPr>
-      <w:r>
-        <w:rPr>
-          <w:rFonts w:ascii="Calibri" w:hAnsi="Calibri"/>
-          <w:b w:val="0"/>
-          <w:i w:val="0"/>
-          <w:sz w:val="24"/>
-        </w:rPr>
-        <w:t>• Mensagens compreensíveis: PASSA (~2 avisos não bloqueantes/caso).</w:t>
-      </w:r>
-    </w:p>
-    <w:p>
-      <w:pPr>
-        <w:spacing w:before="0" w:after="60"/>
-        <w:ind w:hanging="283" w:left="992"/>
-        <w:jc w:val="both"/>
-      </w:pPr>
-      <w:r>
-        <w:rPr>
-          <w:rFonts w:ascii="Calibri" w:hAnsi="Calibri"/>
-          <w:b w:val="0"/>
-          <w:i w:val="0"/>
-          <w:sz w:val="24"/>
-        </w:rPr>
-        <w:t>• Hash distinto por execução: PASSA (6 hashes únicos).</w:t>
-      </w:r>
-    </w:p>
-    <w:p>
-      <w:pPr>
-        <w:spacing w:before="0" w:after="60"/>
-        <w:ind w:hanging="283" w:left="992"/>
-        <w:jc w:val="both"/>
-      </w:pPr>
-      <w:r>
-        <w:rPr>
-          <w:rFonts w:ascii="Calibri" w:hAnsi="Calibri"/>
-          <w:b w:val="0"/>
-          <w:i w:val="0"/>
-          <w:sz w:val="24"/>
-        </w:rPr>
-        <w:t>• Tempos por etapa visíveis: PASSA.</w:t>
-      </w:r>
-    </w:p>
-    <w:p>
-      <w:pPr>
-        <w:spacing w:before="0" w:after="60"/>
-        <w:ind w:hanging="283" w:left="992"/>
-        <w:jc w:val="both"/>
-      </w:pPr>
-      <w:r>
-        <w:rPr>
-          <w:rFonts w:ascii="Calibri" w:hAnsi="Calibri"/>
-          <w:b w:val="0"/>
-          <w:i w:val="0"/>
-          <w:sz w:val="24"/>
-        </w:rPr>
-        <w:t>• Porosidade efetiva visível: PARCIAL (extrair do log do Blender).</w:t>
-      </w:r>
-    </w:p>
-    <w:p>
-      <w:pPr>
-        <w:spacing w:before="0" w:after="60"/>
-        <w:ind w:hanging="283" w:left="992"/>
-        <w:jc w:val="both"/>
-      </w:pPr>
-      <w:r>
-        <w:rPr>
-          <w:rFonts w:ascii="Calibri" w:hAnsi="Calibri"/>
-          <w:b w:val="0"/>
-          <w:i w:val="0"/>
-          <w:sz w:val="24"/>
-        </w:rPr>
-        <w:t>• Número de células visível: NÃO ATENDE (depende do OpenFOAM completo).</w:t>
-      </w:r>
-    </w:p>
-    <w:p>
-      <w:pPr>
-        <w:spacing w:before="0" w:after="120"/>
-        <w:ind w:firstLine="709"/>
-        <w:jc w:val="both"/>
-      </w:pPr>
-      <w:r>
-        <w:rPr>
-          <w:rFonts w:ascii="Calibri" w:hAnsi="Calibri"/>
-          <w:b w:val="0"/>
-          <w:i w:val="0"/>
-          <w:sz w:val="24"/>
-        </w:rPr>
-        <w:t>Casos: G4-1 Base laminar (37fdfa72): passa parcial (malha/curvas não verificadas). G4-2 Varredura de velocidade (3 hashes): passa parcial (CSV/curva pendentes). G4-3 Exclusividade count×porosity (b26c80): passa parcial (porosidade efetiva). G4-4 RANS (f91f8e): parcial (y+, refinamento e curva não verificados).</w:t>
-      </w:r>
-    </w:p>
-    <w:p>
-      <w:pPr>
-        <w:pStyle w:val="Heading3"/>
-        <w:ind w:firstLine="0"/>
-      </w:pPr>
-      <w:r>
-        <w:rPr>
-          <w:rFonts w:ascii="Calibri" w:hAnsi="Calibri"/>
-          <w:b/>
-          <w:color w:val="00467F"/>
-          <w:sz w:val="24"/>
-        </w:rPr>
-        <w:t>7.4 Ameaças à Validade</w:t>
+        <w:t>7.1.2 Ameaças à Validade</w:t>
       </w:r>
     </w:p>
     <w:tbl>
@@ -11422,6 +11865,21 @@
     </w:p>
     <w:p>
       <w:pPr>
+        <w:pStyle w:val="Heading2"/>
+        <w:ind w:firstLine="0"/>
+      </w:pPr>
+      <w:r>
+        <w:rPr>
+          <w:rFonts w:ascii="Calibri" w:hAnsi="Calibri"/>
+          <w:b/>
+          <w:color w:val="00467F"/>
+          <w:sz w:val="26"/>
+        </w:rPr>
+        <w:t>7.2 Primeira Avaliação</w:t>
+      </w:r>
+    </w:p>
+    <w:p>
+      <w:pPr>
         <w:pStyle w:val="Heading3"/>
         <w:ind w:firstLine="0"/>
       </w:pPr>
@@ -11432,7 +11890,324 @@
           <w:color w:val="00467F"/>
           <w:sz w:val="24"/>
         </w:rPr>
-        <w:t>7.5 Segunda Demonstração — Reaplicação dos Instrumentos</w:t>
+        <w:t>7.2.1 Instrumentos e Resultados</w:t>
+      </w:r>
+    </w:p>
+    <w:p>
+      <w:pPr>
+        <w:spacing w:before="0" w:after="120"/>
+        <w:ind w:firstLine="709"/>
+        <w:jc w:val="both"/>
+      </w:pPr>
+      <w:r>
+        <w:rPr>
+          <w:rFonts w:ascii="Calibri" w:hAnsi="Calibri"/>
+          <w:b w:val="0"/>
+          <w:i w:val="0"/>
+          <w:sz w:val="24"/>
+        </w:rPr>
+        <w:t>A primeira avaliação utilizou: questionário estruturado, entrevista semiestruturada, observação moderada, execução de caso-tipo (conjunto G4), registro de tempos por etapa, análise de erros da DSL, taxa de sucesso do pipeline e satisfação em escala de 0 a 5.</w:t>
+      </w:r>
+    </w:p>
+    <w:p>
+      <w:pPr>
+        <w:spacing w:before="0" w:after="120"/>
+        <w:ind w:firstLine="709"/>
+        <w:jc w:val="both"/>
+      </w:pPr>
+      <w:r>
+        <w:rPr>
+          <w:rFonts w:ascii="Calibri" w:hAnsi="Calibri"/>
+          <w:b w:val="0"/>
+          <w:i w:val="0"/>
+          <w:sz w:val="24"/>
+        </w:rPr>
+        <w:t>Resultados quantitativos verificados:</w:t>
+      </w:r>
+    </w:p>
+    <w:p>
+      <w:pPr>
+        <w:spacing w:before="0" w:after="120"/>
+        <w:ind w:firstLine="709"/>
+        <w:jc w:val="both"/>
+      </w:pPr>
+      <w:r>
+        <w:rPr>
+          <w:rFonts w:ascii="Calibri" w:hAnsi="Calibri"/>
+          <w:b w:val="0"/>
+          <w:i w:val="0"/>
+          <w:sz w:val="24"/>
+        </w:rPr>
+        <w:t>Bloco 1 — DSL .bed (média: 4,5 / 5): 1.1 Clareza da sintaxe       — 5 1.2 Facilidade de edição     — 3   ← limitação identificada 1.3 Compreensão dos parâmetros — 5 1.4 Comentários/documentação — 5</w:t>
+      </w:r>
+    </w:p>
+    <w:p>
+      <w:pPr>
+        <w:spacing w:before="0" w:after="120"/>
+        <w:ind w:firstLine="709"/>
+        <w:jc w:val="both"/>
+      </w:pPr>
+      <w:r>
+        <w:rPr>
+          <w:rFonts w:ascii="Calibri" w:hAnsi="Calibri"/>
+          <w:b w:val="0"/>
+          <w:i w:val="0"/>
+          <w:sz w:val="24"/>
+        </w:rPr>
+        <w:t>Bloco 2 — Mensagens do compilador (média: 5 / 5): 2.1 Clareza das mensagens de erro — 5 2.2 Utilidade para correção       — 5 2.3 Mensagens de sucesso          — 5</w:t>
+      </w:r>
+    </w:p>
+    <w:p>
+      <w:pPr>
+        <w:spacing w:before="0" w:after="120"/>
+        <w:ind w:firstLine="709"/>
+        <w:jc w:val="both"/>
+      </w:pPr>
+      <w:r>
+        <w:rPr>
+          <w:rFonts w:ascii="Calibri" w:hAnsi="Calibri"/>
+          <w:b w:val="0"/>
+          <w:i w:val="0"/>
+          <w:sz w:val="24"/>
+        </w:rPr>
+        <w:t>Bloco 3 — Dashboard web (média: 4,8 / 5): 3.1 Facilidade de navegação        — 5 3.2 Localização por hash           — 5 3.3 Visualização 3D                — 4  ← espaço para melhora 3.4 Gráficos e curvas              — 5 3.5 Download de arquivos           — 5</w:t>
+      </w:r>
+    </w:p>
+    <w:p>
+      <w:pPr>
+        <w:spacing w:before="0" w:after="120"/>
+        <w:ind w:firstLine="709"/>
+        <w:jc w:val="both"/>
+      </w:pPr>
+      <w:r>
+        <w:rPr>
+          <w:rFonts w:ascii="Calibri" w:hAnsi="Calibri"/>
+          <w:b w:val="0"/>
+          <w:i w:val="0"/>
+          <w:sz w:val="24"/>
+        </w:rPr>
+        <w:t>Bloco 4 — Confiança e satisfação (média: 4 / 5): 4.1 Confiança nos resultados  — 4 4.2 Facilidade geral de uso   — 3  ← limitação identificada 4.3 Recomendaria o sistema    — 5</w:t>
+      </w:r>
+    </w:p>
+    <w:p>
+      <w:pPr>
+        <w:spacing w:before="0" w:after="120"/>
+        <w:ind w:firstLine="709"/>
+        <w:jc w:val="both"/>
+      </w:pPr>
+      <w:r>
+        <w:rPr>
+          <w:rFonts w:ascii="Calibri" w:hAnsi="Calibri"/>
+          <w:b w:val="0"/>
+          <w:i w:val="0"/>
+          <w:sz w:val="24"/>
+        </w:rPr>
+        <w:t>Perguntas abertas: O que mais ajudou? "Interface clara, semelhante a softwares CFD com GUI. Boa proposta para interface de geração e simulação com OpenFOAM." O que atrapalhou? "Ferramentas do solver em desenvolvimento. Não atrapalhou negativamente, mas interrompeu a análise em parte do fluxo." Sugestões: "Foco em concluir o que estava em desenvolvimento."</w:t>
+      </w:r>
+    </w:p>
+    <w:p>
+      <w:pPr>
+        <w:pStyle w:val="Heading3"/>
+        <w:ind w:firstLine="0"/>
+      </w:pPr>
+      <w:r>
+        <w:rPr>
+          <w:rFonts w:ascii="Calibri" w:hAnsi="Calibri"/>
+          <w:b/>
+          <w:color w:val="00467F"/>
+          <w:sz w:val="24"/>
+        </w:rPr>
+        <w:t>7.2.2 Conjunto G4 — Resultados</w:t>
+      </w:r>
+    </w:p>
+    <w:p>
+      <w:pPr>
+        <w:spacing w:before="0" w:after="120"/>
+        <w:ind w:firstLine="709"/>
+        <w:jc w:val="both"/>
+      </w:pPr>
+      <w:r>
+        <w:rPr>
+          <w:rFonts w:ascii="Calibri" w:hAnsi="Calibri"/>
+          <w:b w:val="0"/>
+          <w:i w:val="0"/>
+          <w:sz w:val="24"/>
+        </w:rPr>
+        <w:t>O conjunto G4 foi executado em 18/11/2025 (16:33–16:40), seis execuções. O pipeline percorreu todas as etapas até o final, com geração consistente de hashes e artefatos. Lacunas: malha e curvas Δp/L (OpenFOAM não executado integralmente).</w:t>
+      </w:r>
+    </w:p>
+    <w:p>
+      <w:pPr>
+        <w:spacing w:before="0" w:after="120"/>
+        <w:ind w:firstLine="709"/>
+        <w:jc w:val="both"/>
+      </w:pPr>
+      <w:r>
+        <w:rPr>
+          <w:rFonts w:ascii="Calibri" w:hAnsi="Calibri"/>
+          <w:b w:val="0"/>
+          <w:i w:val="0"/>
+          <w:sz w:val="24"/>
+        </w:rPr>
+        <w:t>Faixas de tempo observadas: compile: 11–13 s | geom: 18–22 s | mesh: 7–9 s | solver: 37–43 s total: 74–87 s</w:t>
+      </w:r>
+    </w:p>
+    <w:p>
+      <w:pPr>
+        <w:spacing w:before="0" w:after="120"/>
+        <w:ind w:firstLine="709"/>
+        <w:jc w:val="both"/>
+      </w:pPr>
+      <w:r>
+        <w:rPr>
+          <w:rFonts w:ascii="Calibri" w:hAnsi="Calibri"/>
+          <w:b w:val="0"/>
+          <w:i w:val="0"/>
+          <w:sz w:val="24"/>
+        </w:rPr>
+        <w:t>Critérios transversais:</w:t>
+      </w:r>
+    </w:p>
+    <w:p>
+      <w:pPr>
+        <w:spacing w:before="0" w:after="60"/>
+        <w:ind w:hanging="283" w:left="992"/>
+        <w:jc w:val="both"/>
+      </w:pPr>
+      <w:r>
+        <w:rPr>
+          <w:rFonts w:ascii="Calibri" w:hAnsi="Calibri"/>
+          <w:b w:val="0"/>
+          <w:i w:val="0"/>
+          <w:sz w:val="24"/>
+        </w:rPr>
+        <w:t>• Compilação sem erros bloqueantes: PASSA (6/6 casos).</w:t>
+      </w:r>
+    </w:p>
+    <w:p>
+      <w:pPr>
+        <w:spacing w:before="0" w:after="60"/>
+        <w:ind w:hanging="283" w:left="992"/>
+        <w:jc w:val="both"/>
+      </w:pPr>
+      <w:r>
+        <w:rPr>
+          <w:rFonts w:ascii="Calibri" w:hAnsi="Calibri"/>
+          <w:b w:val="0"/>
+          <w:i w:val="0"/>
+          <w:sz w:val="24"/>
+        </w:rPr>
+        <w:t>• Mensagens compreensíveis: PASSA (~2 avisos não bloqueantes/caso).</w:t>
+      </w:r>
+    </w:p>
+    <w:p>
+      <w:pPr>
+        <w:spacing w:before="0" w:after="60"/>
+        <w:ind w:hanging="283" w:left="992"/>
+        <w:jc w:val="both"/>
+      </w:pPr>
+      <w:r>
+        <w:rPr>
+          <w:rFonts w:ascii="Calibri" w:hAnsi="Calibri"/>
+          <w:b w:val="0"/>
+          <w:i w:val="0"/>
+          <w:sz w:val="24"/>
+        </w:rPr>
+        <w:t>• Hash distinto por execução: PASSA (6 hashes únicos).</w:t>
+      </w:r>
+    </w:p>
+    <w:p>
+      <w:pPr>
+        <w:spacing w:before="0" w:after="60"/>
+        <w:ind w:hanging="283" w:left="992"/>
+        <w:jc w:val="both"/>
+      </w:pPr>
+      <w:r>
+        <w:rPr>
+          <w:rFonts w:ascii="Calibri" w:hAnsi="Calibri"/>
+          <w:b w:val="0"/>
+          <w:i w:val="0"/>
+          <w:sz w:val="24"/>
+        </w:rPr>
+        <w:t>• Tempos por etapa visíveis: PASSA.</w:t>
+      </w:r>
+    </w:p>
+    <w:p>
+      <w:pPr>
+        <w:spacing w:before="0" w:after="60"/>
+        <w:ind w:hanging="283" w:left="992"/>
+        <w:jc w:val="both"/>
+      </w:pPr>
+      <w:r>
+        <w:rPr>
+          <w:rFonts w:ascii="Calibri" w:hAnsi="Calibri"/>
+          <w:b w:val="0"/>
+          <w:i w:val="0"/>
+          <w:sz w:val="24"/>
+        </w:rPr>
+        <w:t>• Porosidade efetiva visível: PARCIAL (extrair do log do Blender).</w:t>
+      </w:r>
+    </w:p>
+    <w:p>
+      <w:pPr>
+        <w:spacing w:before="0" w:after="60"/>
+        <w:ind w:hanging="283" w:left="992"/>
+        <w:jc w:val="both"/>
+      </w:pPr>
+      <w:r>
+        <w:rPr>
+          <w:rFonts w:ascii="Calibri" w:hAnsi="Calibri"/>
+          <w:b w:val="0"/>
+          <w:i w:val="0"/>
+          <w:sz w:val="24"/>
+        </w:rPr>
+        <w:t>• Número de células visível: NÃO ATENDE (depende do OpenFOAM completo).</w:t>
+      </w:r>
+    </w:p>
+    <w:p>
+      <w:pPr>
+        <w:spacing w:before="0" w:after="120"/>
+        <w:ind w:firstLine="709"/>
+        <w:jc w:val="both"/>
+      </w:pPr>
+      <w:r>
+        <w:rPr>
+          <w:rFonts w:ascii="Calibri" w:hAnsi="Calibri"/>
+          <w:b w:val="0"/>
+          <w:i w:val="0"/>
+          <w:sz w:val="24"/>
+        </w:rPr>
+        <w:t>Casos: G4-1 Base laminar (37fdfa72): passa parcial (malha/curvas não verificadas). G4-2 Varredura de velocidade (3 hashes): passa parcial (CSV/curva pendentes). G4-3 Exclusividade count×porosity (b26c80): passa parcial (porosidade efetiva). G4-4 RANS (f91f8e): parcial (y+, refinamento e curva não verificados).</w:t>
+      </w:r>
+    </w:p>
+    <w:p>
+      <w:pPr>
+        <w:pStyle w:val="Heading2"/>
+        <w:ind w:firstLine="0"/>
+      </w:pPr>
+      <w:r>
+        <w:rPr>
+          <w:rFonts w:ascii="Calibri" w:hAnsi="Calibri"/>
+          <w:b/>
+          <w:color w:val="00467F"/>
+          <w:sz w:val="26"/>
+        </w:rPr>
+        <w:t>7.3 Segunda Demonstração</w:t>
+      </w:r>
+    </w:p>
+    <w:p>
+      <w:pPr>
+        <w:pStyle w:val="Heading3"/>
+        <w:ind w:firstLine="0"/>
+      </w:pPr>
+      <w:r>
+        <w:rPr>
+          <w:rFonts w:ascii="Calibri" w:hAnsi="Calibri"/>
+          <w:b/>
+          <w:color w:val="00467F"/>
+          <w:sz w:val="24"/>
+        </w:rPr>
+        <w:t>7.3.1 Reaplicação dos Instrumentos</w:t>
       </w:r>
     </w:p>
     <w:p>
@@ -11828,7 +12603,7 @@
           <w:color w:val="00467F"/>
           <w:sz w:val="24"/>
         </w:rPr>
-        <w:t>7.6 Verificação das Dimensões Técnicas (Segunda Demonstração)</w:t>
+        <w:t>7.3.2 Verificação das Dimensões Técnicas</w:t>
       </w:r>
     </w:p>
     <w:tbl>
@@ -11995,6 +12770,21 @@
     </w:p>
     <w:p>
       <w:pPr>
+        <w:pStyle w:val="Heading2"/>
+        <w:ind w:firstLine="0"/>
+      </w:pPr>
+      <w:r>
+        <w:rPr>
+          <w:rFonts w:ascii="Calibri" w:hAnsi="Calibri"/>
+          <w:b/>
+          <w:color w:val="00467F"/>
+          <w:sz w:val="26"/>
+        </w:rPr>
+        <w:t>7.4 Evidências de Atendimento e Comparação</w:t>
+      </w:r>
+    </w:p>
+    <w:p>
+      <w:pPr>
         <w:pStyle w:val="Heading3"/>
         <w:ind w:firstLine="0"/>
       </w:pPr>
@@ -12005,7 +12795,7 @@
           <w:color w:val="00467F"/>
           <w:sz w:val="24"/>
         </w:rPr>
-        <w:t>7.7 Testes Automatizados — Evidências de Objetivos</w:t>
+        <w:t>7.4.1 Testes Automatizados e Critérios de Aceitação</w:t>
       </w:r>
     </w:p>
     <w:p>
@@ -12314,6 +13104,22 @@
     </w:p>
     <w:p>
       <w:pPr>
+        <w:spacing w:before="0" w:after="120"/>
+        <w:ind w:firstLine="709"/>
+        <w:jc w:val="both"/>
+      </w:pPr>
+      <w:r>
+        <w:rPr>
+          <w:rFonts w:ascii="Calibri" w:hAnsi="Calibri"/>
+          <w:b w:val="0"/>
+          <w:i w:val="0"/>
+          <w:sz w:val="24"/>
+        </w:rPr>
+        <w:t>Quanto aos critérios de aceitação, vale o resumo consolidado na Tabela 3 do Capítulo 4: 15 dos 16 critérios são atendidos na etapa atual, restando pendente apenas o CA16 (malha e curvas Δp/L do solver OpenFOAM).</w:t>
+      </w:r>
+    </w:p>
+    <w:p>
+      <w:pPr>
         <w:pStyle w:val="Heading3"/>
         <w:ind w:firstLine="0"/>
       </w:pPr>
@@ -12324,54 +13130,7 @@
           <w:color w:val="00467F"/>
           <w:sz w:val="24"/>
         </w:rPr>
-        <w:t>7.8 Critérios de Aceitação — Evidências</w:t>
-      </w:r>
-    </w:p>
-    <w:p>
-      <w:pPr>
-        <w:spacing w:before="0" w:after="120"/>
-        <w:ind w:firstLine="709"/>
-        <w:jc w:val="both"/>
-      </w:pPr>
-      <w:r>
-        <w:rPr>
-          <w:rFonts w:ascii="Calibri" w:hAnsi="Calibri"/>
-          <w:b w:val="0"/>
-          <w:i w:val="0"/>
-          <w:sz w:val="24"/>
-        </w:rPr>
-        <w:t>(Ver Tabela 3, Capítulo 4. Resumo: 15 de 16 critérios atendem na etapa atual.</w:t>
-      </w:r>
-    </w:p>
-    <w:p>
-      <w:pPr>
-        <w:spacing w:before="0" w:after="60"/>
-        <w:ind w:hanging="283" w:left="992"/>
-        <w:jc w:val="both"/>
-      </w:pPr>
-      <w:r>
-        <w:rPr>
-          <w:rFonts w:ascii="Calibri" w:hAnsi="Calibri"/>
-          <w:b w:val="0"/>
-          <w:i w:val="0"/>
-          <w:sz w:val="24"/>
-        </w:rPr>
-        <w:t>CA16 (malha/curvas Δp/L OpenFOAM) permanece pendente.)</w:t>
-      </w:r>
-    </w:p>
-    <w:p>
-      <w:pPr>
-        <w:pStyle w:val="Heading3"/>
-        <w:ind w:firstLine="0"/>
-      </w:pPr>
-      <w:r>
-        <w:rPr>
-          <w:rFonts w:ascii="Calibri" w:hAnsi="Calibri"/>
-          <w:b/>
-          <w:color w:val="00467F"/>
-          <w:sz w:val="24"/>
-        </w:rPr>
-        <w:t>7.9 Evidências no GitHub</w:t>
+        <w:t>7.4.2 Evidências no GitHub</w:t>
       </w:r>
     </w:p>
     <w:tbl>
@@ -12522,7 +13281,7 @@
           <w:color w:val="00467F"/>
           <w:sz w:val="24"/>
         </w:rPr>
-        <w:t>7.10 Evolução da Demonstração — Comparação Crítica entre Etapas</w:t>
+        <w:t>7.4.3 Comparação Crítica entre Etapas</w:t>
       </w:r>
     </w:p>
     <w:p>
@@ -12832,6 +13591,21 @@
     </w:p>
     <w:p>
       <w:pPr>
+        <w:pStyle w:val="Heading2"/>
+        <w:ind w:firstLine="0"/>
+      </w:pPr>
+      <w:r>
+        <w:rPr>
+          <w:rFonts w:ascii="Calibri" w:hAnsi="Calibri"/>
+          <w:b/>
+          <w:color w:val="00467F"/>
+          <w:sz w:val="26"/>
+        </w:rPr>
+        <w:t>8.1 Síntese e Objetivos</w:t>
+      </w:r>
+    </w:p>
+    <w:p>
+      <w:pPr>
         <w:pStyle w:val="Heading3"/>
         <w:ind w:firstLine="0"/>
       </w:pPr>
@@ -12842,7 +13616,7 @@
           <w:color w:val="00467F"/>
           <w:sz w:val="24"/>
         </w:rPr>
-        <w:t>8.1 Síntese do Problema e da Solução</w:t>
+        <w:t>8.1.1 Síntese do Problema e da Solução</w:t>
       </w:r>
     </w:p>
     <w:p>
@@ -12905,7 +13679,7 @@
           <w:color w:val="00467F"/>
           <w:sz w:val="24"/>
         </w:rPr>
-        <w:t>8.2 Análise dos Objetivos Específicos</w:t>
+        <w:t>8.1.2 Análise dos Objetivos Específicos</w:t>
       </w:r>
     </w:p>
     <w:p>
@@ -13130,6 +13904,21 @@
     </w:p>
     <w:p>
       <w:pPr>
+        <w:pStyle w:val="Heading2"/>
+        <w:ind w:firstLine="0"/>
+      </w:pPr>
+      <w:r>
+        <w:rPr>
+          <w:rFonts w:ascii="Calibri" w:hAnsi="Calibri"/>
+          <w:b/>
+          <w:color w:val="00467F"/>
+          <w:sz w:val="26"/>
+        </w:rPr>
+        <w:t>8.2 Contribuições e Limitações</w:t>
+      </w:r>
+    </w:p>
+    <w:p>
+      <w:pPr>
         <w:pStyle w:val="Heading3"/>
         <w:ind w:firstLine="0"/>
       </w:pPr>
@@ -13140,7 +13929,7 @@
           <w:color w:val="00467F"/>
           <w:sz w:val="24"/>
         </w:rPr>
-        <w:t>8.3 Contribuições</w:t>
+        <w:t>8.2.1 Contribuições</w:t>
       </w:r>
     </w:p>
     <w:p>
@@ -13235,7 +14024,7 @@
           <w:color w:val="00467F"/>
           <w:sz w:val="24"/>
         </w:rPr>
-        <w:t>8.4 Limitações</w:t>
+        <w:t>8.2.2 Limitações</w:t>
       </w:r>
     </w:p>
     <w:p>
@@ -13472,6 +14261,21 @@
     </w:p>
     <w:p>
       <w:pPr>
+        <w:pStyle w:val="Heading2"/>
+        <w:ind w:firstLine="0"/>
+      </w:pPr>
+      <w:r>
+        <w:rPr>
+          <w:rFonts w:ascii="Calibri" w:hAnsi="Calibri"/>
+          <w:b/>
+          <w:color w:val="00467F"/>
+          <w:sz w:val="26"/>
+        </w:rPr>
+        <w:t>8.3 Perspectivas e Considerações Finais</w:t>
+      </w:r>
+    </w:p>
+    <w:p>
+      <w:pPr>
         <w:pStyle w:val="Heading3"/>
         <w:ind w:firstLine="0"/>
       </w:pPr>
@@ -13482,7 +14286,7 @@
           <w:color w:val="00467F"/>
           <w:sz w:val="24"/>
         </w:rPr>
-        <w:t>8.5 Trabalhos Futuros</w:t>
+        <w:t>8.3.1 Trabalhos Futuros</w:t>
       </w:r>
     </w:p>
     <w:p>
@@ -13657,7 +14461,7 @@
           <w:color w:val="00467F"/>
           <w:sz w:val="24"/>
         </w:rPr>
-        <w:t>8.6 Consideração Final</w:t>
+        <w:t>8.3.2 Consideração Final</w:t>
       </w:r>
     </w:p>
     <w:p>

</xml_diff>